<commit_message>
Fix: replace pandoc {width=96px} image attr with HTML <img> tag
The pandoc image-attribute syntax `![Herald](path){width=96px height=96px}`
renders correctly under pandoc's gfm reader for HTML/PDF/DOCX export
but renders as ugly raw text on GitHub's Markdown renderer — visible
on the README's landing page until now.

Fix: swap to raw HTML <img src="..." alt="Herald" width="96" height="96"/>
which:
- Renders correctly on GitHub
- Passes through pandoc to HTML/PDF/DOCX unchanged
- Preserves the centered <div align="center"> wrapper

Files touched: 48 .md files + 123 regenerated siblings + 1 script update.
scripts/branding_inject_logo.py updated so future logo injections
emit the HTML form (idempotent on re-runs); added LEGACY_PANDOC_ATTR_RE
to upgrade any stragglers automatically.

Inheritance gate stays 15/15 (sanity check).
No remaining {width=96px occurrences in any tracked .md outside the
script's legacy-detector regex.

Co-Authored-By: Claude Opus 4.7 <noreply@anthropic.com>
</commit_message>
<xml_diff>
--- a/AGENTS.docx
+++ b/AGENTS.docx
@@ -10,57 +10,7 @@
         <w:t xml:space="preserve">Herald</w:t>
       </w:r>
     </w:p>
-    <w:p>
-      <w:pPr>
-        <w:pStyle w:val="FirstParagraph"/>
-      </w:pPr>
-      <w:r>
-        <w:drawing>
-          <wp:inline>
-            <wp:extent cx="1625600" cy="1625600"/>
-            <wp:effectExtent b="0" l="0" r="0" t="0"/>
-            <wp:docPr descr="Herald" title="" id="10" name="Picture"/>
-            <a:graphic>
-              <a:graphicData uri="http://schemas.openxmlformats.org/drawingml/2006/picture">
-                <pic:pic>
-                  <pic:nvPicPr>
-                    <pic:cNvPr descr="assets/logo/herald_logo_square_128.png" id="11" name="Picture"/>
-                    <pic:cNvPicPr>
-                      <a:picLocks noChangeArrowheads="1" noChangeAspect="1"/>
-                    </pic:cNvPicPr>
-                  </pic:nvPicPr>
-                  <pic:blipFill>
-                    <a:blip r:embed="rId9"/>
-                    <a:stretch>
-                      <a:fillRect/>
-                    </a:stretch>
-                  </pic:blipFill>
-                  <pic:spPr bwMode="auto">
-                    <a:xfrm>
-                      <a:off x="0" y="0"/>
-                      <a:ext cx="1625600" cy="1625600"/>
-                    </a:xfrm>
-                    <a:prstGeom prst="rect">
-                      <a:avLst/>
-                    </a:prstGeom>
-                    <a:noFill/>
-                    <a:ln w="9525">
-                      <a:noFill/>
-                      <a:headEnd/>
-                      <a:tailEnd/>
-                    </a:ln>
-                  </pic:spPr>
-                </pic:pic>
-              </a:graphicData>
-            </a:graphic>
-          </wp:inline>
-        </w:drawing>
-      </w:r>
-      <w:r>
-        <w:t xml:space="preserve">{width=96px height=96px}</w:t>
-      </w:r>
-    </w:p>
-    <w:bookmarkStart w:id="22" w:name="herald--agentsmd"/>
+    <w:bookmarkStart w:id="19" w:name="herald--agentsmd"/>
     <w:p>
       <w:pPr>
         <w:pStyle w:val="Heading1"/>
@@ -347,7 +297,7 @@
         </w:tc>
       </w:tr>
     </w:tbl>
-    <w:bookmarkStart w:id="13" w:name="table-of-contents"/>
+    <w:bookmarkStart w:id="10" w:name="table-of-contents"/>
     <w:p>
       <w:pPr>
         <w:pStyle w:val="Heading2"/>
@@ -719,7 +669,7 @@
       <w:r>
         <w:t xml:space="preserve"> </w:t>
       </w:r>
-      <w:hyperlink r:id="rId12">
+      <w:hyperlink r:id="rId9">
         <w:r>
           <w:rPr>
             <w:rStyle w:val="Hyperlink"/>
@@ -728,8 +678,8 @@
         </w:r>
       </w:hyperlink>
     </w:p>
-    <w:bookmarkEnd w:id="13"/>
-    <w:bookmarkStart w:id="14" w:name="X3414c43cc6d331314c20bd0a345b7e6e453dede"/>
+    <w:bookmarkEnd w:id="10"/>
+    <w:bookmarkStart w:id="11" w:name="X3414c43cc6d331314c20bd0a345b7e6e453dede"/>
     <w:p>
       <w:pPr>
         <w:pStyle w:val="Heading2"/>
@@ -1008,8 +958,8 @@
         <w:t xml:space="preserve">Every commit fans out to all 4 hosts (GitHub + GitLab + GitFlic + GitVerse). Constitution §2.1.</w:t>
       </w:r>
     </w:p>
-    <w:bookmarkEnd w:id="14"/>
-    <w:bookmarkStart w:id="21" w:name="herald-specific-agent-rules"/>
+    <w:bookmarkEnd w:id="11"/>
+    <w:bookmarkStart w:id="18" w:name="herald-specific-agent-rules"/>
     <w:p>
       <w:pPr>
         <w:pStyle w:val="Heading2"/>
@@ -1018,7 +968,7 @@
         <w:t xml:space="preserve">Herald-specific agent rules</w:t>
       </w:r>
     </w:p>
-    <w:bookmarkStart w:id="15" w:name="X077989ae97727b76393218e4e18e3b89e5291bc"/>
+    <w:bookmarkStart w:id="12" w:name="X077989ae97727b76393218e4e18e3b89e5291bc"/>
     <w:p>
       <w:pPr>
         <w:pStyle w:val="Heading3"/>
@@ -1682,8 +1632,8 @@
         <w:t xml:space="preserve">carries the handoff prompt.</w:t>
       </w:r>
     </w:p>
-    <w:bookmarkEnd w:id="15"/>
-    <w:bookmarkStart w:id="16" w:name="X113e14c17c8dcbc428318fbd14b02ebb01d29ca"/>
+    <w:bookmarkEnd w:id="12"/>
+    <w:bookmarkStart w:id="13" w:name="X113e14c17c8dcbc428318fbd14b02ebb01d29ca"/>
     <w:p>
       <w:pPr>
         <w:pStyle w:val="Heading3"/>
@@ -1970,8 +1920,8 @@
         <w:t xml:space="preserve">Tests AND Challenges are bound equally: a Challenge that scores PASS on a broken-for-end-user feature is the same defect class as a unit test that does. Both are release blockers.</w:t>
       </w:r>
     </w:p>
-    <w:bookmarkEnd w:id="16"/>
-    <w:bookmarkStart w:id="17" w:name="X494e63fc2991a9d42fefb419b530ac9bef94c53"/>
+    <w:bookmarkEnd w:id="13"/>
+    <w:bookmarkStart w:id="14" w:name="X494e63fc2991a9d42fefb419b530ac9bef94c53"/>
     <w:p>
       <w:pPr>
         <w:pStyle w:val="Heading3"/>
@@ -2044,8 +1994,8 @@
         <w:t xml:space="preserve">Both MUST return 0. If either fails, fix at root cause per Constitution §11.4.4 — never silently accept the FAIL.</w:t>
       </w:r>
     </w:p>
-    <w:bookmarkEnd w:id="17"/>
-    <w:bookmarkStart w:id="18" w:name="X32120c2cbf4d615e5864fa1300f097d3beccf79"/>
+    <w:bookmarkEnd w:id="14"/>
+    <w:bookmarkStart w:id="15" w:name="X32120c2cbf4d615e5864fa1300f097d3beccf79"/>
     <w:p>
       <w:pPr>
         <w:pStyle w:val="Heading3"/>
@@ -2186,8 +2136,8 @@
         <w:t xml:space="preserve">) is present in all three files; a missing copy is a §1.1 propagation bluff and the gate FAILs.</w:t>
       </w:r>
     </w:p>
-    <w:bookmarkEnd w:id="18"/>
-    <w:bookmarkStart w:id="19" w:name="X6198677d4a246aad02e8f663e73cd694bf6928c"/>
+    <w:bookmarkEnd w:id="15"/>
+    <w:bookmarkStart w:id="16" w:name="X6198677d4a246aad02e8f663e73cd694bf6928c"/>
     <w:p>
       <w:pPr>
         <w:pStyle w:val="Heading3"/>
@@ -2258,8 +2208,8 @@
         <w:t xml:space="preserve">propagates to all four hosts. Per-host naming intentionally matches each provider's brand capitalization; do not normalize.</w:t>
       </w:r>
     </w:p>
-    <w:bookmarkEnd w:id="19"/>
-    <w:bookmarkStart w:id="20" w:name="forbidden-in-this-project"/>
+    <w:bookmarkEnd w:id="16"/>
+    <w:bookmarkStart w:id="17" w:name="forbidden-in-this-project"/>
     <w:p>
       <w:pPr>
         <w:pStyle w:val="Heading3"/>
@@ -2412,9 +2362,9 @@
         <w:t xml:space="preserve">afterward.</w:t>
       </w:r>
     </w:p>
-    <w:bookmarkEnd w:id="20"/>
-    <w:bookmarkEnd w:id="21"/>
-    <w:bookmarkEnd w:id="22"/>
+    <w:bookmarkEnd w:id="17"/>
+    <w:bookmarkEnd w:id="18"/>
+    <w:bookmarkEnd w:id="19"/>
     <w:sectPr>
       <w:footnotePr>
         <w:numRestart w:val="eachSect"/>

</xml_diff>

<commit_message>
docs: propagate HelixConstitution §11.4.85 + §11.4.87 + §11.4.88 into Herald root governance
§11.4.85 stress+chaos test mandate, §11.4.87 endless-loop autonomous
work + anti-bluff testing, §11.4.88 background-push mandate — restated
+ cited in CLAUDE.md / AGENTS.md / QWEN.md / HERALD_CONSTITUTION.md per
the §11.4.87 CM-COVENANT-114-87-PROPAGATION pre-build gate. Inherited
per §11.4.35; Herald restates + cites, does not redefine.

PDF/HTML/DOCX siblings regenerated.

Co-Authored-By: Claude Opus 4.7 <noreply@anthropic.com>
</commit_message>
<xml_diff>
--- a/AGENTS.docx
+++ b/AGENTS.docx
@@ -10,7 +10,7 @@
         <w:t xml:space="preserve">Herald</w:t>
       </w:r>
     </w:p>
-    <w:bookmarkStart w:id="19" w:name="herald--agentsmd"/>
+    <w:bookmarkStart w:id="22" w:name="herald--agentsmd"/>
     <w:p>
       <w:pPr>
         <w:pStyle w:val="Heading1"/>
@@ -75,7 +75,7 @@
               <w:pStyle w:val="Compact"/>
             </w:pPr>
             <w:r>
-              <w:t xml:space="preserve">6</w:t>
+              <w:t xml:space="preserve">7</w:t>
             </w:r>
           </w:p>
         </w:tc>
@@ -123,7 +123,7 @@
               <w:pStyle w:val="Compact"/>
             </w:pPr>
             <w:r>
-              <w:t xml:space="preserve">2026-05-20</w:t>
+              <w:t xml:space="preserve">2026-05-27</w:t>
             </w:r>
           </w:p>
         </w:tc>
@@ -171,7 +171,37 @@
               <w:pStyle w:val="Compact"/>
             </w:pPr>
             <w:r>
-              <w:t xml:space="preserve">r5: added the End-user-usability covenant section restating the verbatim operator mandate at Herald agent-rule level; binds every CLI agent (Claude Code, Codex, Cursor, Gemini, Aider, subagents) to the §11.4 anti-bluff enforcement; ties to HERALD_CONSTITUTION.md §107 + inheritance-gate invariant I8b.</w:t>
+              <w:t xml:space="preserve">r7: propagated HelixConstitution §11.4.85 (stress + chaos test mandate) + §11.4.87 (endless-loop autonomous work + zero-idle agent dispatch + anti-bluff testing) + §11.4.88 (background-push) into the agent-rule covenant cluster as short-form restatements citing the literal section numbers, inherited per §11.4.35; required by the §11.4.87</w:t>
+            </w:r>
+            <w:r>
+              <w:t xml:space="preserve"> </w:t>
+            </w:r>
+            <w:r>
+              <w:rPr>
+                <w:rStyle w:val="VerbatimChar"/>
+              </w:rPr>
+              <w:t xml:space="preserve">CM-COVENANT-114-87-PROPAGATION</w:t>
+            </w:r>
+            <w:r>
+              <w:t xml:space="preserve"> </w:t>
+            </w:r>
+            <w:r>
+              <w:t xml:space="preserve">pre-build gate (literal anchor</w:t>
+            </w:r>
+            <w:r>
+              <w:t xml:space="preserve"> </w:t>
+            </w:r>
+            <w:r>
+              <w:rPr>
+                <w:rStyle w:val="VerbatimChar"/>
+              </w:rPr>
+              <w:t xml:space="preserve">11.4.87</w:t>
+            </w:r>
+            <w:r>
+              <w:t xml:space="preserve"> </w:t>
+            </w:r>
+            <w:r>
+              <w:t xml:space="preserve">MUST be present in every CLAUDE.md/AGENTS.md/QWEN.md; same expectation for §11.4.85/§11.4.88 per cascade pattern). Agents restate + cite, never redefine or weaken. Prior r5: added the End-user-usability covenant section restating the verbatim operator mandate at Herald agent-rule level; binds every CLI agent (Claude Code, Codex, Cursor, Gemini, Aider, subagents) to the §11.4 anti-bluff enforcement; ties to HERALD_CONSTITUTION.md §107 + inheritance-gate invariant I8b.</w:t>
             </w:r>
           </w:p>
         </w:tc>
@@ -243,7 +273,7 @@
               <w:pStyle w:val="Compact"/>
             </w:pPr>
             <w:r>
-              <w:t xml:space="preserve">R-14 (V2), V3-path-sync (V3 r3), Go-scaffold-status-update (V3 r4), §107 mandate restatement + I8b anchor (r5)</w:t>
+              <w:t xml:space="preserve">R-14 (V2), V3-path-sync (V3 r3), Go-scaffold-status-update (V3 r4), §107 mandate restatement + I8b anchor (r5), Helix §11.4.85 + §11.4.87 + §11.4.88 propagation (r7)</w:t>
             </w:r>
           </w:p>
         </w:tc>
@@ -267,7 +297,22 @@
               <w:pStyle w:val="Compact"/>
             </w:pPr>
             <w:r>
-              <w:t xml:space="preserve">aligned with HRD-009/HRD-009b/HRD-013/HRD-014 landing in the same commit; r5 closes the Herald-level explicit-restatement gap identified by the 2026-05-20 audit.</w:t>
+              <w:t xml:space="preserve">aligned with HRD-009/HRD-009b/HRD-013/HRD-014 landing in the same commit; r5 closes the Herald-level explicit-restatement gap identified by the 2026-05-20 audit; r7 propagates the three new inherited HelixConstitution mandates (§11.4.85 stress+chaos, §11.4.87 endless-loop autonomous work + zero-idle dispatch + anti-bluff testing, §11.4.88 background-push) into this agent-rules file per the §11.4.87</w:t>
+            </w:r>
+            <w:r>
+              <w:t xml:space="preserve"> </w:t>
+            </w:r>
+            <w:r>
+              <w:rPr>
+                <w:rStyle w:val="VerbatimChar"/>
+              </w:rPr>
+              <w:t xml:space="preserve">CM-COVENANT-114-87-PROPAGATION</w:t>
+            </w:r>
+            <w:r>
+              <w:t xml:space="preserve"> </w:t>
+            </w:r>
+            <w:r>
+              <w:t xml:space="preserve">pre-build gate, inherited per §11.4.35; restated + cited, not redefined.</w:t>
             </w:r>
           </w:p>
         </w:tc>
@@ -371,6 +416,23 @@
             <w:rStyle w:val="Hyperlink"/>
           </w:rPr>
           <w:t xml:space="preserve">End-user-usability covenant (Herald §107 / Helix §11.4 — MANDATORY ANTI-BLUFF)</w:t>
+        </w:r>
+      </w:hyperlink>
+    </w:p>
+    <w:p>
+      <w:pPr>
+        <w:pStyle w:val="Compact"/>
+        <w:numPr>
+          <w:ilvl w:val="1"/>
+          <w:numId w:val="1002"/>
+        </w:numPr>
+      </w:pPr>
+      <w:hyperlink w:anchor="Xdd8e9beeffd87d55604d8936daccd130798e766">
+        <w:r>
+          <w:rPr>
+            <w:rStyle w:val="Hyperlink"/>
+          </w:rPr>
+          <w:t xml:space="preserve">Inherited covenant restatements — Helix §11.4.85 / §11.4.87 / §11.4.88</w:t>
         </w:r>
       </w:hyperlink>
     </w:p>
@@ -959,7 +1021,7 @@
       </w:r>
     </w:p>
     <w:bookmarkEnd w:id="11"/>
-    <w:bookmarkStart w:id="18" w:name="herald-specific-agent-rules"/>
+    <w:bookmarkStart w:id="21" w:name="herald-specific-agent-rules"/>
     <w:p>
       <w:pPr>
         <w:pStyle w:val="Heading2"/>
@@ -1921,203 +1983,1340 @@
       </w:r>
     </w:p>
     <w:bookmarkEnd w:id="13"/>
-    <w:bookmarkStart w:id="14" w:name="X494e63fc2991a9d42fefb419b530ac9bef94c53"/>
+    <w:bookmarkStart w:id="14" w:name="Xb219b2eb46f31f9ebcffb67d1eaa8160fd2eadc"/>
     <w:p>
       <w:pPr>
         <w:pStyle w:val="Heading3"/>
       </w:pPr>
       <w:r>
-        <w:t xml:space="preserve">Inheritance gate (run before any commit that touches root docs or</w:t>
-      </w:r>
-      <w:r>
-        <w:t xml:space="preserve"> </w:t>
-      </w:r>
-      <w:r>
-        <w:rPr>
-          <w:rStyle w:val="VerbatimChar"/>
-        </w:rPr>
-        <w:t xml:space="preserve">constitution/</w:t>
-      </w:r>
-      <w:r>
-        <w:t xml:space="preserve">)</w:t>
-      </w:r>
-    </w:p>
-    <w:p>
-      <w:pPr>
-        <w:pStyle w:val="SourceCode"/>
-      </w:pPr>
-      <w:r>
-        <w:rPr>
-          <w:rStyle w:val="FunctionTok"/>
-        </w:rPr>
-        <w:t xml:space="preserve">bash</w:t>
-      </w:r>
-      <w:r>
-        <w:rPr>
-          <w:rStyle w:val="NormalTok"/>
-        </w:rPr>
-        <w:t xml:space="preserve"> tests/test_constitution_inheritance.sh        </w:t>
-      </w:r>
-      <w:r>
-        <w:rPr>
-          <w:rStyle w:val="CommentTok"/>
-        </w:rPr>
-        <w:t xml:space="preserve"># the gate</w:t>
-      </w:r>
-      <w:r>
-        <w:br/>
-      </w:r>
-      <w:r>
-        <w:rPr>
-          <w:rStyle w:val="FunctionTok"/>
-        </w:rPr>
-        <w:t xml:space="preserve">bash</w:t>
-      </w:r>
-      <w:r>
-        <w:rPr>
-          <w:rStyle w:val="NormalTok"/>
-        </w:rPr>
-        <w:t xml:space="preserve"> tests/test_constitution_inheritance_meta.sh   </w:t>
-      </w:r>
-      <w:r>
-        <w:rPr>
-          <w:rStyle w:val="CommentTok"/>
-        </w:rPr>
-        <w:t xml:space="preserve"># paired mutation proof (§1.1)</w:t>
+        <w:t xml:space="preserve">§107.x — docs/qa/ Evidence Mandate (operator mandate, 2026-05-22; cascades from Helix §11.4.83)</w:t>
       </w:r>
     </w:p>
     <w:p>
       <w:pPr>
         <w:pStyle w:val="FirstParagraph"/>
       </w:pPr>
-      <w:r>
-        <w:t xml:space="preserve">Both MUST return 0. If either fails, fix at root cause per Constitution §11.4.4 — never silently accept the FAIL.</w:t>
-      </w:r>
-    </w:p>
-    <w:bookmarkEnd w:id="14"/>
-    <w:bookmarkStart w:id="15" w:name="X32120c2cbf4d615e5864fa1300f097d3beccf79"/>
-    <w:p>
-      <w:pPr>
-        <w:pStyle w:val="Heading3"/>
-      </w:pPr>
-      <w:r>
-        <w:t xml:space="preserve">Spec-change rule (load-bearing —</w:t>
-      </w:r>
-      <w:r>
-        <w:t xml:space="preserve"> </w:t>
-      </w:r>
-      <w:r>
-        <w:rPr>
-          <w:rStyle w:val="VerbatimChar"/>
-        </w:rPr>
-        <w:t xml:space="preserve">docs/specs/mvp/specification.V3.md</w:t>
-      </w:r>
-      <w:r>
-        <w:t xml:space="preserve"> </w:t>
-      </w:r>
-      <w:r>
-        <w:t xml:space="preserve">§"Specification documents")</w:t>
-      </w:r>
-    </w:p>
-    <w:p>
-      <w:pPr>
-        <w:pStyle w:val="FirstParagraph"/>
-      </w:pPr>
-      <w:r>
-        <w:t xml:space="preserve">Whenever</w:t>
-      </w:r>
-      <w:r>
-        <w:t xml:space="preserve"> </w:t>
-      </w:r>
-      <w:r>
-        <w:rPr>
-          <w:rStyle w:val="VerbatimChar"/>
-        </w:rPr>
-        <w:t xml:space="preserve">docs/specs/mvp/specification.V3.md</w:t>
-      </w:r>
-      <w:r>
-        <w:t xml:space="preserve"> </w:t>
-      </w:r>
-      <w:r>
-        <w:t xml:space="preserve">or any file under</w:t>
-      </w:r>
-      <w:r>
-        <w:t xml:space="preserve"> </w:t>
-      </w:r>
-      <w:r>
-        <w:rPr>
-          <w:rStyle w:val="VerbatimChar"/>
-        </w:rPr>
-        <w:t xml:space="preserve">docs/specs/</w:t>
-      </w:r>
-      <w:r>
-        <w:t xml:space="preserve"> </w:t>
-      </w:r>
-      <w:r>
-        <w:t xml:space="preserve">(any depth) is modified,</w:t>
-      </w:r>
-      <w:r>
-        <w:t xml:space="preserve"> </w:t>
-      </w:r>
       <w:r>
         <w:rPr>
           <w:b/>
           <w:bCs/>
         </w:rPr>
-        <w:t xml:space="preserve">comprehensive planning and implementation of all changes is MANDATORY</w:t>
-      </w:r>
-      <w:r>
-        <w:t xml:space="preserve"> </w:t>
-      </w:r>
-      <w:r>
-        <w:t xml:space="preserve">— agents may not edit the spec in isolation. This rule does NOT apply to creating or renaming files; for those, ask the operator what to do with the new path. Treat every spec edit as a project-wide ripple, not a doc tweak.</w:t>
-      </w:r>
-    </w:p>
-    <w:p>
-      <w:pPr>
-        <w:pStyle w:val="BodyText"/>
-      </w:pPr>
-      <w:r>
-        <w:t xml:space="preserve">This rule is mirrored in</w:t>
-      </w:r>
-      <w:r>
-        <w:t xml:space="preserve"> </w:t>
-      </w:r>
-      <w:r>
-        <w:rPr>
-          <w:rStyle w:val="VerbatimChar"/>
-        </w:rPr>
-        <w:t xml:space="preserve">CLAUDE.md</w:t>
-      </w:r>
-      <w:r>
-        <w:t xml:space="preserve"> </w:t>
-      </w:r>
-      <w:r>
-        <w:t xml:space="preserve">and in</w:t>
-      </w:r>
-      <w:r>
-        <w:t xml:space="preserve"> </w:t>
-      </w:r>
-      <w:r>
-        <w:rPr>
-          <w:rStyle w:val="VerbatimChar"/>
-        </w:rPr>
-        <w:t xml:space="preserve">docs/guides/HERALD_CONSTITUTION.md</w:t>
-      </w:r>
-      <w:r>
-        <w:t xml:space="preserve"> </w:t>
-      </w:r>
-      <w:r>
-        <w:t xml:space="preserve">§106. The inheritance gate's invariant</w:t>
-      </w:r>
-      <w:r>
-        <w:t xml:space="preserve"> </w:t>
-      </w:r>
+        <w:t xml:space="preserve">Forensic anchor — verbatim operator mandate (2026-05-22):</w:t>
+      </w:r>
+    </w:p>
+    <w:p>
+      <w:pPr>
+        <w:pStyle w:val="BlockText"/>
+      </w:pPr>
+      <w:r>
+        <w:t xml:space="preserve">"every feature that ships MUST carry a recorded e2e communication transcript + any attached materials under</w:t>
+      </w:r>
+      <w:r>
+        <w:t xml:space="preserve"> </w:t>
+      </w:r>
+      <w:r>
+        <w:rPr>
+          <w:rStyle w:val="VerbatimChar"/>
+        </w:rPr>
+        <w:t xml:space="preserve">docs/qa/&lt;run-id&gt;/</w:t>
+      </w:r>
+      <w:r>
+        <w:t xml:space="preserve"> </w:t>
+      </w:r>
+      <w:r>
+        <w:t xml:space="preserve">(per-feature subdirectories). A feature with no QA transcript is itself a §107 PASS-bluff — it claims to work but has no auditable runtime evidence. Bot-driven automation (e.g. Herald's planned</w:t>
+      </w:r>
+      <w:r>
+        <w:t xml:space="preserve"> </w:t>
+      </w:r>
+      <w:r>
+        <w:rPr>
+          <w:rStyle w:val="VerbatimChar"/>
+        </w:rPr>
+        <w:t xml:space="preserve">qaherald</w:t>
+      </w:r>
+      <w:r>
+        <w:t xml:space="preserve"> </w:t>
+      </w:r>
+      <w:r>
+        <w:t xml:space="preserve">binary) MUST preserve full bidirectional communication threads as proof."</w:t>
+      </w:r>
+    </w:p>
+    <w:p>
+      <w:pPr>
+        <w:pStyle w:val="FirstParagraph"/>
+      </w:pPr>
       <w:r>
         <w:rPr>
           <w:b/>
           <w:bCs/>
         </w:rPr>
+        <w:t xml:space="preserve">Agent-binding rule for Herald.</w:t>
+      </w:r>
+      <w:r>
+        <w:t xml:space="preserve"> </w:t>
+      </w:r>
+      <w:r>
+        <w:t xml:space="preserve">No agent may declare a Herald feature done without</w:t>
+      </w:r>
+      <w:r>
+        <w:t xml:space="preserve"> </w:t>
+      </w:r>
+      <w:r>
+        <w:rPr>
+          <w:rStyle w:val="VerbatimChar"/>
+        </w:rPr>
+        <w:t xml:space="preserve">docs/qa/&lt;run-id&gt;/</w:t>
+      </w:r>
+      <w:r>
+        <w:t xml:space="preserve"> </w:t>
+      </w:r>
+      <w:r>
+        <w:t xml:space="preserve">evidence committed in the same logical work effort. Telegram-driven features (HRD-011, planned</w:t>
+      </w:r>
+      <w:r>
+        <w:t xml:space="preserve"> </w:t>
+      </w:r>
+      <w:r>
+        <w:rPr>
+          <w:rStyle w:val="VerbatimChar"/>
+        </w:rPr>
+        <w:t xml:space="preserve">qaherald</w:t>
+      </w:r>
+      <w:r>
+        <w:t xml:space="preserve">) capture both halves of the bot conversation; Gin</w:t>
+      </w:r>
+      <w:r>
+        <w:t xml:space="preserve"> </w:t>
+      </w:r>
+      <w:r>
+        <w:rPr>
+          <w:rStyle w:val="VerbatimChar"/>
+        </w:rPr>
+        <w:t xml:space="preserve">/v1/*</w:t>
+      </w:r>
+      <w:r>
+        <w:t xml:space="preserve"> </w:t>
+      </w:r>
+      <w:r>
+        <w:t xml:space="preserve">routes capture request + full response body; container-driven features (Postgres, Redis, OTel) capture container logs + healthcheck output. Bot-driven QA (the planned</w:t>
+      </w:r>
+      <w:r>
+        <w:t xml:space="preserve"> </w:t>
+      </w:r>
+      <w:r>
+        <w:rPr>
+          <w:rStyle w:val="VerbatimChar"/>
+        </w:rPr>
+        <w:t xml:space="preserve">qaherald</w:t>
+      </w:r>
+      <w:r>
+        <w:t xml:space="preserve"> </w:t>
+      </w:r>
+      <w:r>
+        <w:t xml:space="preserve">binary) MUST preserve the full conversation thread under</w:t>
+      </w:r>
+      <w:r>
+        <w:t xml:space="preserve"> </w:t>
+      </w:r>
+      <w:r>
+        <w:rPr>
+          <w:rStyle w:val="VerbatimChar"/>
+        </w:rPr>
+        <w:t xml:space="preserve">docs/qa/qaherald-&lt;TS&gt;/</w:t>
+      </w:r>
+      <w:r>
+        <w:t xml:space="preserve"> </w:t>
+      </w:r>
+      <w:r>
+        <w:t xml:space="preserve">— a stored-final-PASS-only mode is itself a §107 bluff.</w:t>
+      </w:r>
+    </w:p>
+    <w:p>
+      <w:pPr>
+        <w:pStyle w:val="BodyText"/>
+      </w:pPr>
+      <w:r>
+        <w:t xml:space="preserve">CI / release gates MUST refuse to tag a release whose feature-shipping commits lack their matching</w:t>
+      </w:r>
+      <w:r>
+        <w:t xml:space="preserve"> </w:t>
+      </w:r>
+      <w:r>
+        <w:rPr>
+          <w:rStyle w:val="VerbatimChar"/>
+        </w:rPr>
+        <w:t xml:space="preserve">docs/qa/&lt;run-id&gt;/</w:t>
+      </w:r>
+      <w:r>
+        <w:t xml:space="preserve">. Canonical Helix authority:</w:t>
+      </w:r>
+      <w:r>
+        <w:t xml:space="preserve"> </w:t>
+      </w:r>
+      <w:r>
+        <w:rPr>
+          <w:rStyle w:val="VerbatimChar"/>
+        </w:rPr>
+        <w:t xml:space="preserve">&lt;discovered&gt;/Constitution.md</w:t>
+      </w:r>
+      <w:r>
+        <w:t xml:space="preserve"> </w:t>
+      </w:r>
+      <w:r>
+        <w:t xml:space="preserve">§11.4.83. Canonical Herald authority:</w:t>
+      </w:r>
+      <w:r>
+        <w:t xml:space="preserve"> </w:t>
+      </w:r>
+      <w:r>
+        <w:rPr>
+          <w:rStyle w:val="VerbatimChar"/>
+        </w:rPr>
+        <w:t xml:space="preserve">docs/guides/HERALD_CONSTITUTION.md</w:t>
+      </w:r>
+      <w:r>
+        <w:t xml:space="preserve"> </w:t>
+      </w:r>
+      <w:r>
+        <w:t xml:space="preserve">§107.x.</w:t>
+      </w:r>
+    </w:p>
+    <w:bookmarkEnd w:id="14"/>
+    <w:bookmarkStart w:id="15" w:name="X20e941a15753fd3d47afd43a83ad4e871769bd7"/>
+    <w:p>
+      <w:pPr>
+        <w:pStyle w:val="Heading3"/>
+      </w:pPr>
+      <w:r>
+        <w:t xml:space="preserve">§107.y — Working-Tree Quiescence Rule (operator mandate, 2026-05-22; cascades from Helix §11.4.84)</w:t>
+      </w:r>
+    </w:p>
+    <w:p>
+      <w:pPr>
+        <w:pStyle w:val="FirstParagraph"/>
+      </w:pPr>
+      <w:r>
+        <w:rPr>
+          <w:b/>
+          <w:bCs/>
+        </w:rPr>
+        <w:t xml:space="preserve">Short tag:</w:t>
+      </w:r>
+      <w:r>
+        <w:t xml:space="preserve"> </w:t>
+      </w:r>
+      <w:r>
+        <w:rPr>
+          <w:rStyle w:val="VerbatimChar"/>
+        </w:rPr>
+        <w:t xml:space="preserve">working-tree quiescence</w:t>
+      </w:r>
+      <w:r>
+        <w:t xml:space="preserve">.</w:t>
+      </w:r>
+    </w:p>
+    <w:p>
+      <w:pPr>
+        <w:pStyle w:val="BodyText"/>
+      </w:pPr>
+      <w:r>
+        <w:rPr>
+          <w:b/>
+          <w:bCs/>
+        </w:rPr>
+        <w:t xml:space="preserve">Forensic anchor — verbatim operator mandate (2026-05-22):</w:t>
+      </w:r>
+    </w:p>
+    <w:p>
+      <w:pPr>
+        <w:pStyle w:val="BlockText"/>
+      </w:pPr>
+      <w:r>
+        <w:t xml:space="preserve">"no subagent commit may proceed while any concurrent mutation gate is in flight in the same checkout. Before</w:t>
+      </w:r>
+      <w:r>
+        <w:t xml:space="preserve"> </w:t>
+      </w:r>
+      <w:r>
+        <w:rPr>
+          <w:rStyle w:val="VerbatimChar"/>
+        </w:rPr>
+        <w:t xml:space="preserve">git add</w:t>
+      </w:r>
+      <w:r>
+        <w:t xml:space="preserve">, the committing agent MUST</w:t>
+      </w:r>
+      <w:r>
+        <w:t xml:space="preserve"> </w:t>
+      </w:r>
+      <w:r>
+        <w:rPr>
+          <w:rStyle w:val="VerbatimChar"/>
+        </w:rPr>
+        <w:t xml:space="preserve">grep</w:t>
+      </w:r>
+      <w:r>
+        <w:t xml:space="preserve"> </w:t>
+      </w:r>
+      <w:r>
+        <w:t xml:space="preserve">its own working tree for mutation markers (</w:t>
+      </w:r>
+      <w:r>
+        <w:rPr>
+          <w:rStyle w:val="VerbatimChar"/>
+        </w:rPr>
+        <w:t xml:space="preserve">MUTATED for paired</w:t>
+      </w:r>
+      <w:r>
+        <w:t xml:space="preserve">,</w:t>
+      </w:r>
+      <w:r>
+        <w:t xml:space="preserve"> </w:t>
+      </w:r>
+      <w:r>
+        <w:rPr>
+          <w:rStyle w:val="VerbatimChar"/>
+        </w:rPr>
+        <w:t xml:space="preserve">// always pass</w:t>
+      </w:r>
+      <w:r>
+        <w:t xml:space="preserve">,</w:t>
+      </w:r>
+      <w:r>
+        <w:t xml:space="preserve"> </w:t>
+      </w:r>
+      <w:r>
+        <w:rPr>
+          <w:rStyle w:val="VerbatimChar"/>
+        </w:rPr>
+        <w:t xml:space="preserve">return json.Marshal</w:t>
+      </w:r>
+      <w:r>
+        <w:t xml:space="preserve"> </w:t>
+      </w:r>
+      <w:r>
+        <w:t xml:space="preserve">shortcut paths, etc.). Any unexplained file in the staging area triggers ABORT."</w:t>
+      </w:r>
+    </w:p>
+    <w:p>
+      <w:pPr>
+        <w:pStyle w:val="FirstParagraph"/>
+      </w:pPr>
+      <w:r>
+        <w:rPr>
+          <w:b/>
+          <w:bCs/>
+        </w:rPr>
+        <w:t xml:space="preserve">Lesson (forensic — Herald-internal).</w:t>
+      </w:r>
+      <w:r>
+        <w:t xml:space="preserve"> </w:t>
+      </w:r>
+      <w:r>
+        <w:t xml:space="preserve">Commit</w:t>
+      </w:r>
+      <w:r>
+        <w:t xml:space="preserve"> </w:t>
+      </w:r>
+      <w:r>
+        <w:rPr>
+          <w:rStyle w:val="VerbatimChar"/>
+        </w:rPr>
+        <w:t xml:space="preserve">72e81ab</w:t>
+      </w:r>
+      <w:r>
+        <w:t xml:space="preserve"> </w:t>
+      </w:r>
+      <w:r>
+        <w:t xml:space="preserve">(logo fix subagent, 2026-05-21) swept a</w:t>
+      </w:r>
+      <w:r>
+        <w:t xml:space="preserve"> </w:t>
+      </w:r>
+      <w:r>
+        <w:rPr>
+          <w:rStyle w:val="VerbatimChar"/>
+        </w:rPr>
+        <w:t xml:space="preserve">// always pass</w:t>
+      </w:r>
+      <w:r>
+        <w:t xml:space="preserve"> </w:t>
+      </w:r>
+      <w:r>
+        <w:t xml:space="preserve">JWT-bypass mutation residue — left mid-cycle by a paired §1.1 Wave 4b mutation gate — into the unrelated commit, which was then pushed to all four mirrors. The SECURITY FIX</w:t>
+      </w:r>
+      <w:r>
+        <w:t xml:space="preserve"> </w:t>
+      </w:r>
+      <w:r>
+        <w:rPr>
+          <w:rStyle w:val="VerbatimChar"/>
+        </w:rPr>
+        <w:t xml:space="preserve">d5bd360</w:t>
+      </w:r>
+      <w:r>
+        <w:t xml:space="preserve"> </w:t>
+      </w:r>
+      <w:r>
+        <w:t xml:space="preserve">("restore commons_auth/middleware.go JWT verify (mutation residue in 72e81ab)") landed within the hour, but the production-equivalent-binary-with-bypassed-JWT window is a real security-defect window. The rule below is the constitutional outcome.</w:t>
+      </w:r>
+    </w:p>
+    <w:p>
+      <w:pPr>
+        <w:pStyle w:val="BodyText"/>
+      </w:pPr>
+      <w:r>
+        <w:rPr>
+          <w:b/>
+          <w:bCs/>
+        </w:rPr>
+        <w:t xml:space="preserve">Agent-binding rule for Herald.</w:t>
+      </w:r>
+      <w:r>
+        <w:t xml:space="preserve"> </w:t>
+      </w:r>
+      <w:r>
+        <w:t xml:space="preserve">Every commit flow (main thread + every dispatched subagent) MUST: (1) grep the working tree for mutation markers (</w:t>
+      </w:r>
+      <w:r>
+        <w:rPr>
+          <w:rStyle w:val="VerbatimChar"/>
+        </w:rPr>
+        <w:t xml:space="preserve">MUTATED for paired</w:t>
+      </w:r>
+      <w:r>
+        <w:t xml:space="preserve">,</w:t>
+      </w:r>
+      <w:r>
+        <w:t xml:space="preserve"> </w:t>
+      </w:r>
+      <w:r>
+        <w:rPr>
+          <w:rStyle w:val="VerbatimChar"/>
+        </w:rPr>
+        <w:t xml:space="preserve">// always pass</w:t>
+      </w:r>
+      <w:r>
+        <w:t xml:space="preserve">,</w:t>
+      </w:r>
+      <w:r>
+        <w:t xml:space="preserve"> </w:t>
+      </w:r>
+      <w:r>
+        <w:rPr>
+          <w:rStyle w:val="VerbatimChar"/>
+        </w:rPr>
+        <w:t xml:space="preserve">return json.Marshal</w:t>
+      </w:r>
+      <w:r>
+        <w:t xml:space="preserve"> </w:t>
+      </w:r>
+      <w:r>
+        <w:t xml:space="preserve">shortcut paths,</w:t>
+      </w:r>
+      <w:r>
+        <w:t xml:space="preserve"> </w:t>
+      </w:r>
+      <w:r>
+        <w:rPr>
+          <w:rStyle w:val="VerbatimChar"/>
+        </w:rPr>
+        <w:t xml:space="preserve">// MUTATION</w:t>
+      </w:r>
+      <w:r>
+        <w:t xml:space="preserve"> </w:t>
+      </w:r>
+      <w:r>
+        <w:t xml:space="preserve">/</w:t>
+      </w:r>
+      <w:r>
+        <w:t xml:space="preserve"> </w:t>
+      </w:r>
+      <w:r>
+        <w:rPr>
+          <w:rStyle w:val="VerbatimChar"/>
+        </w:rPr>
+        <w:t xml:space="preserve"># MUTATION</w:t>
+      </w:r>
+      <w:r>
+        <w:t xml:space="preserve"> </w:t>
+      </w:r>
+      <w:r>
+        <w:t xml:space="preserve">annotations,</w:t>
+      </w:r>
+      <w:r>
+        <w:t xml:space="preserve"> </w:t>
+      </w:r>
+      <w:r>
+        <w:rPr>
+          <w:rStyle w:val="VerbatimChar"/>
+        </w:rPr>
+        <w:t xml:space="preserve">_mutated_*</w:t>
+      </w:r>
+      <w:r>
+        <w:t xml:space="preserve"> </w:t>
+      </w:r>
+      <w:r>
+        <w:t xml:space="preserve">filename suffixes,</w:t>
+      </w:r>
+      <w:r>
+        <w:t xml:space="preserve"> </w:t>
+      </w:r>
+      <w:r>
+        <w:rPr>
+          <w:rStyle w:val="VerbatimChar"/>
+        </w:rPr>
+        <w:t xml:space="preserve">.git/MUTATION_IN_PROGRESS</w:t>
+      </w:r>
+      <w:r>
+        <w:t xml:space="preserve"> </w:t>
+      </w:r>
+      <w:r>
+        <w:t xml:space="preserve">lockfile) BEFORE</w:t>
+      </w:r>
+      <w:r>
+        <w:t xml:space="preserve"> </w:t>
+      </w:r>
+      <w:r>
+        <w:rPr>
+          <w:rStyle w:val="VerbatimChar"/>
+        </w:rPr>
+        <w:t xml:space="preserve">git add</w:t>
+      </w:r>
+      <w:r>
+        <w:t xml:space="preserve">; (2) cross-check</w:t>
+      </w:r>
+      <w:r>
+        <w:t xml:space="preserve"> </w:t>
+      </w:r>
+      <w:r>
+        <w:rPr>
+          <w:rStyle w:val="VerbatimChar"/>
+        </w:rPr>
+        <w:t xml:space="preserve">git status --porcelain</w:t>
+      </w:r>
+      <w:r>
+        <w:t xml:space="preserve"> </w:t>
+      </w:r>
+      <w:r>
+        <w:t xml:space="preserve">against the declared scope — unaccounted files ABORT; (3) refuse to operate while</w:t>
+      </w:r>
+      <w:r>
+        <w:t xml:space="preserve"> </w:t>
+      </w:r>
+      <w:r>
+        <w:rPr>
+          <w:rStyle w:val="VerbatimChar"/>
+        </w:rPr>
+        <w:t xml:space="preserve">.git/MUTATION_IN_PROGRESS</w:t>
+      </w:r>
+      <w:r>
+        <w:t xml:space="preserve"> </w:t>
+      </w:r>
+      <w:r>
+        <w:t xml:space="preserve">is present (any active mutation gate MUST complete mutate → assert FAIL → restore → assert PASS BEFORE unrelated commits proceed); (4) prefer</w:t>
+      </w:r>
+      <w:r>
+        <w:t xml:space="preserve"> </w:t>
+      </w:r>
+      <w:r>
+        <w:rPr>
+          <w:rStyle w:val="VerbatimChar"/>
+        </w:rPr>
+        <w:t xml:space="preserve">git worktree add</w:t>
+      </w:r>
+      <w:r>
+        <w:t xml:space="preserve"> </w:t>
+      </w:r>
+      <w:r>
+        <w:t xml:space="preserve">per subagent when running concurrent subagent work.</w:t>
+      </w:r>
+    </w:p>
+    <w:p>
+      <w:pPr>
+        <w:pStyle w:val="BodyText"/>
+      </w:pPr>
+      <w:r>
+        <w:rPr>
+          <w:b/>
+          <w:bCs/>
+        </w:rPr>
+        <w:t xml:space="preserve">Prototype.</w:t>
+      </w:r>
+      <w:r>
+        <w:t xml:space="preserve"> </w:t>
+      </w:r>
+      <w:r>
+        <w:rPr>
+          <w:rStyle w:val="VerbatimChar"/>
+        </w:rPr>
+        <w:t xml:space="preserve">tests/test_wave4b_mutation_meta.sh</w:t>
+      </w:r>
+      <w:r>
+        <w:t xml:space="preserve"> </w:t>
+      </w:r>
+      <w:r>
+        <w:t xml:space="preserve">carries the canonical Herald implementation (</w:t>
+      </w:r>
+      <w:r>
+        <w:rPr>
+          <w:rStyle w:val="VerbatimChar"/>
+        </w:rPr>
+        <w:t xml:space="preserve">check_quiescence()</w:t>
+      </w:r>
+      <w:r>
+        <w:t xml:space="preserve"> </w:t>
+      </w:r>
+      <w:r>
+        <w:t xml:space="preserve">at line 92; assertion at line 197). Generalising to all paired-§1.1 gates is open work. The planned universal scanner is</w:t>
+      </w:r>
+      <w:r>
+        <w:t xml:space="preserve"> </w:t>
+      </w:r>
+      <w:r>
+        <w:rPr>
+          <w:rStyle w:val="VerbatimChar"/>
+        </w:rPr>
+        <w:t xml:space="preserve">scripts/mutation_residue_audit.sh</w:t>
+      </w:r>
+      <w:r>
+        <w:t xml:space="preserve">.</w:t>
+      </w:r>
+    </w:p>
+    <w:p>
+      <w:pPr>
+        <w:pStyle w:val="BodyText"/>
+      </w:pPr>
+      <w:r>
+        <w:t xml:space="preserve">Canonical Helix authority:</w:t>
+      </w:r>
+      <w:r>
+        <w:t xml:space="preserve"> </w:t>
+      </w:r>
+      <w:r>
+        <w:rPr>
+          <w:rStyle w:val="VerbatimChar"/>
+        </w:rPr>
+        <w:t xml:space="preserve">&lt;discovered&gt;/Constitution.md</w:t>
+      </w:r>
+      <w:r>
+        <w:t xml:space="preserve"> </w:t>
+      </w:r>
+      <w:r>
+        <w:t xml:space="preserve">§11.4.84. Canonical Herald authority:</w:t>
+      </w:r>
+      <w:r>
+        <w:t xml:space="preserve"> </w:t>
+      </w:r>
+      <w:r>
+        <w:rPr>
+          <w:rStyle w:val="VerbatimChar"/>
+        </w:rPr>
+        <w:t xml:space="preserve">docs/guides/HERALD_CONSTITUTION.md</w:t>
+      </w:r>
+      <w:r>
+        <w:t xml:space="preserve"> </w:t>
+      </w:r>
+      <w:r>
+        <w:t xml:space="preserve">§107.y. A mutation marker that lands in a tagged Herald commit is a critical defect regardless of how briefly it persisted — see</w:t>
+      </w:r>
+      <w:r>
+        <w:t xml:space="preserve"> </w:t>
+      </w:r>
+      <w:r>
+        <w:rPr>
+          <w:rStyle w:val="VerbatimChar"/>
+        </w:rPr>
+        <w:t xml:space="preserve">72e81ab</w:t>
+      </w:r>
+      <w:r>
+        <w:t xml:space="preserve"> </w:t>
+      </w:r>
+      <w:r>
+        <w:t xml:space="preserve">/</w:t>
+      </w:r>
+      <w:r>
+        <w:t xml:space="preserve"> </w:t>
+      </w:r>
+      <w:r>
+        <w:rPr>
+          <w:rStyle w:val="VerbatimChar"/>
+        </w:rPr>
+        <w:t xml:space="preserve">d5bd360</w:t>
+      </w:r>
+      <w:r>
+        <w:t xml:space="preserve"> </w:t>
+      </w:r>
+      <w:r>
+        <w:t xml:space="preserve">as proof.</w:t>
+      </w:r>
+    </w:p>
+    <w:bookmarkEnd w:id="15"/>
+    <w:bookmarkStart w:id="16" w:name="X1bce81226275e1cecf335686298233cf483a4f0"/>
+    <w:p>
+      <w:pPr>
+        <w:pStyle w:val="Heading3"/>
+      </w:pPr>
+      <w:r>
+        <w:t xml:space="preserve">Inherited covenant restatements — Helix §11.4.85 / §11.4.87 / §11.4.88</w:t>
+      </w:r>
+    </w:p>
+    <w:p>
+      <w:pPr>
+        <w:pStyle w:val="FirstParagraph"/>
+      </w:pPr>
+      <w:r>
+        <w:t xml:space="preserve">These three mandates are</w:t>
+      </w:r>
+      <w:r>
+        <w:t xml:space="preserve"> </w:t>
+      </w:r>
+      <w:r>
+        <w:rPr>
+          <w:b/>
+          <w:bCs/>
+        </w:rPr>
+        <w:t xml:space="preserve">inherited</w:t>
+      </w:r>
+      <w:r>
+        <w:t xml:space="preserve"> </w:t>
+      </w:r>
+      <w:r>
+        <w:t xml:space="preserve">from the HelixConstitution via parent-discovery (§11.4.35). Every agent — Claude Code, Codex, Cursor, Gemini, Aider, any CLI subagent — is bound by them; this file</w:t>
+      </w:r>
+      <w:r>
+        <w:t xml:space="preserve"> </w:t>
+      </w:r>
+      <w:r>
+        <w:rPr>
+          <w:b/>
+          <w:bCs/>
+        </w:rPr>
+        <w:t xml:space="preserve">restates + cites</w:t>
+      </w:r>
+      <w:r>
+        <w:t xml:space="preserve">, it does NOT redefine or weaken. The literal anchors are required by the §11.4.87</w:t>
+      </w:r>
+      <w:r>
+        <w:t xml:space="preserve"> </w:t>
+      </w:r>
+      <w:r>
+        <w:rPr>
+          <w:rStyle w:val="VerbatimChar"/>
+        </w:rPr>
+        <w:t xml:space="preserve">CM-COVENANT-114-87-PROPAGATION</w:t>
+      </w:r>
+      <w:r>
+        <w:t xml:space="preserve"> </w:t>
+      </w:r>
+      <w:r>
+        <w:t xml:space="preserve">pre-build gate (asserts</w:t>
+      </w:r>
+      <w:r>
+        <w:t xml:space="preserve"> </w:t>
+      </w:r>
+      <w:r>
+        <w:rPr>
+          <w:rStyle w:val="VerbatimChar"/>
+        </w:rPr>
+        <w:t xml:space="preserve">11.4.85</w:t>
+      </w:r>
+      <w:r>
+        <w:t xml:space="preserve"> </w:t>
+      </w:r>
+      <w:r>
+        <w:t xml:space="preserve">/</w:t>
+      </w:r>
+      <w:r>
+        <w:t xml:space="preserve"> </w:t>
+      </w:r>
+      <w:r>
+        <w:rPr>
+          <w:rStyle w:val="VerbatimChar"/>
+        </w:rPr>
+        <w:t xml:space="preserve">11.4.87</w:t>
+      </w:r>
+      <w:r>
+        <w:t xml:space="preserve"> </w:t>
+      </w:r>
+      <w:r>
+        <w:t xml:space="preserve">/</w:t>
+      </w:r>
+      <w:r>
+        <w:t xml:space="preserve"> </w:t>
+      </w:r>
+      <w:r>
+        <w:rPr>
+          <w:rStyle w:val="VerbatimChar"/>
+        </w:rPr>
+        <w:t xml:space="preserve">11.4.88</w:t>
+      </w:r>
+      <w:r>
+        <w:t xml:space="preserve"> </w:t>
+      </w:r>
+      <w:r>
+        <w:t xml:space="preserve">present in every CLAUDE.md / AGENTS.md / QWEN.md).</w:t>
+      </w:r>
+    </w:p>
+    <w:p>
+      <w:pPr>
+        <w:pStyle w:val="BodyText"/>
+      </w:pPr>
+      <w:r>
+        <w:rPr>
+          <w:b/>
+          <w:bCs/>
+        </w:rPr>
+        <w:t xml:space="preserve">§11.4.85 — Stress + Chaos Test Mandate (Helix, 2026-05-24).</w:t>
+      </w:r>
+      <w:r>
+        <w:t xml:space="preserve"> </w:t>
+      </w:r>
+      <w:r>
+        <w:t xml:space="preserve">Agent-binding rule: no agent may declare a Herald fix or improvement done without full-automation</w:t>
+      </w:r>
+      <w:r>
+        <w:t xml:space="preserve"> </w:t>
+      </w:r>
+      <w:r>
+        <w:rPr>
+          <w:b/>
+          <w:bCs/>
+        </w:rPr>
+        <w:t xml:space="preserve">stress</w:t>
+      </w:r>
+      <w:r>
+        <w:t xml:space="preserve"> </w:t>
+      </w:r>
+      <w:r>
+        <w:t xml:space="preserve">(sustained / concurrent load) AND</w:t>
+      </w:r>
+      <w:r>
+        <w:t xml:space="preserve"> </w:t>
+      </w:r>
+      <w:r>
+        <w:rPr>
+          <w:b/>
+          <w:bCs/>
+        </w:rPr>
+        <w:t xml:space="preserve">chaos</w:t>
+      </w:r>
+      <w:r>
+        <w:t xml:space="preserve"> </w:t>
+      </w:r>
+      <w:r>
+        <w:t xml:space="preserve">(process-death / network-fault / input-corruption / resource-exhaustion / state-corruption injection) test suites, each PASS citing a captured-evidence artefact under</w:t>
+      </w:r>
+      <w:r>
+        <w:t xml:space="preserve"> </w:t>
+      </w:r>
+      <w:r>
+        <w:rPr>
+          <w:rStyle w:val="VerbatimChar"/>
+        </w:rPr>
+        <w:t xml:space="preserve">docs/qa/&lt;run-id&gt;/stress_chaos/</w:t>
+      </w:r>
+      <w:r>
+        <w:t xml:space="preserve"> </w:t>
+      </w:r>
+      <w:r>
+        <w:t xml:space="preserve">per §11.4.5 + §11.4.69. A happy-path-only PASS is a §11.4 / §107 PASS-bluff at the resilience layer. Binds Herald's flavor binaries (</w:t>
+      </w:r>
+      <w:r>
+        <w:rPr>
+          <w:rStyle w:val="VerbatimChar"/>
+        </w:rPr>
+        <w:t xml:space="preserve">pherald listen</w:t>
+      </w:r>
+      <w:r>
+        <w:t xml:space="preserve"> </w:t>
+      </w:r>
+      <w:r>
+        <w:t xml:space="preserve">under concurrent updates, Gin</w:t>
+      </w:r>
+      <w:r>
+        <w:t xml:space="preserve"> </w:t>
+      </w:r>
+      <w:r>
+        <w:rPr>
+          <w:rStyle w:val="VerbatimChar"/>
+        </w:rPr>
+        <w:t xml:space="preserve">/v1/*</w:t>
+      </w:r>
+      <w:r>
+        <w:t xml:space="preserve"> </w:t>
+      </w:r>
+      <w:r>
+        <w:t xml:space="preserve">under load, claude_code dispatch under process-death, container flows under disk/OOM pressure). Canonical authority: HelixConstitution Constitution.md §11.4.85 (inherited per §11.4.35).</w:t>
+      </w:r>
+    </w:p>
+    <w:p>
+      <w:pPr>
+        <w:pStyle w:val="BodyText"/>
+      </w:pPr>
+      <w:r>
+        <w:rPr>
+          <w:b/>
+          <w:bCs/>
+        </w:rPr>
+        <w:t xml:space="preserve">§11.4.87 — Endless-loop autonomous work + zero-idle agent dispatch + anti-bluff testing (Helix, 2026-05-26).</w:t>
+      </w:r>
+      <w:r>
+        <w:t xml:space="preserve"> </w:t>
+      </w:r>
+      <w:r>
+        <w:t xml:space="preserve">Agent-binding rule: when instructed to "continue in endless loop fully autonomously" (or equivalent), the agent MUST continue until ALL are simultaneously TRUE — Herald's loop checks</w:t>
+      </w:r>
+      <w:r>
+        <w:t xml:space="preserve"> </w:t>
+      </w:r>
+      <w:r>
+        <w:rPr>
+          <w:rStyle w:val="VerbatimChar"/>
+        </w:rPr>
+        <w:t xml:space="preserve">docs/Issues.md</w:t>
+      </w:r>
+      <w:r>
+        <w:t xml:space="preserve"> </w:t>
+      </w:r>
+      <w:r>
+        <w:t xml:space="preserve">Status-column (zero</w:t>
+      </w:r>
+      <w:r>
+        <w:t xml:space="preserve"> </w:t>
+      </w:r>
+      <w:r>
+        <w:rPr>
+          <w:rStyle w:val="VerbatimChar"/>
+        </w:rPr>
+        <w:t xml:space="preserve">In progress</w:t>
+      </w:r>
+      <w:r>
+        <w:t xml:space="preserve">/</w:t>
+      </w:r>
+      <w:r>
+        <w:rPr>
+          <w:rStyle w:val="VerbatimChar"/>
+        </w:rPr>
+        <w:t xml:space="preserve">Ready for testing</w:t>
+      </w:r>
+      <w:r>
+        <w:t xml:space="preserve">/</w:t>
+      </w:r>
+      <w:r>
+        <w:rPr>
+          <w:rStyle w:val="VerbatimChar"/>
+        </w:rPr>
+        <w:t xml:space="preserve">In testing</w:t>
+      </w:r>
+      <w:r>
+        <w:t xml:space="preserve">/</w:t>
+      </w:r>
+      <w:r>
+        <w:rPr>
+          <w:rStyle w:val="VerbatimChar"/>
+        </w:rPr>
+        <w:t xml:space="preserve">Reopened</w:t>
+      </w:r>
+      <w:r>
+        <w:t xml:space="preserve"> </w:t>
+      </w:r>
+      <w:r>
+        <w:t xml:space="preserve">per §11.4.15),</w:t>
+      </w:r>
+      <w:r>
+        <w:t xml:space="preserve"> </w:t>
+      </w:r>
+      <w:r>
+        <w:rPr>
+          <w:rStyle w:val="VerbatimChar"/>
+        </w:rPr>
+        <w:t xml:space="preserve">docs/CONTINUATION.md</w:t>
+      </w:r>
+      <w:r>
+        <w:t xml:space="preserve"> </w:t>
+      </w:r>
+      <w:r>
+        <w:t xml:space="preserve">§3 "Active work" empty, TaskList reports no subagent mid-execution, and no in-flight push/build/sync. The agent MUST dispatch background subagents for parallelisable non-contending work rather than serialise; idle is permitted ONLY while waiting on a result. Every closed item lands four-layer coverage (§11.4.4(b)) with real captured-evidence PASS; tests AND Challenges are bound equally. The loop terminates only on all-clear, explicit operator</w:t>
+      </w:r>
+      <w:r>
+        <w:t xml:space="preserve"> </w:t>
+      </w:r>
+      <w:r>
+        <w:rPr>
+          <w:rStyle w:val="VerbatimChar"/>
+        </w:rPr>
+        <w:t xml:space="preserve">STOP</w:t>
+      </w:r>
+      <w:r>
+        <w:t xml:space="preserve">, a §12 host-session-safety demand, or a scheduled wake against a known-future-actionable signal. No</w:t>
+      </w:r>
+      <w:r>
+        <w:t xml:space="preserve"> </w:t>
+      </w:r>
+      <w:r>
+        <w:rPr>
+          <w:rStyle w:val="VerbatimChar"/>
+        </w:rPr>
+        <w:t xml:space="preserve">--idle-OK</w:t>
+      </w:r>
+      <w:r>
+        <w:t xml:space="preserve"> </w:t>
+      </w:r>
+      <w:r>
+        <w:t xml:space="preserve">/</w:t>
+      </w:r>
+      <w:r>
+        <w:t xml:space="preserve"> </w:t>
+      </w:r>
+      <w:r>
+        <w:rPr>
+          <w:rStyle w:val="VerbatimChar"/>
+        </w:rPr>
+        <w:t xml:space="preserve">--skip-endless-loop</w:t>
+      </w:r>
+      <w:r>
+        <w:t xml:space="preserve"> </w:t>
+      </w:r>
+      <w:r>
+        <w:t xml:space="preserve">/</w:t>
+      </w:r>
+      <w:r>
+        <w:t xml:space="preserve"> </w:t>
+      </w:r>
+      <w:r>
+        <w:rPr>
+          <w:rStyle w:val="VerbatimChar"/>
+        </w:rPr>
+        <w:t xml:space="preserve">--metadata-only-test-suffices</w:t>
+      </w:r>
+      <w:r>
+        <w:t xml:space="preserve"> </w:t>
+      </w:r>
+      <w:r>
+        <w:t xml:space="preserve">escape exists. Canonical authority: HelixConstitution Constitution.md §11.4.87 (inherited per §11.4.35).</w:t>
+      </w:r>
+    </w:p>
+    <w:p>
+      <w:pPr>
+        <w:pStyle w:val="BodyText"/>
+      </w:pPr>
+      <w:r>
+        <w:rPr>
+          <w:b/>
+          <w:bCs/>
+        </w:rPr>
+        <w:t xml:space="preserve">§11.4.88 — Background-push mandate (Helix, 2026-05-26).</w:t>
+      </w:r>
+      <w:r>
+        <w:t xml:space="preserve"> </w:t>
+      </w:r>
+      <w:r>
+        <w:t xml:space="preserve">Agent-binding rule: every Herald commit flow MUST release the commit-lock (</w:t>
+      </w:r>
+      <w:r>
+        <w:rPr>
+          <w:rStyle w:val="VerbatimChar"/>
+        </w:rPr>
+        <w:t xml:space="preserve">.git/.commit_all.lock</w:t>
+      </w:r>
+      <w:r>
+        <w:t xml:space="preserve">) the instant</w:t>
+      </w:r>
+      <w:r>
+        <w:t xml:space="preserve"> </w:t>
+      </w:r>
+      <w:r>
+        <w:rPr>
+          <w:rStyle w:val="VerbatimChar"/>
+        </w:rPr>
+        <w:t xml:space="preserve">git commit</w:t>
+      </w:r>
+      <w:r>
+        <w:t xml:space="preserve"> </w:t>
+      </w:r>
+      <w:r>
+        <w:t xml:space="preserve">returns 0 — BEFORE any push — then spawn the push</w:t>
+      </w:r>
+      <w:r>
+        <w:t xml:space="preserve"> </w:t>
+      </w:r>
+      <w:r>
+        <w:rPr>
+          <w:b/>
+          <w:bCs/>
+        </w:rPr>
+        <w:t xml:space="preserve">detached</w:t>
+      </w:r>
+      <w:r>
+        <w:t xml:space="preserve"> </w:t>
+      </w:r>
+      <w:r>
+        <w:t xml:space="preserve">(</w:t>
+      </w:r>
+      <w:r>
+        <w:rPr>
+          <w:rStyle w:val="VerbatimChar"/>
+        </w:rPr>
+        <w:t xml:space="preserve">nohup ./push_all.sh ... &amp;</w:t>
+      </w:r>
+      <w:r>
+        <w:t xml:space="preserve"> </w:t>
+      </w:r>
+      <w:r>
+        <w:t xml:space="preserve">+</w:t>
+      </w:r>
+      <w:r>
+        <w:t xml:space="preserve"> </w:t>
+      </w:r>
+      <w:r>
+        <w:rPr>
+          <w:rStyle w:val="VerbatimChar"/>
+        </w:rPr>
+        <w:t xml:space="preserve">disown</w:t>
+      </w:r>
+      <w:r>
+        <w:t xml:space="preserve">) with a per-remote flock (</w:t>
+      </w:r>
+      <w:r>
+        <w:rPr>
+          <w:rStyle w:val="VerbatimChar"/>
+        </w:rPr>
+        <w:t xml:space="preserve">.git/.push.&lt;remote&gt;.lock</w:t>
+      </w:r>
+      <w:r>
+        <w:t xml:space="preserve">) so same-remote pushes serialise while GitHub / GitLab / GitFlic / GitVerse push in parallel. The orchestrator's exit code reports COMMIT success, not push success. Backgrounded push failures land in</w:t>
+      </w:r>
+      <w:r>
+        <w:t xml:space="preserve"> </w:t>
+      </w:r>
+      <w:r>
+        <w:rPr>
+          <w:rStyle w:val="VerbatimChar"/>
+        </w:rPr>
+        <w:t xml:space="preserve">qa-results/push_failures/&lt;TS&gt;_&lt;remote&gt;.log</w:t>
+      </w:r>
+      <w:r>
+        <w:t xml:space="preserve"> </w:t>
+      </w:r>
+      <w:r>
+        <w:t xml:space="preserve">and the next autonomous-loop tick MUST surface them (silent push-failure is a §11.4 distribution-layer PASS-bluff). The ONLY synchronous-push escape is the explicit</w:t>
+      </w:r>
+      <w:r>
+        <w:t xml:space="preserve"> </w:t>
+      </w:r>
+      <w:r>
+        <w:rPr>
+          <w:rStyle w:val="VerbatimChar"/>
+        </w:rPr>
+        <w:t xml:space="preserve">--sync-push</w:t>
+      </w:r>
+      <w:r>
+        <w:t xml:space="preserve"> </w:t>
+      </w:r>
+      <w:r>
+        <w:t xml:space="preserve">flag for §11.4.41 force-push merge-first paths. Canonical authority: HelixConstitution Constitution.md §11.4.88 (inherited per §11.4.35).</w:t>
+      </w:r>
+    </w:p>
+    <w:bookmarkEnd w:id="16"/>
+    <w:bookmarkStart w:id="17" w:name="X494e63fc2991a9d42fefb419b530ac9bef94c53"/>
+    <w:p>
+      <w:pPr>
+        <w:pStyle w:val="Heading3"/>
+      </w:pPr>
+      <w:r>
+        <w:t xml:space="preserve">Inheritance gate (run before any commit that touches root docs or</w:t>
+      </w:r>
+      <w:r>
+        <w:t xml:space="preserve"> </w:t>
+      </w:r>
+      <w:r>
+        <w:rPr>
+          <w:rStyle w:val="VerbatimChar"/>
+        </w:rPr>
+        <w:t xml:space="preserve">constitution/</w:t>
+      </w:r>
+      <w:r>
+        <w:t xml:space="preserve">)</w:t>
+      </w:r>
+    </w:p>
+    <w:p>
+      <w:pPr>
+        <w:pStyle w:val="SourceCode"/>
+      </w:pPr>
+      <w:r>
+        <w:rPr>
+          <w:rStyle w:val="FunctionTok"/>
+        </w:rPr>
+        <w:t xml:space="preserve">bash</w:t>
+      </w:r>
+      <w:r>
+        <w:rPr>
+          <w:rStyle w:val="NormalTok"/>
+        </w:rPr>
+        <w:t xml:space="preserve"> tests/test_constitution_inheritance.sh        </w:t>
+      </w:r>
+      <w:r>
+        <w:rPr>
+          <w:rStyle w:val="CommentTok"/>
+        </w:rPr>
+        <w:t xml:space="preserve"># the gate</w:t>
+      </w:r>
+      <w:r>
+        <w:br/>
+      </w:r>
+      <w:r>
+        <w:rPr>
+          <w:rStyle w:val="FunctionTok"/>
+        </w:rPr>
+        <w:t xml:space="preserve">bash</w:t>
+      </w:r>
+      <w:r>
+        <w:rPr>
+          <w:rStyle w:val="NormalTok"/>
+        </w:rPr>
+        <w:t xml:space="preserve"> tests/test_constitution_inheritance_meta.sh   </w:t>
+      </w:r>
+      <w:r>
+        <w:rPr>
+          <w:rStyle w:val="CommentTok"/>
+        </w:rPr>
+        <w:t xml:space="preserve"># paired mutation proof (§1.1)</w:t>
+      </w:r>
+    </w:p>
+    <w:p>
+      <w:pPr>
+        <w:pStyle w:val="FirstParagraph"/>
+      </w:pPr>
+      <w:r>
+        <w:t xml:space="preserve">Both MUST return 0. If either fails, fix at root cause per Constitution §11.4.4 — never silently accept the FAIL.</w:t>
+      </w:r>
+    </w:p>
+    <w:bookmarkEnd w:id="17"/>
+    <w:bookmarkStart w:id="18" w:name="X32120c2cbf4d615e5864fa1300f097d3beccf79"/>
+    <w:p>
+      <w:pPr>
+        <w:pStyle w:val="Heading3"/>
+      </w:pPr>
+      <w:r>
+        <w:t xml:space="preserve">Spec-change rule (load-bearing —</w:t>
+      </w:r>
+      <w:r>
+        <w:t xml:space="preserve"> </w:t>
+      </w:r>
+      <w:r>
+        <w:rPr>
+          <w:rStyle w:val="VerbatimChar"/>
+        </w:rPr>
+        <w:t xml:space="preserve">docs/specs/mvp/specification.V3.md</w:t>
+      </w:r>
+      <w:r>
+        <w:t xml:space="preserve"> </w:t>
+      </w:r>
+      <w:r>
+        <w:t xml:space="preserve">§"Specification documents")</w:t>
+      </w:r>
+    </w:p>
+    <w:p>
+      <w:pPr>
+        <w:pStyle w:val="FirstParagraph"/>
+      </w:pPr>
+      <w:r>
+        <w:t xml:space="preserve">Whenever</w:t>
+      </w:r>
+      <w:r>
+        <w:t xml:space="preserve"> </w:t>
+      </w:r>
+      <w:r>
+        <w:rPr>
+          <w:rStyle w:val="VerbatimChar"/>
+        </w:rPr>
+        <w:t xml:space="preserve">docs/specs/mvp/specification.V3.md</w:t>
+      </w:r>
+      <w:r>
+        <w:t xml:space="preserve"> </w:t>
+      </w:r>
+      <w:r>
+        <w:t xml:space="preserve">or any file under</w:t>
+      </w:r>
+      <w:r>
+        <w:t xml:space="preserve"> </w:t>
+      </w:r>
+      <w:r>
+        <w:rPr>
+          <w:rStyle w:val="VerbatimChar"/>
+        </w:rPr>
+        <w:t xml:space="preserve">docs/specs/</w:t>
+      </w:r>
+      <w:r>
+        <w:t xml:space="preserve"> </w:t>
+      </w:r>
+      <w:r>
+        <w:t xml:space="preserve">(any depth) is modified,</w:t>
+      </w:r>
+      <w:r>
+        <w:t xml:space="preserve"> </w:t>
+      </w:r>
+      <w:r>
+        <w:rPr>
+          <w:b/>
+          <w:bCs/>
+        </w:rPr>
+        <w:t xml:space="preserve">comprehensive planning and implementation of all changes is MANDATORY</w:t>
+      </w:r>
+      <w:r>
+        <w:t xml:space="preserve"> </w:t>
+      </w:r>
+      <w:r>
+        <w:t xml:space="preserve">— agents may not edit the spec in isolation. This rule does NOT apply to creating or renaming files; for those, ask the operator what to do with the new path. Treat every spec edit as a project-wide ripple, not a doc tweak.</w:t>
+      </w:r>
+    </w:p>
+    <w:p>
+      <w:pPr>
+        <w:pStyle w:val="BodyText"/>
+      </w:pPr>
+      <w:r>
+        <w:t xml:space="preserve">This rule is mirrored in</w:t>
+      </w:r>
+      <w:r>
+        <w:t xml:space="preserve"> </w:t>
+      </w:r>
+      <w:r>
+        <w:rPr>
+          <w:rStyle w:val="VerbatimChar"/>
+        </w:rPr>
+        <w:t xml:space="preserve">CLAUDE.md</w:t>
+      </w:r>
+      <w:r>
+        <w:t xml:space="preserve"> </w:t>
+      </w:r>
+      <w:r>
+        <w:t xml:space="preserve">and in</w:t>
+      </w:r>
+      <w:r>
+        <w:t xml:space="preserve"> </w:t>
+      </w:r>
+      <w:r>
+        <w:rPr>
+          <w:rStyle w:val="VerbatimChar"/>
+        </w:rPr>
+        <w:t xml:space="preserve">docs/guides/HERALD_CONSTITUTION.md</w:t>
+      </w:r>
+      <w:r>
+        <w:t xml:space="preserve"> </w:t>
+      </w:r>
+      <w:r>
+        <w:t xml:space="preserve">§106. The inheritance gate's invariant</w:t>
+      </w:r>
+      <w:r>
+        <w:t xml:space="preserve"> </w:t>
+      </w:r>
+      <w:r>
+        <w:rPr>
+          <w:b/>
+          <w:bCs/>
+        </w:rPr>
         <w:t xml:space="preserve">I7a–c</w:t>
       </w:r>
       <w:r>
@@ -2136,8 +3335,8 @@
         <w:t xml:space="preserve">) is present in all three files; a missing copy is a §1.1 propagation bluff and the gate FAILs.</w:t>
       </w:r>
     </w:p>
-    <w:bookmarkEnd w:id="15"/>
-    <w:bookmarkStart w:id="16" w:name="X6198677d4a246aad02e8f663e73cd694bf6928c"/>
+    <w:bookmarkEnd w:id="18"/>
+    <w:bookmarkStart w:id="19" w:name="X6198677d4a246aad02e8f663e73cd694bf6928c"/>
     <w:p>
       <w:pPr>
         <w:pStyle w:val="Heading3"/>
@@ -2208,8 +3407,8 @@
         <w:t xml:space="preserve">propagates to all four hosts. Per-host naming intentionally matches each provider's brand capitalization; do not normalize.</w:t>
       </w:r>
     </w:p>
-    <w:bookmarkEnd w:id="16"/>
-    <w:bookmarkStart w:id="17" w:name="forbidden-in-this-project"/>
+    <w:bookmarkEnd w:id="19"/>
+    <w:bookmarkStart w:id="20" w:name="forbidden-in-this-project"/>
     <w:p>
       <w:pPr>
         <w:pStyle w:val="Heading3"/>
@@ -2362,9 +3561,9 @@
         <w:t xml:space="preserve">afterward.</w:t>
       </w:r>
     </w:p>
-    <w:bookmarkEnd w:id="17"/>
-    <w:bookmarkEnd w:id="18"/>
-    <w:bookmarkEnd w:id="19"/>
+    <w:bookmarkEnd w:id="20"/>
+    <w:bookmarkEnd w:id="21"/>
+    <w:bookmarkEnd w:id="22"/>
     <w:sectPr>
       <w:footnotePr>
         <w:numRestart w:val="eachSect"/>

</xml_diff>

<commit_message>
docs: workable-items SQLite DB is version-controlled SSoT, NOT gitignored (operator mandate 2026-05-27)
Operator correction: "We should not git ignore our workable items database since it
is our single source of truth regarding items we have to do on the project!". The
docs/.workable_items.db (§11.4.93) is therefore committed + version-controlled — a
deliberate Herald divergence from the parent §11.4.93 gitignored-with-regeneration
default (for Herald the DB IS the authoritative artefact). Only the transient SQLite
WAL/SHM sidecars (.db-wal/.db-shm) stay ignored. .gitignore + the §11.4.93 restatements
in CLAUDE.md/AGENTS.md/HERALD_CONSTITUTION.md corrected; HTML/PDF/DOCX siblings regenerated.

§11.4.92: Pass-1 .gitignore no longer ignores docs/.workable_items.db (grep-confirmed);
Pass-2 inheritance gate unaffected (no covenant anchor touched). Doc-only change.

Co-Authored-By: Claude Opus 4.7 <noreply@anthropic.com>
</commit_message>
<xml_diff>
--- a/AGENTS.docx
+++ b/AGENTS.docx
@@ -3599,7 +3599,23 @@
         <w:t xml:space="preserve">docs/.workable_items.db</w:t>
       </w:r>
       <w:r>
-        <w:t xml:space="preserve">, gitignored with a regeneration mechanism per §11.4.30) with bidirectional MD↔DB regeneration so sync-drift is mechanically impossible. The Go binary lives in the constitution submodule (</w:t>
+        <w:t xml:space="preserve">,</w:t>
+      </w:r>
+      <w:r>
+        <w:t xml:space="preserve"> </w:t>
+      </w:r>
+      <w:r>
+        <w:rPr>
+          <w:b/>
+          <w:bCs/>
+        </w:rPr>
+        <w:t xml:space="preserve">version-controlled as Herald's authoritative SSoT</w:t>
+      </w:r>
+      <w:r>
+        <w:t xml:space="preserve"> </w:t>
+      </w:r>
+      <w:r>
+        <w:t xml:space="preserve">per operator mandate 2026-05-27 — a deliberate Herald divergence from the parent §11.4.93 gitignored-with-regeneration default, since for Herald the DB IS the authoritative artefact and MUST be committed, not regenerated-on-clone; only the transient WAL/SHM sidecars stay ignored) with bidirectional MD↔DB regeneration so sync-drift is mechanically impossible. The Go binary lives in the constitution submodule (</w:t>
       </w:r>
       <w:r>
         <w:rPr>

</xml_diff>

<commit_message>
docs: propagate HelixConstitution §11.4.95-97 into Herald root docs
Constitution pulled 3c9c4e9->15cd4bc. Three new inherited mandates restated + cited (not
redefined) per §11.4.35, matching the §108.a-i pattern: §11.4.95 (workable-items SQLite DB
TRACKED-in-git not gitignored — Herald already complies via the 2026-05-27 operator correction;
canonical path docs/workable_items.db to reconcile at HRD-131 impl), §11.4.96 (safe-parallel-
work-with-long-build catalogue — binds Herald's backgrounded gate/e2e/stress windows), §11.4.97
(maximum-use-of-idle-time + progress-update cadence). CLAUDE.md r13, AGENTS.md r9,
HERALD_CONSTITUTION.md r7 §108.j-l. Inheritance gate 15 PASS/0 FAIL; anchors 11.4.95/96/97
present in all 3; HTML/PDF/DOCX siblings regenerated.

§11.4.92: Pass-1 anchors grep-confirmed; Pass-2 inheritance gate 15/0 (no covenant anchor removed).

Co-Authored-By: Claude Opus 4.7 <noreply@anthropic.com>
</commit_message>
<xml_diff>
--- a/AGENTS.docx
+++ b/AGENTS.docx
@@ -75,7 +75,7 @@
               <w:pStyle w:val="Compact"/>
             </w:pPr>
             <w:r>
-              <w:t xml:space="preserve">8</w:t>
+              <w:t xml:space="preserve">9</w:t>
             </w:r>
           </w:p>
         </w:tc>
@@ -171,7 +171,37 @@
               <w:pStyle w:val="Compact"/>
             </w:pPr>
             <w:r>
-              <w:t xml:space="preserve">r8: propagated HelixConstitution §11.4.89–§11.4.94 (background-test execution, Obsolete status + obsolescence audit, summary-doc clarity, multi-pass change-evaluation, SQLite workable-items SSoT, zero-idle parallel-by-default) into the agent-rule covenant cluster as short-form restatements citing the literal anchors, inherited per §11.4.35; restated + cited, not redefined. Prior r7: propagated HelixConstitution §11.4.85 (stress + chaos test mandate) + §11.4.87 (endless-loop autonomous work + zero-idle agent dispatch + anti-bluff testing) + §11.4.88 (background-push) into the agent-rule covenant cluster as short-form restatements citing the literal section numbers, inherited per §11.4.35; required by the §11.4.87</w:t>
+              <w:t xml:space="preserve">r9: propagated HelixConstitution §11.4.95–§11.4.97 (workable-items SQLite DB tracked-in-git-not-gitignored, safe-parallel-work-with-long-build catalogue + mandate, maximum-use-of-idle-time + progress-update cadence) into the agent-rule covenant cluster as short-form restatements citing the literal anchors</w:t>
+            </w:r>
+            <w:r>
+              <w:t xml:space="preserve"> </w:t>
+            </w:r>
+            <w:r>
+              <w:rPr>
+                <w:rStyle w:val="VerbatimChar"/>
+              </w:rPr>
+              <w:t xml:space="preserve">11.4.95</w:t>
+            </w:r>
+            <w:r>
+              <w:t xml:space="preserve">/</w:t>
+            </w:r>
+            <w:r>
+              <w:rPr>
+                <w:rStyle w:val="VerbatimChar"/>
+              </w:rPr>
+              <w:t xml:space="preserve">11.4.96</w:t>
+            </w:r>
+            <w:r>
+              <w:t xml:space="preserve">/</w:t>
+            </w:r>
+            <w:r>
+              <w:rPr>
+                <w:rStyle w:val="VerbatimChar"/>
+              </w:rPr>
+              <w:t xml:space="preserve">11.4.97</w:t>
+            </w:r>
+            <w:r>
+              <w:t xml:space="preserve">, inherited per §11.4.35; restated + cited, not redefined. Prior r8: propagated HelixConstitution §11.4.89–§11.4.94 (background-test execution, Obsolete status + obsolescence audit, summary-doc clarity, multi-pass change-evaluation, SQLite workable-items SSoT, zero-idle parallel-by-default) into the agent-rule covenant cluster as short-form restatements citing the literal anchors, inherited per §11.4.35; restated + cited, not redefined. Prior r7: propagated HelixConstitution §11.4.85 (stress + chaos test mandate) + §11.4.87 (endless-loop autonomous work + zero-idle agent dispatch + anti-bluff testing) + §11.4.88 (background-push) into the agent-rule covenant cluster as short-form restatements citing the literal section numbers, inherited per §11.4.35; required by the §11.4.87</w:t>
             </w:r>
             <w:r>
               <w:t xml:space="preserve"> </w:t>
@@ -273,7 +303,7 @@
               <w:pStyle w:val="Compact"/>
             </w:pPr>
             <w:r>
-              <w:t xml:space="preserve">R-14 (V2), V3-path-sync (V3 r3), Go-scaffold-status-update (V3 r4), §107 mandate restatement + I8b anchor (r5), Helix §11.4.85 + §11.4.87 + §11.4.88 propagation (r7), Helix §11.4.89–§11.4.94 propagation (r8)</w:t>
+              <w:t xml:space="preserve">R-14 (V2), V3-path-sync (V3 r3), Go-scaffold-status-update (V3 r4), §107 mandate restatement + I8b anchor (r5), Helix §11.4.85 + §11.4.87 + §11.4.88 propagation (r7), Helix §11.4.89–§11.4.94 propagation (r8), Helix §11.4.95–§11.4.97 propagation (r9)</w:t>
             </w:r>
           </w:p>
         </w:tc>
@@ -369,6 +399,36 @@
               <w:t xml:space="preserve">11.4.94</w:t>
             </w:r>
             <w:r>
+              <w:t xml:space="preserve">, inherited per §11.4.35; restated + cited, not redefined; r9 propagates the next three inherited HelixConstitution mandates (§11.4.95 workable-items SQLite DB tracked-in-git-not-gitignored, §11.4.96 safe-parallel-work-with-long-build catalogue + mandate, §11.4.97 maximum-use-of-idle-time + progress-update cadence) into the same agent-rule covenant cluster as short-form restatements citing the literal anchors</w:t>
+            </w:r>
+            <w:r>
+              <w:t xml:space="preserve"> </w:t>
+            </w:r>
+            <w:r>
+              <w:rPr>
+                <w:rStyle w:val="VerbatimChar"/>
+              </w:rPr>
+              <w:t xml:space="preserve">11.4.95</w:t>
+            </w:r>
+            <w:r>
+              <w:t xml:space="preserve">/</w:t>
+            </w:r>
+            <w:r>
+              <w:rPr>
+                <w:rStyle w:val="VerbatimChar"/>
+              </w:rPr>
+              <w:t xml:space="preserve">11.4.96</w:t>
+            </w:r>
+            <w:r>
+              <w:t xml:space="preserve">/</w:t>
+            </w:r>
+            <w:r>
+              <w:rPr>
+                <w:rStyle w:val="VerbatimChar"/>
+              </w:rPr>
+              <w:t xml:space="preserve">11.4.97</w:t>
+            </w:r>
+            <w:r>
               <w:t xml:space="preserve">, inherited per §11.4.35; restated + cited, not redefined.</w:t>
             </w:r>
           </w:p>
@@ -484,12 +544,12 @@
           <w:numId w:val="1002"/>
         </w:numPr>
       </w:pPr>
-      <w:hyperlink w:anchor="Xe024dab9cfa2cd0105ef2472998a9eaa2a1433f">
+      <w:hyperlink w:anchor="X95a9ae37462ce41011832d9dce0489fd9d03855">
         <w:r>
           <w:rPr>
             <w:rStyle w:val="Hyperlink"/>
           </w:rPr>
-          <w:t xml:space="preserve">Inherited covenant restatements — Helix §11.4.85 / §11.4.87 / §11.4.88 / §11.4.89 / §11.4.90 / §11.4.91 / §11.4.92 / §11.4.93 / §11.4.94</w:t>
+          <w:t xml:space="preserve">Inherited covenant restatements — Helix §11.4.85 / §11.4.87 / §11.4.88 / §11.4.89 / §11.4.90 / §11.4.91 / §11.4.92 / §11.4.93 / §11.4.94 / §11.4.95 / §11.4.96 / §11.4.97</w:t>
         </w:r>
       </w:hyperlink>
     </w:p>
@@ -2710,13 +2770,13 @@
       </w:r>
     </w:p>
     <w:bookmarkEnd w:id="15"/>
-    <w:bookmarkStart w:id="16" w:name="Xe024dab9cfa2cd0105ef2472998a9eaa2a1433f"/>
+    <w:bookmarkStart w:id="16" w:name="X95a9ae37462ce41011832d9dce0489fd9d03855"/>
     <w:p>
       <w:pPr>
         <w:pStyle w:val="Heading3"/>
       </w:pPr>
       <w:r>
-        <w:t xml:space="preserve">Inherited covenant restatements — Helix §11.4.85 / §11.4.87 / §11.4.88 / §11.4.89 / §11.4.90 / §11.4.91 / §11.4.92 / §11.4.93 / §11.4.94</w:t>
+        <w:t xml:space="preserve">Inherited covenant restatements — Helix §11.4.85 / §11.4.87 / §11.4.88 / §11.4.89 / §11.4.90 / §11.4.91 / §11.4.92 / §11.4.93 / §11.4.94 / §11.4.95 / §11.4.96 / §11.4.97</w:t>
       </w:r>
     </w:p>
     <w:p>
@@ -2724,7 +2784,7 @@
         <w:pStyle w:val="FirstParagraph"/>
       </w:pPr>
       <w:r>
-        <w:t xml:space="preserve">These nine mandates are</w:t>
+        <w:t xml:space="preserve">These twelve mandates are</w:t>
       </w:r>
       <w:r>
         <w:t xml:space="preserve"> </w:t>
@@ -3643,6 +3703,234 @@
       </w:r>
       <w:r>
         <w:t xml:space="preserve">Agent-binding rule (binding always-on contract): Herald work is NEVER idle while a priority-queued item can progress. Before any wake / sleep / "waiting for X", the agent surveys the priority queue, identifies all non-contending items, and dispatches them in parallel (subagent-driven per §11.4.20 / §11.4.70 when non-trivial; background per §11.4.89 when &gt;30s), picking highest-Severity/priority first. The conductor remains the integration + commit + push seam; parallel work MUST NOT compromise stability (composes with §107.y quiescence + §11.4.92 multi-pass + §12 host-safety). Idle is permitted ONLY when every item is genuinely blocked on external dependency, the operator issued STOP, or §12 host-session-safety demands it. Canonical authority: HelixConstitution Constitution.md §11.4.94 (inherited per §11.4.35).</w:t>
+      </w:r>
+    </w:p>
+    <w:p>
+      <w:pPr>
+        <w:pStyle w:val="BodyText"/>
+      </w:pPr>
+      <w:r>
+        <w:rPr>
+          <w:b/>
+          <w:bCs/>
+        </w:rPr>
+        <w:t xml:space="preserve">§11.4.95 — Workable-items SQLite DB is TRACKED in git, never gitignored (Helix, 2026-05-27).</w:t>
+      </w:r>
+      <w:r>
+        <w:t xml:space="preserve"> </w:t>
+      </w:r>
+      <w:r>
+        <w:t xml:space="preserve">Agent-binding rule: Herald ALREADY complies (operator correction 2026-05-27, recorded in §108.h +</w:t>
+      </w:r>
+      <w:r>
+        <w:t xml:space="preserve"> </w:t>
+      </w:r>
+      <w:r>
+        <w:rPr>
+          <w:rStyle w:val="VerbatimChar"/>
+        </w:rPr>
+        <w:t xml:space="preserve">.gitignore</w:t>
+      </w:r>
+      <w:r>
+        <w:t xml:space="preserve">) — the agent treats the workable-items SQLite DB as version-controlled, commits + pushes it alongside every state change, WAL-checkpoints it (</w:t>
+      </w:r>
+      <w:r>
+        <w:rPr>
+          <w:rStyle w:val="VerbatimChar"/>
+        </w:rPr>
+        <w:t xml:space="preserve">PRAGMA wal_checkpoint(TRUNCATE)</w:t>
+      </w:r>
+      <w:r>
+        <w:t xml:space="preserve">) before commit so only the transient</w:t>
+      </w:r>
+      <w:r>
+        <w:t xml:space="preserve"> </w:t>
+      </w:r>
+      <w:r>
+        <w:rPr>
+          <w:rStyle w:val="VerbatimChar"/>
+        </w:rPr>
+        <w:t xml:space="preserve">-wal</w:t>
+      </w:r>
+      <w:r>
+        <w:t xml:space="preserve">/</w:t>
+      </w:r>
+      <w:r>
+        <w:rPr>
+          <w:rStyle w:val="VerbatimChar"/>
+        </w:rPr>
+        <w:t xml:space="preserve">-shm</w:t>
+      </w:r>
+      <w:r>
+        <w:t xml:space="preserve"> </w:t>
+      </w:r>
+      <w:r>
+        <w:t xml:space="preserve">sidecars stay gitignored, and never force-rewrites it without a §9.2 hardlinked-backup. This is an explicit §11.4.30 carve-out and AMENDS the earlier §11.4.93 / §108.h "gitignored-with-regeneration" text. The agent notes the alignment item: the constitution's canonical path is</w:t>
+      </w:r>
+      <w:r>
+        <w:t xml:space="preserve"> </w:t>
+      </w:r>
+      <w:r>
+        <w:rPr>
+          <w:rStyle w:val="VerbatimChar"/>
+        </w:rPr>
+        <w:t xml:space="preserve">docs/workable_items.db</w:t>
+      </w:r>
+      <w:r>
+        <w:t xml:space="preserve"> </w:t>
+      </w:r>
+      <w:r>
+        <w:t xml:space="preserve">(no leading dot); Herald's HRD-131 currently references</w:t>
+      </w:r>
+      <w:r>
+        <w:t xml:space="preserve"> </w:t>
+      </w:r>
+      <w:r>
+        <w:rPr>
+          <w:rStyle w:val="VerbatimChar"/>
+        </w:rPr>
+        <w:t xml:space="preserve">docs/.workable_items.db</w:t>
+      </w:r>
+      <w:r>
+        <w:t xml:space="preserve"> </w:t>
+      </w:r>
+      <w:r>
+        <w:t xml:space="preserve">— reconcile to the canonical path when the DB is implemented (HRD-131 Phase 2+, currently deferred). Canonical authority: HelixConstitution Constitution.md §11.4.95 (inherited per §11.4.35).</w:t>
+      </w:r>
+    </w:p>
+    <w:p>
+      <w:pPr>
+        <w:pStyle w:val="BodyText"/>
+      </w:pPr>
+      <w:r>
+        <w:rPr>
+          <w:b/>
+          <w:bCs/>
+        </w:rPr>
+        <w:t xml:space="preserve">§11.4.96 — Safe-parallel-work-with-long-build catalogue + mandate (Helix, 2026-05-27).</w:t>
+      </w:r>
+      <w:r>
+        <w:t xml:space="preserve"> </w:t>
+      </w:r>
+      <w:r>
+        <w:t xml:space="preserve">Agent-binding rule: Herald has no AOSP build, but the principle binds — during ANY long-running Herald operation (a backgrounded mutation gate,</w:t>
+      </w:r>
+      <w:r>
+        <w:t xml:space="preserve"> </w:t>
+      </w:r>
+      <w:r>
+        <w:rPr>
+          <w:rStyle w:val="VerbatimChar"/>
+        </w:rPr>
+        <w:t xml:space="preserve">scripts/e2e_bluff_hunt.sh</w:t>
+      </w:r>
+      <w:r>
+        <w:t xml:space="preserve">, a §11.4.85 stress/chaos suite, a doc export) the agent MUST consult the safe-parallel catalogue and dispatch non-contending work rather than idle. SAFE-in-parallel for Herald: (A) MD/docs work, (B)</w:t>
+      </w:r>
+      <w:r>
+        <w:t xml:space="preserve"> </w:t>
+      </w:r>
+      <w:r>
+        <w:rPr>
+          <w:rStyle w:val="VerbatimChar"/>
+        </w:rPr>
+        <w:t xml:space="preserve">scripts/</w:t>
+      </w:r>
+      <w:r>
+        <w:t xml:space="preserve"> </w:t>
+      </w:r>
+      <w:r>
+        <w:t xml:space="preserve">helpers, (C) gate authoring, (D) test authoring, (E/F) commit + push to mirrors, (H) read-only analysis subagents, (I) web research, (J) workable-items DB ops. UNSAFE-during-a-running-gate (maps to §107.y):</w:t>
+      </w:r>
+      <w:r>
+        <w:t xml:space="preserve"> </w:t>
+      </w:r>
+      <w:r>
+        <w:rPr>
+          <w:rStyle w:val="VerbatimChar"/>
+        </w:rPr>
+        <w:t xml:space="preserve">git checkout</w:t>
+      </w:r>
+      <w:r>
+        <w:t xml:space="preserve"> </w:t>
+      </w:r>
+      <w:r>
+        <w:t xml:space="preserve">/</w:t>
+      </w:r>
+      <w:r>
+        <w:t xml:space="preserve"> </w:t>
+      </w:r>
+      <w:r>
+        <w:rPr>
+          <w:rStyle w:val="VerbatimChar"/>
+        </w:rPr>
+        <w:t xml:space="preserve">reset --hard</w:t>
+      </w:r>
+      <w:r>
+        <w:t xml:space="preserve"> </w:t>
+      </w:r>
+      <w:r>
+        <w:t xml:space="preserve">/</w:t>
+      </w:r>
+      <w:r>
+        <w:t xml:space="preserve"> </w:t>
+      </w:r>
+      <w:r>
+        <w:rPr>
+          <w:rStyle w:val="VerbatimChar"/>
+        </w:rPr>
+        <w:t xml:space="preserve">clean</w:t>
+      </w:r>
+      <w:r>
+        <w:t xml:space="preserve"> </w:t>
+      </w:r>
+      <w:r>
+        <w:t xml:space="preserve">on files a gate is transiently mutating, a SECOND concurrent mutation gate against the same checkout, host-session-safety breaches (§12). Subagent-driven default per §11.4.20 / §11.4.70. Canonical authority: HelixConstitution Constitution.md §11.4.96 (inherited per §11.4.35).</w:t>
+      </w:r>
+    </w:p>
+    <w:p>
+      <w:pPr>
+        <w:pStyle w:val="BodyText"/>
+      </w:pPr>
+      <w:r>
+        <w:rPr>
+          <w:b/>
+          <w:bCs/>
+        </w:rPr>
+        <w:t xml:space="preserve">§11.4.97 — Maximum-use-of-idle-time mandate + progress-update cadence (Helix, 2026-05-27).</w:t>
+      </w:r>
+      <w:r>
+        <w:t xml:space="preserve"> </w:t>
+      </w:r>
+      <w:r>
+        <w:t xml:space="preserve">Agent-binding rule: (A) every minute of conductor idle time during which progressable, non-externally-blocked work exists is a violation — the agent dispatches work continuously through the whole idle window, not just at scheduled wakes. (B) The agent emits concise (1–3 line) operator-facing progress updates at milestone boundaries with NO prompt required: every HEAD advance (what landed), every subagent return (integrated), every constitutional anchor propagated, every captured-evidence artefact (</w:t>
+      </w:r>
+      <w:r>
+        <w:rPr>
+          <w:rStyle w:val="VerbatimChar"/>
+        </w:rPr>
+        <w:t xml:space="preserve">docs/qa/</w:t>
+      </w:r>
+      <w:r>
+        <w:t xml:space="preserve"> </w:t>
+      </w:r>
+      <w:r>
+        <w:t xml:space="preserve">/</w:t>
+      </w:r>
+      <w:r>
+        <w:t xml:space="preserve"> </w:t>
+      </w:r>
+      <w:r>
+        <w:rPr>
+          <w:rStyle w:val="VerbatimChar"/>
+        </w:rPr>
+        <w:t xml:space="preserve">qa-results/</w:t>
+      </w:r>
+      <w:r>
+        <w:t xml:space="preserve"> </w:t>
+      </w:r>
+      <w:r>
+        <w:t xml:space="preserve">path), every Issues→Fixed/Obsolete closure. (C) Continuous physical-proof gathering per §11.4.5 / §11.4.6 / §11.4.69 — every closed item carries positive captured evidence committed alongside the closure. (E) Idle ONLY when genuinely blocked (operator STOP, external dependency, §12 host-safety). Canonical authority: HelixConstitution Constitution.md §11.4.97 (inherited per §11.4.35).</w:t>
       </w:r>
     </w:p>
     <w:bookmarkEnd w:id="16"/>

</xml_diff>

<commit_message>
docs(participant-attribution): propagate the mandatory rules into Herald governance + operator guides (§11.4.104 inherited)
Propagates the participant-identity/attribution/tagging mandate (constitution §11.4.104, just landed) into Herald's own docs, in sync with the contract docs/design/PARTICIPANT_ATTRIBUTION.md: CLAUDE.md r16→r17 + AGENTS.md r12→r13 + QWEN.md short-form restatements (the inherited-covenant pattern); HERALD_CONSTITUTION.md r10→r11 new §109 (env var + attribution rules + tagging matrix tables); WORKABLE_ITEMS_INTEGRATION.md §3.6-3.8 (created_by/assigned_to + operator env + per-messenger username mapping + tagging); MESSENGER_CHANNELS.md §6A; OPERATOR_CREDENTIALS.md (HERALD_TGRAM_OPERATOR_USERNAME row); INTEGRATION.md §5 + README doc-links; + the contract doc's HTML/PDF/DOCX siblings. Docs-only; siblings regenerated. From a worktree stream.

Co-Authored-By: Claude Opus 4.8 <noreply@anthropic.com>
</commit_message>
<xml_diff>
--- a/AGENTS.docx
+++ b/AGENTS.docx
@@ -10,7 +10,7 @@
         <w:t xml:space="preserve">Herald</w:t>
       </w:r>
     </w:p>
-    <w:bookmarkStart w:id="22" w:name="herald--agentsmd"/>
+    <w:bookmarkStart w:id="24" w:name="herald--agentsmd"/>
     <w:p>
       <w:pPr>
         <w:pStyle w:val="Heading1"/>
@@ -75,7 +75,7 @@
               <w:pStyle w:val="Compact"/>
             </w:pPr>
             <w:r>
-              <w:t xml:space="preserve">12</w:t>
+              <w:t xml:space="preserve">13</w:t>
             </w:r>
           </w:p>
         </w:tc>
@@ -123,7 +123,7 @@
               <w:pStyle w:val="Compact"/>
             </w:pPr>
             <w:r>
-              <w:t xml:space="preserve">2026-05-29</w:t>
+              <w:t xml:space="preserve">2026-05-31</w:t>
             </w:r>
           </w:p>
         </w:tc>
@@ -171,7 +171,88 @@
               <w:pStyle w:val="Compact"/>
             </w:pPr>
             <w:r>
-              <w:t xml:space="preserve">r12: propagated HelixConstitution §11.4.100 (Video color + visual-quality fidelity mandate, 2026-05-28) into the agent-rule covenant cluster as a short-form restatement citing the literal anchor</w:t>
+              <w:t xml:space="preserve">r13: propagated the participant/attribution/tagging mandate (operator 2026-05-31) into the agent-rule cluster as a short-form restatement — new "Participant identity, attribution &amp; notification-tagging" section + ToC entry — citing the authoritative contract</w:t>
+            </w:r>
+            <w:r>
+              <w:t xml:space="preserve"> </w:t>
+            </w:r>
+            <w:r>
+              <w:rPr>
+                <w:rStyle w:val="VerbatimChar"/>
+              </w:rPr>
+              <w:t xml:space="preserve">docs/design/PARTICIPANT_ATTRIBUTION.md</w:t>
+            </w:r>
+            <w:r>
+              <w:t xml:space="preserve"> </w:t>
+            </w:r>
+            <w:r>
+              <w:t xml:space="preserve">and noting inheritance from HelixConstitution per §11.4.35. Covers per-messenger Participant identity (</w:t>
+            </w:r>
+            <w:r>
+              <w:rPr>
+                <w:rStyle w:val="VerbatimChar"/>
+              </w:rPr>
+              <w:t xml:space="preserve">subscribers</w:t>
+            </w:r>
+            <w:r>
+              <w:t xml:space="preserve">/</w:t>
+            </w:r>
+            <w:r>
+              <w:rPr>
+                <w:rStyle w:val="VerbatimChar"/>
+              </w:rPr>
+              <w:t xml:space="preserve">subscriber_aliases.username</w:t>
+            </w:r>
+            <w:r>
+              <w:t xml:space="preserve">), the</w:t>
+            </w:r>
+            <w:r>
+              <w:t xml:space="preserve"> </w:t>
+            </w:r>
+            <w:r>
+              <w:rPr>
+                <w:rStyle w:val="VerbatimChar"/>
+              </w:rPr>
+              <w:t xml:space="preserve">HERALD_&lt;CHANNEL&gt;_OPERATOR_USERNAME</w:t>
+            </w:r>
+            <w:r>
+              <w:t xml:space="preserve"> </w:t>
+            </w:r>
+            <w:r>
+              <w:t xml:space="preserve">operator env var (</w:t>
+            </w:r>
+            <w:r>
+              <w:rPr>
+                <w:rStyle w:val="VerbatimChar"/>
+              </w:rPr>
+              <w:t xml:space="preserve">HERALD_TGRAM_OPERATOR_USERNAME=@milos85vasic</w:t>
+            </w:r>
+            <w:r>
+              <w:t xml:space="preserve">),</w:t>
+            </w:r>
+            <w:r>
+              <w:t xml:space="preserve"> </w:t>
+            </w:r>
+            <w:r>
+              <w:rPr>
+                <w:rStyle w:val="VerbatimChar"/>
+              </w:rPr>
+              <w:t xml:space="preserve">created_by</w:t>
+            </w:r>
+            <w:r>
+              <w:t xml:space="preserve">/</w:t>
+            </w:r>
+            <w:r>
+              <w:rPr>
+                <w:rStyle w:val="VerbatimChar"/>
+              </w:rPr>
+              <w:t xml:space="preserve">assigned_to</w:t>
+            </w:r>
+            <w:r>
+              <w:t xml:space="preserve"> </w:t>
+            </w:r>
+            <w:r>
+              <w:t xml:space="preserve">attribution, and the @-tagging matrix (Claude + Operator never tagged). Restated + cited, not redefined. Prior r12: propagated HelixConstitution §11.4.100 (Video color + visual-quality fidelity mandate, 2026-05-28) into the agent-rule covenant cluster as a short-form restatement citing the literal anchor</w:t>
             </w:r>
             <w:r>
               <w:t xml:space="preserve"> </w:t>
@@ -592,6 +673,41 @@
             <w:rStyle w:val="Hyperlink"/>
           </w:rPr>
           <w:t xml:space="preserve">Inherited covenant restatements — Helix §11.4.85 / §11.4.87 / §11.4.88 / §11.4.89 / §11.4.90 / §11.4.91 / §11.4.92 / §11.4.93 / §11.4.94 / §11.4.95 / §11.4.96 / §11.4.97 / §11.4.98 / §11.4.99</w:t>
+        </w:r>
+      </w:hyperlink>
+    </w:p>
+    <w:p>
+      <w:pPr>
+        <w:pStyle w:val="Compact"/>
+        <w:numPr>
+          <w:ilvl w:val="1"/>
+          <w:numId w:val="1002"/>
+        </w:numPr>
+      </w:pPr>
+      <w:hyperlink w:anchor="X4a9f5e04c22e47e682434255692b8db0b019d4d">
+        <w:r>
+          <w:rPr>
+            <w:rStyle w:val="Hyperlink"/>
+          </w:rPr>
+          <w:t xml:space="preserve">Participant identity, attribution &amp; notification-tagging (Herald §109 / contract</w:t>
+        </w:r>
+        <w:r>
+          <w:rPr>
+            <w:rStyle w:val="Hyperlink"/>
+          </w:rPr>
+          <w:t xml:space="preserve"> </w:t>
+        </w:r>
+        <w:r>
+          <w:rPr>
+            <w:rStyle w:val="VerbatimChar"/>
+          </w:rPr>
+          <w:t xml:space="preserve">docs/design/PARTICIPANT_ATTRIBUTION.md</w:t>
+        </w:r>
+        <w:r>
+          <w:rPr>
+            <w:rStyle w:val="Hyperlink"/>
+          </w:rPr>
+          <w:t xml:space="preserve">)</w:t>
         </w:r>
       </w:hyperlink>
     </w:p>
@@ -1180,7 +1296,7 @@
       </w:r>
     </w:p>
     <w:bookmarkEnd w:id="11"/>
-    <w:bookmarkStart w:id="21" w:name="herald-specific-agent-rules"/>
+    <w:bookmarkStart w:id="23" w:name="herald-specific-agent-rules"/>
     <w:p>
       <w:pPr>
         <w:pStyle w:val="Heading2"/>
@@ -4356,194 +4472,46 @@
       </w:r>
     </w:p>
     <w:bookmarkEnd w:id="16"/>
-    <w:bookmarkStart w:id="17" w:name="X494e63fc2991a9d42fefb419b530ac9bef94c53"/>
+    <w:bookmarkStart w:id="18" w:name="X4a9f5e04c22e47e682434255692b8db0b019d4d"/>
     <w:p>
       <w:pPr>
         <w:pStyle w:val="Heading3"/>
       </w:pPr>
       <w:r>
-        <w:t xml:space="preserve">Inheritance gate (run before any commit that touches root docs or</w:t>
-      </w:r>
-      <w:r>
-        <w:t xml:space="preserve"> </w:t>
-      </w:r>
-      <w:r>
-        <w:rPr>
-          <w:rStyle w:val="VerbatimChar"/>
-        </w:rPr>
-        <w:t xml:space="preserve">constitution/</w:t>
-      </w:r>
-      <w:r>
-        <w:t xml:space="preserve">)</w:t>
-      </w:r>
-    </w:p>
-    <w:p>
-      <w:pPr>
-        <w:pStyle w:val="SourceCode"/>
-      </w:pPr>
-      <w:r>
-        <w:rPr>
-          <w:rStyle w:val="FunctionTok"/>
-        </w:rPr>
-        <w:t xml:space="preserve">bash</w:t>
-      </w:r>
-      <w:r>
-        <w:rPr>
-          <w:rStyle w:val="NormalTok"/>
-        </w:rPr>
-        <w:t xml:space="preserve"> tests/test_constitution_inheritance.sh        </w:t>
-      </w:r>
-      <w:r>
-        <w:rPr>
-          <w:rStyle w:val="CommentTok"/>
-        </w:rPr>
-        <w:t xml:space="preserve"># the gate</w:t>
-      </w:r>
-      <w:r>
-        <w:br/>
-      </w:r>
-      <w:r>
-        <w:rPr>
-          <w:rStyle w:val="FunctionTok"/>
-        </w:rPr>
-        <w:t xml:space="preserve">bash</w:t>
-      </w:r>
-      <w:r>
-        <w:rPr>
-          <w:rStyle w:val="NormalTok"/>
-        </w:rPr>
-        <w:t xml:space="preserve"> tests/test_constitution_inheritance_meta.sh   </w:t>
-      </w:r>
-      <w:r>
-        <w:rPr>
-          <w:rStyle w:val="CommentTok"/>
-        </w:rPr>
-        <w:t xml:space="preserve"># paired mutation proof (§1.1)</w:t>
+        <w:t xml:space="preserve">Participant identity, attribution &amp; notification-tagging (Herald §109 / contract</w:t>
+      </w:r>
+      <w:r>
+        <w:t xml:space="preserve"> </w:t>
+      </w:r>
+      <w:r>
+        <w:rPr>
+          <w:rStyle w:val="VerbatimChar"/>
+        </w:rPr>
+        <w:t xml:space="preserve">docs/design/PARTICIPANT_ATTRIBUTION.md</w:t>
+      </w:r>
+      <w:r>
+        <w:t xml:space="preserve"> </w:t>
+      </w:r>
+      <w:r>
+        <w:t xml:space="preserve">— inherited per §11.4.35)</w:t>
       </w:r>
     </w:p>
     <w:p>
       <w:pPr>
         <w:pStyle w:val="FirstParagraph"/>
       </w:pPr>
-      <w:r>
-        <w:t xml:space="preserve">Both MUST return 0. If either fails, fix at root cause per Constitution §11.4.4 — never silently accept the FAIL.</w:t>
-      </w:r>
-    </w:p>
-    <w:bookmarkEnd w:id="17"/>
-    <w:bookmarkStart w:id="18" w:name="X32120c2cbf4d615e5864fa1300f097d3beccf79"/>
-    <w:p>
-      <w:pPr>
-        <w:pStyle w:val="Heading3"/>
-      </w:pPr>
-      <w:r>
-        <w:t xml:space="preserve">Spec-change rule (load-bearing —</w:t>
-      </w:r>
-      <w:r>
-        <w:t xml:space="preserve"> </w:t>
-      </w:r>
-      <w:r>
-        <w:rPr>
-          <w:rStyle w:val="VerbatimChar"/>
-        </w:rPr>
-        <w:t xml:space="preserve">docs/specs/mvp/specification.V3.md</w:t>
-      </w:r>
-      <w:r>
-        <w:t xml:space="preserve"> </w:t>
-      </w:r>
-      <w:r>
-        <w:t xml:space="preserve">§"Specification documents")</w:t>
-      </w:r>
-    </w:p>
-    <w:p>
-      <w:pPr>
-        <w:pStyle w:val="FirstParagraph"/>
-      </w:pPr>
-      <w:r>
-        <w:t xml:space="preserve">Whenever</w:t>
-      </w:r>
-      <w:r>
-        <w:t xml:space="preserve"> </w:t>
-      </w:r>
-      <w:r>
-        <w:rPr>
-          <w:rStyle w:val="VerbatimChar"/>
-        </w:rPr>
-        <w:t xml:space="preserve">docs/specs/mvp/specification.V3.md</w:t>
-      </w:r>
-      <w:r>
-        <w:t xml:space="preserve"> </w:t>
-      </w:r>
-      <w:r>
-        <w:t xml:space="preserve">or any file under</w:t>
-      </w:r>
-      <w:r>
-        <w:t xml:space="preserve"> </w:t>
-      </w:r>
-      <w:r>
-        <w:rPr>
-          <w:rStyle w:val="VerbatimChar"/>
-        </w:rPr>
-        <w:t xml:space="preserve">docs/specs/</w:t>
-      </w:r>
-      <w:r>
-        <w:t xml:space="preserve"> </w:t>
-      </w:r>
-      <w:r>
-        <w:t xml:space="preserve">(any depth) is modified,</w:t>
-      </w:r>
-      <w:r>
-        <w:t xml:space="preserve"> </w:t>
-      </w:r>
       <w:r>
         <w:rPr>
           <w:b/>
           <w:bCs/>
         </w:rPr>
-        <w:t xml:space="preserve">comprehensive planning and implementation of all changes is MANDATORY</w:t>
-      </w:r>
-      <w:r>
-        <w:t xml:space="preserve"> </w:t>
-      </w:r>
-      <w:r>
-        <w:t xml:space="preserve">— agents may not edit the spec in isolation. This rule does NOT apply to creating or renaming files; for those, ask the operator what to do with the new path. Treat every spec edit as a project-wide ripple, not a doc tweak.</w:t>
-      </w:r>
-    </w:p>
-    <w:p>
-      <w:pPr>
-        <w:pStyle w:val="BodyText"/>
-      </w:pPr>
-      <w:r>
-        <w:t xml:space="preserve">This rule is mirrored in</w:t>
-      </w:r>
-      <w:r>
-        <w:t xml:space="preserve"> </w:t>
-      </w:r>
-      <w:r>
-        <w:rPr>
-          <w:rStyle w:val="VerbatimChar"/>
-        </w:rPr>
-        <w:t xml:space="preserve">CLAUDE.md</w:t>
-      </w:r>
-      <w:r>
-        <w:t xml:space="preserve"> </w:t>
-      </w:r>
-      <w:r>
-        <w:t xml:space="preserve">and in</w:t>
-      </w:r>
-      <w:r>
-        <w:t xml:space="preserve"> </w:t>
-      </w:r>
-      <w:r>
-        <w:rPr>
-          <w:rStyle w:val="VerbatimChar"/>
-        </w:rPr>
-        <w:t xml:space="preserve">docs/guides/HERALD_CONSTITUTION.md</w:t>
-      </w:r>
-      <w:r>
-        <w:t xml:space="preserve"> </w:t>
-      </w:r>
-      <w:r>
-        <w:t xml:space="preserve">§106. The inheritance gate's invariant</w:t>
+        <w:t xml:space="preserve">Agent-binding rule (operator mandate, 2026-05-31).</w:t>
+      </w:r>
+      <w:r>
+        <w:t xml:space="preserve"> </w:t>
+      </w:r>
+      <w:r>
+        <w:t xml:space="preserve">Every messenger must relate each message to a</w:t>
       </w:r>
       <w:r>
         <w:t xml:space="preserve"> </w:t>
@@ -4553,104 +4521,146 @@
           <w:b/>
           <w:bCs/>
         </w:rPr>
-        <w:t xml:space="preserve">I7a–c</w:t>
-      </w:r>
-      <w:r>
-        <w:t xml:space="preserve"> </w:t>
-      </w:r>
-      <w:r>
-        <w:t xml:space="preserve">asserts the rule anchor (</w:t>
-      </w:r>
-      <w:r>
-        <w:rPr>
-          <w:rStyle w:val="VerbatimChar"/>
-        </w:rPr>
-        <w:t xml:space="preserve">comprehensive planning and implementation</w:t>
-      </w:r>
-      <w:r>
-        <w:t xml:space="preserve">) is present in all three files; a missing copy is a §1.1 propagation bluff and the gate FAILs.</w:t>
-      </w:r>
-    </w:p>
-    <w:bookmarkEnd w:id="18"/>
-    <w:bookmarkStart w:id="19" w:name="X6198677d4a246aad02e8f663e73cd694bf6928c"/>
-    <w:p>
-      <w:pPr>
-        <w:pStyle w:val="Heading3"/>
-      </w:pPr>
-      <w:r>
-        <w:t xml:space="preserve">Multi-host mirror convention (Herald's own upstreams)</w:t>
-      </w:r>
-    </w:p>
-    <w:p>
-      <w:pPr>
-        <w:pStyle w:val="FirstParagraph"/>
-      </w:pPr>
-      <w:r>
-        <w:rPr>
-          <w:rStyle w:val="VerbatimChar"/>
-        </w:rPr>
-        <w:t xml:space="preserve">upstreams/</w:t>
-      </w:r>
-      <w:r>
-        <w:t xml:space="preserve"> </w:t>
-      </w:r>
-      <w:r>
-        <w:t xml:space="preserve">contains one script per mirror host (GitHub, GitLab, GitFlic, GitVerse). Each script exports</w:t>
-      </w:r>
-      <w:r>
-        <w:t xml:space="preserve"> </w:t>
-      </w:r>
-      <w:r>
-        <w:rPr>
-          <w:rStyle w:val="VerbatimChar"/>
-        </w:rPr>
-        <w:t xml:space="preserve">UPSTREAMABLE_REPOSITORY</w:t>
-      </w:r>
-      <w:r>
-        <w:t xml:space="preserve"> </w:t>
-      </w:r>
-      <w:r>
-        <w:t xml:space="preserve">and is sourced, not executed. The Herald repo's</w:t>
-      </w:r>
-      <w:r>
-        <w:t xml:space="preserve"> </w:t>
-      </w:r>
-      <w:r>
-        <w:rPr>
-          <w:rStyle w:val="VerbatimChar"/>
-        </w:rPr>
-        <w:t xml:space="preserve">origin</w:t>
-      </w:r>
-      <w:r>
-        <w:t xml:space="preserve"> </w:t>
-      </w:r>
-      <w:r>
-        <w:t xml:space="preserve">remote is already fan-out (1 fetch URL + 4 push URLs) — a single</w:t>
-      </w:r>
-      <w:r>
-        <w:t xml:space="preserve"> </w:t>
-      </w:r>
-      <w:r>
-        <w:rPr>
-          <w:rStyle w:val="VerbatimChar"/>
-        </w:rPr>
-        <w:t xml:space="preserve">git push origin &lt;branch&gt;</w:t>
-      </w:r>
-      <w:r>
-        <w:t xml:space="preserve"> </w:t>
-      </w:r>
-      <w:r>
-        <w:t xml:space="preserve">propagates to all four hosts. Per-host naming intentionally matches each provider's brand capitalization; do not normalize.</w:t>
-      </w:r>
-    </w:p>
-    <w:bookmarkEnd w:id="19"/>
-    <w:bookmarkStart w:id="20" w:name="forbidden-in-this-project"/>
-    <w:p>
-      <w:pPr>
-        <w:pStyle w:val="Heading3"/>
-      </w:pPr>
-      <w:r>
-        <w:t xml:space="preserve">Forbidden in this project</w:t>
+        <w:t xml:space="preserve">Participant</w:t>
+      </w:r>
+      <w:r>
+        <w:t xml:space="preserve"> </w:t>
+      </w:r>
+      <w:r>
+        <w:t xml:space="preserve">(a logical Subscriber/User — one person/agent, with a potentially DIFFERENT username on every messenger); workable items gain</w:t>
+      </w:r>
+      <w:r>
+        <w:t xml:space="preserve"> </w:t>
+      </w:r>
+      <w:r>
+        <w:rPr>
+          <w:rStyle w:val="VerbatimChar"/>
+        </w:rPr>
+        <w:t xml:space="preserve">created_by</w:t>
+      </w:r>
+      <w:r>
+        <w:t xml:space="preserve"> </w:t>
+      </w:r>
+      <w:r>
+        <w:t xml:space="preserve">+</w:t>
+      </w:r>
+      <w:r>
+        <w:t xml:space="preserve"> </w:t>
+      </w:r>
+      <w:r>
+        <w:rPr>
+          <w:rStyle w:val="VerbatimChar"/>
+        </w:rPr>
+        <w:t xml:space="preserve">assigned_to</w:t>
+      </w:r>
+      <w:r>
+        <w:t xml:space="preserve">; outbound notifications</w:t>
+      </w:r>
+      <w:r>
+        <w:t xml:space="preserve"> </w:t>
+      </w:r>
+      <w:r>
+        <w:rPr>
+          <w:b/>
+          <w:bCs/>
+        </w:rPr>
+        <w:t xml:space="preserve">@-tag</w:t>
+      </w:r>
+      <w:r>
+        <w:t xml:space="preserve"> </w:t>
+      </w:r>
+      <w:r>
+        <w:t xml:space="preserve">the right participant per a fixed rule matrix. The</w:t>
+      </w:r>
+      <w:r>
+        <w:t xml:space="preserve"> </w:t>
+      </w:r>
+      <w:r>
+        <w:rPr>
+          <w:b/>
+          <w:bCs/>
+        </w:rPr>
+        <w:t xml:space="preserve">single authoritative contract</w:t>
+      </w:r>
+      <w:r>
+        <w:t xml:space="preserve"> </w:t>
+      </w:r>
+      <w:r>
+        <w:t xml:space="preserve">every agent codes against is</w:t>
+      </w:r>
+      <w:r>
+        <w:t xml:space="preserve"> </w:t>
+      </w:r>
+      <w:hyperlink r:id="rId17">
+        <w:r>
+          <w:rPr>
+            <w:rStyle w:val="VerbatimChar"/>
+          </w:rPr>
+          <w:t xml:space="preserve">docs/design/PARTICIPANT_ATTRIBUTION.md</w:t>
+        </w:r>
+      </w:hyperlink>
+      <w:r>
+        <w:t xml:space="preserve">. These rules are restated (root definitions) in HelixConstitution</w:t>
+      </w:r>
+      <w:r>
+        <w:t xml:space="preserve"> </w:t>
+      </w:r>
+      <w:r>
+        <w:rPr>
+          <w:rStyle w:val="VerbatimChar"/>
+        </w:rPr>
+        <w:t xml:space="preserve">Constitution.md</w:t>
+      </w:r>
+      <w:r>
+        <w:t xml:space="preserve"> </w:t>
+      </w:r>
+      <w:r>
+        <w:t xml:space="preserve">/</w:t>
+      </w:r>
+      <w:r>
+        <w:t xml:space="preserve"> </w:t>
+      </w:r>
+      <w:r>
+        <w:rPr>
+          <w:rStyle w:val="VerbatimChar"/>
+        </w:rPr>
+        <w:t xml:space="preserve">CLAUDE.md</w:t>
+      </w:r>
+      <w:r>
+        <w:t xml:space="preserve"> </w:t>
+      </w:r>
+      <w:r>
+        <w:t xml:space="preserve">/</w:t>
+      </w:r>
+      <w:r>
+        <w:t xml:space="preserve"> </w:t>
+      </w:r>
+      <w:r>
+        <w:rPr>
+          <w:rStyle w:val="VerbatimChar"/>
+        </w:rPr>
+        <w:t xml:space="preserve">AGENTS.md</w:t>
+      </w:r>
+      <w:r>
+        <w:t xml:space="preserve"> </w:t>
+      </w:r>
+      <w:r>
+        <w:t xml:space="preserve">/</w:t>
+      </w:r>
+      <w:r>
+        <w:t xml:space="preserve"> </w:t>
+      </w:r>
+      <w:r>
+        <w:rPr>
+          <w:rStyle w:val="VerbatimChar"/>
+        </w:rPr>
+        <w:t xml:space="preserve">QWEN.md</w:t>
+      </w:r>
+      <w:r>
+        <w:t xml:space="preserve"> </w:t>
+      </w:r>
+      <w:r>
+        <w:t xml:space="preserve">and inherited here per §11.4.35 — the agent restates + cites, never redefines or weakens.</w:t>
       </w:r>
     </w:p>
     <w:p>
@@ -4666,69 +4676,254 @@
           <w:b/>
           <w:bCs/>
         </w:rPr>
-        <w:t xml:space="preserve">Re-adding a</w:t>
+        <w:t xml:space="preserve">Identity model.</w:t>
+      </w:r>
+      <w:r>
+        <w:t xml:space="preserve"> </w:t>
+      </w:r>
+      <w:r>
+        <w:t xml:space="preserve">Backed by PG</w:t>
+      </w:r>
+      <w:r>
+        <w:t xml:space="preserve"> </w:t>
+      </w:r>
+      <w:r>
+        <w:rPr>
+          <w:rStyle w:val="VerbatimChar"/>
+        </w:rPr>
+        <w:t xml:space="preserve">subscribers</w:t>
+      </w:r>
+      <w:r>
+        <w:t xml:space="preserve"> </w:t>
+      </w:r>
+      <w:r>
+        <w:t xml:space="preserve">(logical party: canonical messenger-neutral</w:t>
+      </w:r>
+      <w:r>
+        <w:t xml:space="preserve"> </w:t>
+      </w:r>
+      <w:r>
+        <w:rPr>
+          <w:rStyle w:val="VerbatimChar"/>
+        </w:rPr>
+        <w:t xml:space="preserve">handle</w:t>
+      </w:r>
+      <w:r>
+        <w:t xml:space="preserve">,</w:t>
+      </w:r>
+      <w:r>
+        <w:t xml:space="preserve"> </w:t>
+      </w:r>
+      <w:r>
+        <w:rPr>
+          <w:rStyle w:val="VerbatimChar"/>
+        </w:rPr>
+        <w:t xml:space="preserve">display_name</w:t>
+      </w:r>
+      <w:r>
+        <w:t xml:space="preserve">,</w:t>
+      </w:r>
+      <w:r>
+        <w:t xml:space="preserve"> </w:t>
+      </w:r>
+      <w:r>
+        <w:rPr>
+          <w:rStyle w:val="VerbatimChar"/>
+        </w:rPr>
+        <w:t xml:space="preserve">kind ∈ {human, agent, service}</w:t>
+      </w:r>
+      <w:r>
+        <w:t xml:space="preserve">) +</w:t>
+      </w:r>
+      <w:r>
+        <w:t xml:space="preserve"> </w:t>
+      </w:r>
+      <w:r>
+        <w:rPr>
+          <w:rStyle w:val="VerbatimChar"/>
+        </w:rPr>
+        <w:t xml:space="preserve">subscriber_aliases</w:t>
+      </w:r>
+      <w:r>
+        <w:t xml:space="preserve"> </w:t>
+      </w:r>
+      <w:r>
+        <w:t xml:space="preserve">(per-channel</w:t>
+      </w:r>
+      <w:r>
+        <w:t xml:space="preserve"> </w:t>
+      </w:r>
+      <w:r>
+        <w:rPr>
+          <w:rStyle w:val="VerbatimChar"/>
+        </w:rPr>
+        <w:t xml:space="preserve">subscriber_id</w:t>
+      </w:r>
+      <w:r>
+        <w:t xml:space="preserve">,</w:t>
+      </w:r>
+      <w:r>
+        <w:t xml:space="preserve"> </w:t>
+      </w:r>
+      <w:r>
+        <w:rPr>
+          <w:rStyle w:val="VerbatimChar"/>
+        </w:rPr>
+        <w:t xml:space="preserve">channel</w:t>
+      </w:r>
+      <w:r>
+        <w:t xml:space="preserve">,</w:t>
+      </w:r>
+      <w:r>
+        <w:t xml:space="preserve"> </w:t>
+      </w:r>
+      <w:r>
+        <w:rPr>
+          <w:rStyle w:val="VerbatimChar"/>
+        </w:rPr>
+        <w:t xml:space="preserve">channel_user_id</w:t>
+      </w:r>
+      <w:r>
+        <w:t xml:space="preserve">,</w:t>
+      </w:r>
+      <w:r>
+        <w:t xml:space="preserve"> </w:t>
       </w:r>
       <w:r>
         <w:rPr>
           <w:b/>
           <w:bCs/>
         </w:rPr>
-        <w:t xml:space="preserve"> </w:t>
-      </w:r>
-      <w:r>
-        <w:rPr>
-          <w:rStyle w:val="VerbatimChar"/>
+        <w:t xml:space="preserve">+ NEW</w:t>
+      </w:r>
+      <w:r>
+        <w:rPr>
           <w:b/>
           <w:bCs/>
         </w:rPr>
-        <w:t xml:space="preserve">constitution/</w:t>
-      </w:r>
-      <w:r>
-        <w:rPr>
+        <w:t xml:space="preserve"> </w:t>
+      </w:r>
+      <w:r>
+        <w:rPr>
+          <w:rStyle w:val="VerbatimChar"/>
           <w:b/>
           <w:bCs/>
         </w:rPr>
-        <w:t xml:space="preserve"> </w:t>
-      </w:r>
-      <w:r>
-        <w:rPr>
-          <w:b/>
-          <w:bCs/>
-        </w:rPr>
-        <w:t xml:space="preserve">submodule inside Herald.</w:t>
-      </w:r>
-      <w:r>
-        <w:t xml:space="preserve"> </w:t>
-      </w:r>
-      <w:r>
-        <w:t xml:space="preserve">Herald is consumed as a submodule of a parent project that already provides</w:t>
-      </w:r>
-      <w:r>
-        <w:t xml:space="preserve"> </w:t>
-      </w:r>
-      <w:r>
-        <w:rPr>
-          <w:rStyle w:val="VerbatimChar"/>
-        </w:rPr>
-        <w:t xml:space="preserve">constitution/</w:t>
-      </w:r>
-      <w:r>
-        <w:t xml:space="preserve">. A duplicate copy inside Herald is a deployment-model violation. The inheritance gate's invariant</w:t>
-      </w:r>
-      <w:r>
-        <w:t xml:space="preserve"> </w:t>
-      </w:r>
-      <w:r>
-        <w:rPr>
-          <w:rStyle w:val="VerbatimChar"/>
-        </w:rPr>
-        <w:t xml:space="preserve">I6</w:t>
-      </w:r>
-      <w:r>
-        <w:t xml:space="preserve"> </w:t>
-      </w:r>
-      <w:r>
-        <w:t xml:space="preserve">enforces this — re-adding it will turn the gate red.</w:t>
+        <w:t xml:space="preserve">username TEXT</w:t>
+      </w:r>
+      <w:r>
+        <w:t xml:space="preserve"> </w:t>
+      </w:r>
+      <w:r>
+        <w:t xml:space="preserve">— the per-channel</w:t>
+      </w:r>
+      <w:r>
+        <w:t xml:space="preserve"> </w:t>
+      </w:r>
+      <w:r>
+        <w:rPr>
+          <w:rStyle w:val="VerbatimChar"/>
+        </w:rPr>
+        <w:t xml:space="preserve">@handle</w:t>
+      </w:r>
+      <w:r>
+        <w:t xml:space="preserve"> </w:t>
+      </w:r>
+      <w:r>
+        <w:t xml:space="preserve">for tagging, distinct from</w:t>
+      </w:r>
+      <w:r>
+        <w:t xml:space="preserve"> </w:t>
+      </w:r>
+      <w:r>
+        <w:rPr>
+          <w:rStyle w:val="VerbatimChar"/>
+        </w:rPr>
+        <w:t xml:space="preserve">channel_user_id</w:t>
+      </w:r>
+      <w:r>
+        <w:t xml:space="preserve">). Canonical handle (stored in</w:t>
+      </w:r>
+      <w:r>
+        <w:t xml:space="preserve"> </w:t>
+      </w:r>
+      <w:r>
+        <w:rPr>
+          <w:rStyle w:val="VerbatimChar"/>
+        </w:rPr>
+        <w:t xml:space="preserve">created_by</w:t>
+      </w:r>
+      <w:r>
+        <w:t xml:space="preserve">/</w:t>
+      </w:r>
+      <w:r>
+        <w:rPr>
+          <w:rStyle w:val="VerbatimChar"/>
+        </w:rPr>
+        <w:t xml:space="preserve">assigned_to</w:t>
+      </w:r>
+      <w:r>
+        <w:t xml:space="preserve">) ∈ {</w:t>
+      </w:r>
+      <w:r>
+        <w:rPr>
+          <w:rStyle w:val="VerbatimChar"/>
+        </w:rPr>
+        <w:t xml:space="preserve">Claude</w:t>
+      </w:r>
+      <w:r>
+        <w:t xml:space="preserve"> </w:t>
+      </w:r>
+      <w:r>
+        <w:t xml:space="preserve">(reserved system-agent sentinel,</w:t>
+      </w:r>
+      <w:r>
+        <w:t xml:space="preserve"> </w:t>
+      </w:r>
+      <w:r>
+        <w:rPr>
+          <w:rStyle w:val="VerbatimChar"/>
+        </w:rPr>
+        <w:t xml:space="preserve">kind=agent</w:t>
+      </w:r>
+      <w:r>
+        <w:t xml:space="preserve">, NEVER tagged), a human's canonical handle (defaults to their Telegram</w:t>
+      </w:r>
+      <w:r>
+        <w:t xml:space="preserve"> </w:t>
+      </w:r>
+      <w:r>
+        <w:rPr>
+          <w:rStyle w:val="VerbatimChar"/>
+        </w:rPr>
+        <w:t xml:space="preserve">@username</w:t>
+      </w:r>
+      <w:r>
+        <w:t xml:space="preserve">; messenger-neutral; per-channel</w:t>
+      </w:r>
+      <w:r>
+        <w:t xml:space="preserve"> </w:t>
+      </w:r>
+      <w:r>
+        <w:rPr>
+          <w:rStyle w:val="VerbatimChar"/>
+        </w:rPr>
+        <w:t xml:space="preserve">@username</w:t>
+      </w:r>
+      <w:r>
+        <w:t xml:space="preserve">s resolve via</w:t>
+      </w:r>
+      <w:r>
+        <w:t xml:space="preserve"> </w:t>
+      </w:r>
+      <w:r>
+        <w:rPr>
+          <w:rStyle w:val="VerbatimChar"/>
+        </w:rPr>
+        <w:t xml:space="preserve">subscriber_aliases</w:t>
+      </w:r>
+      <w:r>
+        <w:t xml:space="preserve">)}.</w:t>
       </w:r>
     </w:p>
     <w:p>
@@ -4740,7 +4935,59 @@
         </w:numPr>
       </w:pPr>
       <w:r>
-        <w:t xml:space="preserve">Promoting Herald-specific values into the parent constitution (universal status must be EARNED; see Constitution §11.4 + §11.4.10).</w:t>
+        <w:rPr>
+          <w:b/>
+          <w:bCs/>
+        </w:rPr>
+        <w:t xml:space="preserve">Operator env var.</w:t>
+      </w:r>
+      <w:r>
+        <w:t xml:space="preserve"> </w:t>
+      </w:r>
+      <w:r>
+        <w:t xml:space="preserve">The one human driving the system via the Claude Code CLI is designated by</w:t>
+      </w:r>
+      <w:r>
+        <w:t xml:space="preserve"> </w:t>
+      </w:r>
+      <w:r>
+        <w:rPr>
+          <w:rStyle w:val="VerbatimChar"/>
+        </w:rPr>
+        <w:t xml:space="preserve">HERALD_TGRAM_OPERATOR_USERNAME</w:t>
+      </w:r>
+      <w:r>
+        <w:t xml:space="preserve"> </w:t>
+      </w:r>
+      <w:r>
+        <w:t xml:space="preserve">(e.g.</w:t>
+      </w:r>
+      <w:r>
+        <w:t xml:space="preserve"> </w:t>
+      </w:r>
+      <w:r>
+        <w:rPr>
+          <w:rStyle w:val="VerbatimChar"/>
+        </w:rPr>
+        <w:t xml:space="preserve">@milos85vasic</w:t>
+      </w:r>
+      <w:r>
+        <w:t xml:space="preserve">), generalizing to</w:t>
+      </w:r>
+      <w:r>
+        <w:t xml:space="preserve"> </w:t>
+      </w:r>
+      <w:r>
+        <w:rPr>
+          <w:rStyle w:val="VerbatimChar"/>
+        </w:rPr>
+        <w:t xml:space="preserve">HERALD_&lt;CHANNEL&gt;_OPERATOR_USERNAME</w:t>
+      </w:r>
+      <w:r>
+        <w:t xml:space="preserve"> </w:t>
+      </w:r>
+      <w:r>
+        <w:t xml:space="preserve">— env var, NOT a DB flag. The operator's canonical handle = that env value; the operator is a normal Participant.</w:t>
       </w:r>
     </w:p>
     <w:p>
@@ -4752,22 +4999,83 @@
         </w:numPr>
       </w:pPr>
       <w:r>
-        <w:t xml:space="preserve">Modifying any file under the discovered</w:t>
-      </w:r>
-      <w:r>
-        <w:t xml:space="preserve"> </w:t>
-      </w:r>
-      <w:r>
-        <w:rPr>
-          <w:rStyle w:val="VerbatimChar"/>
-        </w:rPr>
-        <w:t xml:space="preserve">constitution/</w:t>
-      </w:r>
-      <w:r>
-        <w:t xml:space="preserve"> </w:t>
-      </w:r>
-      <w:r>
-        <w:t xml:space="preserve">from Herald commits — the parent's constitution is read-only from Herald's perspective. Constitution changes go through the HelixConstitution repo directly.</w:t>
+        <w:rPr>
+          <w:b/>
+          <w:bCs/>
+        </w:rPr>
+        <w:t xml:space="preserve">Attribution.</w:t>
+      </w:r>
+      <w:r>
+        <w:t xml:space="preserve"> </w:t>
+      </w:r>
+      <w:r>
+        <w:rPr>
+          <w:rStyle w:val="VerbatimChar"/>
+        </w:rPr>
+        <w:t xml:space="preserve">created_by</w:t>
+      </w:r>
+      <w:r>
+        <w:t xml:space="preserve"> </w:t>
+      </w:r>
+      <w:r>
+        <w:t xml:space="preserve">=</w:t>
+      </w:r>
+      <w:r>
+        <w:t xml:space="preserve"> </w:t>
+      </w:r>
+      <w:r>
+        <w:rPr>
+          <w:rStyle w:val="VerbatimChar"/>
+        </w:rPr>
+        <w:t xml:space="preserve">OperatorHandle()</w:t>
+      </w:r>
+      <w:r>
+        <w:t xml:space="preserve"> </w:t>
+      </w:r>
+      <w:r>
+        <w:t xml:space="preserve">when opened via the Claude Code CLI prompt;</w:t>
+      </w:r>
+      <w:r>
+        <w:t xml:space="preserve"> </w:t>
+      </w:r>
+      <w:r>
+        <w:rPr>
+          <w:rStyle w:val="VerbatimChar"/>
+        </w:rPr>
+        <w:t xml:space="preserve">"Claude"</w:t>
+      </w:r>
+      <w:r>
+        <w:t xml:space="preserve"> </w:t>
+      </w:r>
+      <w:r>
+        <w:t xml:space="preserve">when System/Claude detects the issue/task/improvement/missing-feature; the sender's resolved canonical handle when received through Herald.</w:t>
+      </w:r>
+      <w:r>
+        <w:t xml:space="preserve"> </w:t>
+      </w:r>
+      <w:r>
+        <w:rPr>
+          <w:rStyle w:val="VerbatimChar"/>
+        </w:rPr>
+        <w:t xml:space="preserve">assigned_to</w:t>
+      </w:r>
+      <w:r>
+        <w:t xml:space="preserve"> </w:t>
+      </w:r>
+      <w:r>
+        <w:t xml:space="preserve">defaults to</w:t>
+      </w:r>
+      <w:r>
+        <w:t xml:space="preserve"> </w:t>
+      </w:r>
+      <w:r>
+        <w:rPr>
+          <w:rStyle w:val="VerbatimChar"/>
+        </w:rPr>
+        <w:t xml:space="preserve">OperatorHandle()</w:t>
+      </w:r>
+      <w:r>
+        <w:t xml:space="preserve">, overridable explicitly. Both store the canonical handle string.</w:t>
       </w:r>
     </w:p>
     <w:p>
@@ -4779,6 +5087,542 @@
         </w:numPr>
       </w:pPr>
       <w:r>
+        <w:rPr>
+          <w:b/>
+          <w:bCs/>
+        </w:rPr>
+        <w:t xml:space="preserve">Tagging matrix.</w:t>
+      </w:r>
+      <w:r>
+        <w:t xml:space="preserve"> </w:t>
+      </w:r>
+      <w:r>
+        <w:t xml:space="preserve">On any item event, the notification to each channel @-mentions:</w:t>
+      </w:r>
+      <w:r>
+        <w:t xml:space="preserve"> </w:t>
+      </w:r>
+      <w:r>
+        <w:rPr>
+          <w:rStyle w:val="VerbatimChar"/>
+        </w:rPr>
+        <w:t xml:space="preserve">assigned_to</w:t>
+      </w:r>
+      <w:r>
+        <w:t xml:space="preserve"> </w:t>
+      </w:r>
+      <w:r>
+        <w:t xml:space="preserve">if human AND ≠ Operator;</w:t>
+      </w:r>
+      <w:r>
+        <w:t xml:space="preserve"> </w:t>
+      </w:r>
+      <w:r>
+        <w:rPr>
+          <w:rStyle w:val="VerbatimChar"/>
+        </w:rPr>
+        <w:t xml:space="preserve">created_by</w:t>
+      </w:r>
+      <w:r>
+        <w:t xml:space="preserve"> </w:t>
+      </w:r>
+      <w:r>
+        <w:t xml:space="preserve">if human AND ≠ Operator AND ≠</w:t>
+      </w:r>
+      <w:r>
+        <w:t xml:space="preserve"> </w:t>
+      </w:r>
+      <w:r>
+        <w:rPr>
+          <w:rStyle w:val="VerbatimChar"/>
+        </w:rPr>
+        <w:t xml:space="preserve">"Claude"</w:t>
+      </w:r>
+      <w:r>
+        <w:t xml:space="preserve">.</w:t>
+      </w:r>
+      <w:r>
+        <w:t xml:space="preserve"> </w:t>
+      </w:r>
+      <w:r>
+        <w:rPr>
+          <w:rStyle w:val="VerbatimChar"/>
+        </w:rPr>
+        <w:t xml:space="preserve">"Claude"</w:t>
+      </w:r>
+      <w:r>
+        <w:t xml:space="preserve"> </w:t>
+      </w:r>
+      <w:r>
+        <w:t xml:space="preserve">and the Operator are NEVER tagged (no system-ping, no self-ping). De-dup, then resolve each handle to that channel's</w:t>
+      </w:r>
+      <w:r>
+        <w:t xml:space="preserve"> </w:t>
+      </w:r>
+      <w:r>
+        <w:rPr>
+          <w:rStyle w:val="VerbatimChar"/>
+        </w:rPr>
+        <w:t xml:space="preserve">@username</w:t>
+      </w:r>
+      <w:r>
+        <w:t xml:space="preserve"> </w:t>
+      </w:r>
+      <w:r>
+        <w:t xml:space="preserve">(skip if no alias on that channel). The agent ships unit + integration + E2E + full-automation tests with real captured evidence under</w:t>
+      </w:r>
+      <w:r>
+        <w:t xml:space="preserve"> </w:t>
+      </w:r>
+      <w:r>
+        <w:rPr>
+          <w:rStyle w:val="VerbatimChar"/>
+        </w:rPr>
+        <w:t xml:space="preserve">docs/qa/&lt;run-id&gt;/</w:t>
+      </w:r>
+      <w:r>
+        <w:t xml:space="preserve"> </w:t>
+      </w:r>
+      <w:r>
+        <w:t xml:space="preserve">— the matrix proven by a per-cell truth-table test + a one-cell-flip mutation that must FAIL, plus a NEGATIVE case proving the Operator is NOT tagged (§107 / Helix §11.4 anti-bluff). Canonical authority: HelixConstitution root §participant-attribution (inherited per §11.4.35); Herald contract</w:t>
+      </w:r>
+      <w:r>
+        <w:t xml:space="preserve"> </w:t>
+      </w:r>
+      <w:r>
+        <w:rPr>
+          <w:rStyle w:val="VerbatimChar"/>
+        </w:rPr>
+        <w:t xml:space="preserve">docs/design/PARTICIPANT_ATTRIBUTION.md</w:t>
+      </w:r>
+      <w:r>
+        <w:t xml:space="preserve">.</w:t>
+      </w:r>
+    </w:p>
+    <w:bookmarkEnd w:id="18"/>
+    <w:bookmarkStart w:id="19" w:name="X494e63fc2991a9d42fefb419b530ac9bef94c53"/>
+    <w:p>
+      <w:pPr>
+        <w:pStyle w:val="Heading3"/>
+      </w:pPr>
+      <w:r>
+        <w:t xml:space="preserve">Inheritance gate (run before any commit that touches root docs or</w:t>
+      </w:r>
+      <w:r>
+        <w:t xml:space="preserve"> </w:t>
+      </w:r>
+      <w:r>
+        <w:rPr>
+          <w:rStyle w:val="VerbatimChar"/>
+        </w:rPr>
+        <w:t xml:space="preserve">constitution/</w:t>
+      </w:r>
+      <w:r>
+        <w:t xml:space="preserve">)</w:t>
+      </w:r>
+    </w:p>
+    <w:p>
+      <w:pPr>
+        <w:pStyle w:val="SourceCode"/>
+      </w:pPr>
+      <w:r>
+        <w:rPr>
+          <w:rStyle w:val="FunctionTok"/>
+        </w:rPr>
+        <w:t xml:space="preserve">bash</w:t>
+      </w:r>
+      <w:r>
+        <w:rPr>
+          <w:rStyle w:val="NormalTok"/>
+        </w:rPr>
+        <w:t xml:space="preserve"> tests/test_constitution_inheritance.sh        </w:t>
+      </w:r>
+      <w:r>
+        <w:rPr>
+          <w:rStyle w:val="CommentTok"/>
+        </w:rPr>
+        <w:t xml:space="preserve"># the gate</w:t>
+      </w:r>
+      <w:r>
+        <w:br/>
+      </w:r>
+      <w:r>
+        <w:rPr>
+          <w:rStyle w:val="FunctionTok"/>
+        </w:rPr>
+        <w:t xml:space="preserve">bash</w:t>
+      </w:r>
+      <w:r>
+        <w:rPr>
+          <w:rStyle w:val="NormalTok"/>
+        </w:rPr>
+        <w:t xml:space="preserve"> tests/test_constitution_inheritance_meta.sh   </w:t>
+      </w:r>
+      <w:r>
+        <w:rPr>
+          <w:rStyle w:val="CommentTok"/>
+        </w:rPr>
+        <w:t xml:space="preserve"># paired mutation proof (§1.1)</w:t>
+      </w:r>
+    </w:p>
+    <w:p>
+      <w:pPr>
+        <w:pStyle w:val="FirstParagraph"/>
+      </w:pPr>
+      <w:r>
+        <w:t xml:space="preserve">Both MUST return 0. If either fails, fix at root cause per Constitution §11.4.4 — never silently accept the FAIL.</w:t>
+      </w:r>
+    </w:p>
+    <w:bookmarkEnd w:id="19"/>
+    <w:bookmarkStart w:id="20" w:name="X32120c2cbf4d615e5864fa1300f097d3beccf79"/>
+    <w:p>
+      <w:pPr>
+        <w:pStyle w:val="Heading3"/>
+      </w:pPr>
+      <w:r>
+        <w:t xml:space="preserve">Spec-change rule (load-bearing —</w:t>
+      </w:r>
+      <w:r>
+        <w:t xml:space="preserve"> </w:t>
+      </w:r>
+      <w:r>
+        <w:rPr>
+          <w:rStyle w:val="VerbatimChar"/>
+        </w:rPr>
+        <w:t xml:space="preserve">docs/specs/mvp/specification.V3.md</w:t>
+      </w:r>
+      <w:r>
+        <w:t xml:space="preserve"> </w:t>
+      </w:r>
+      <w:r>
+        <w:t xml:space="preserve">§"Specification documents")</w:t>
+      </w:r>
+    </w:p>
+    <w:p>
+      <w:pPr>
+        <w:pStyle w:val="FirstParagraph"/>
+      </w:pPr>
+      <w:r>
+        <w:t xml:space="preserve">Whenever</w:t>
+      </w:r>
+      <w:r>
+        <w:t xml:space="preserve"> </w:t>
+      </w:r>
+      <w:r>
+        <w:rPr>
+          <w:rStyle w:val="VerbatimChar"/>
+        </w:rPr>
+        <w:t xml:space="preserve">docs/specs/mvp/specification.V3.md</w:t>
+      </w:r>
+      <w:r>
+        <w:t xml:space="preserve"> </w:t>
+      </w:r>
+      <w:r>
+        <w:t xml:space="preserve">or any file under</w:t>
+      </w:r>
+      <w:r>
+        <w:t xml:space="preserve"> </w:t>
+      </w:r>
+      <w:r>
+        <w:rPr>
+          <w:rStyle w:val="VerbatimChar"/>
+        </w:rPr>
+        <w:t xml:space="preserve">docs/specs/</w:t>
+      </w:r>
+      <w:r>
+        <w:t xml:space="preserve"> </w:t>
+      </w:r>
+      <w:r>
+        <w:t xml:space="preserve">(any depth) is modified,</w:t>
+      </w:r>
+      <w:r>
+        <w:t xml:space="preserve"> </w:t>
+      </w:r>
+      <w:r>
+        <w:rPr>
+          <w:b/>
+          <w:bCs/>
+        </w:rPr>
+        <w:t xml:space="preserve">comprehensive planning and implementation of all changes is MANDATORY</w:t>
+      </w:r>
+      <w:r>
+        <w:t xml:space="preserve"> </w:t>
+      </w:r>
+      <w:r>
+        <w:t xml:space="preserve">— agents may not edit the spec in isolation. This rule does NOT apply to creating or renaming files; for those, ask the operator what to do with the new path. Treat every spec edit as a project-wide ripple, not a doc tweak.</w:t>
+      </w:r>
+    </w:p>
+    <w:p>
+      <w:pPr>
+        <w:pStyle w:val="BodyText"/>
+      </w:pPr>
+      <w:r>
+        <w:t xml:space="preserve">This rule is mirrored in</w:t>
+      </w:r>
+      <w:r>
+        <w:t xml:space="preserve"> </w:t>
+      </w:r>
+      <w:r>
+        <w:rPr>
+          <w:rStyle w:val="VerbatimChar"/>
+        </w:rPr>
+        <w:t xml:space="preserve">CLAUDE.md</w:t>
+      </w:r>
+      <w:r>
+        <w:t xml:space="preserve"> </w:t>
+      </w:r>
+      <w:r>
+        <w:t xml:space="preserve">and in</w:t>
+      </w:r>
+      <w:r>
+        <w:t xml:space="preserve"> </w:t>
+      </w:r>
+      <w:r>
+        <w:rPr>
+          <w:rStyle w:val="VerbatimChar"/>
+        </w:rPr>
+        <w:t xml:space="preserve">docs/guides/HERALD_CONSTITUTION.md</w:t>
+      </w:r>
+      <w:r>
+        <w:t xml:space="preserve"> </w:t>
+      </w:r>
+      <w:r>
+        <w:t xml:space="preserve">§106. The inheritance gate's invariant</w:t>
+      </w:r>
+      <w:r>
+        <w:t xml:space="preserve"> </w:t>
+      </w:r>
+      <w:r>
+        <w:rPr>
+          <w:b/>
+          <w:bCs/>
+        </w:rPr>
+        <w:t xml:space="preserve">I7a–c</w:t>
+      </w:r>
+      <w:r>
+        <w:t xml:space="preserve"> </w:t>
+      </w:r>
+      <w:r>
+        <w:t xml:space="preserve">asserts the rule anchor (</w:t>
+      </w:r>
+      <w:r>
+        <w:rPr>
+          <w:rStyle w:val="VerbatimChar"/>
+        </w:rPr>
+        <w:t xml:space="preserve">comprehensive planning and implementation</w:t>
+      </w:r>
+      <w:r>
+        <w:t xml:space="preserve">) is present in all three files; a missing copy is a §1.1 propagation bluff and the gate FAILs.</w:t>
+      </w:r>
+    </w:p>
+    <w:bookmarkEnd w:id="20"/>
+    <w:bookmarkStart w:id="21" w:name="X6198677d4a246aad02e8f663e73cd694bf6928c"/>
+    <w:p>
+      <w:pPr>
+        <w:pStyle w:val="Heading3"/>
+      </w:pPr>
+      <w:r>
+        <w:t xml:space="preserve">Multi-host mirror convention (Herald's own upstreams)</w:t>
+      </w:r>
+    </w:p>
+    <w:p>
+      <w:pPr>
+        <w:pStyle w:val="FirstParagraph"/>
+      </w:pPr>
+      <w:r>
+        <w:rPr>
+          <w:rStyle w:val="VerbatimChar"/>
+        </w:rPr>
+        <w:t xml:space="preserve">upstreams/</w:t>
+      </w:r>
+      <w:r>
+        <w:t xml:space="preserve"> </w:t>
+      </w:r>
+      <w:r>
+        <w:t xml:space="preserve">contains one script per mirror host (GitHub, GitLab, GitFlic, GitVerse). Each script exports</w:t>
+      </w:r>
+      <w:r>
+        <w:t xml:space="preserve"> </w:t>
+      </w:r>
+      <w:r>
+        <w:rPr>
+          <w:rStyle w:val="VerbatimChar"/>
+        </w:rPr>
+        <w:t xml:space="preserve">UPSTREAMABLE_REPOSITORY</w:t>
+      </w:r>
+      <w:r>
+        <w:t xml:space="preserve"> </w:t>
+      </w:r>
+      <w:r>
+        <w:t xml:space="preserve">and is sourced, not executed. The Herald repo's</w:t>
+      </w:r>
+      <w:r>
+        <w:t xml:space="preserve"> </w:t>
+      </w:r>
+      <w:r>
+        <w:rPr>
+          <w:rStyle w:val="VerbatimChar"/>
+        </w:rPr>
+        <w:t xml:space="preserve">origin</w:t>
+      </w:r>
+      <w:r>
+        <w:t xml:space="preserve"> </w:t>
+      </w:r>
+      <w:r>
+        <w:t xml:space="preserve">remote is already fan-out (1 fetch URL + 4 push URLs) — a single</w:t>
+      </w:r>
+      <w:r>
+        <w:t xml:space="preserve"> </w:t>
+      </w:r>
+      <w:r>
+        <w:rPr>
+          <w:rStyle w:val="VerbatimChar"/>
+        </w:rPr>
+        <w:t xml:space="preserve">git push origin &lt;branch&gt;</w:t>
+      </w:r>
+      <w:r>
+        <w:t xml:space="preserve"> </w:t>
+      </w:r>
+      <w:r>
+        <w:t xml:space="preserve">propagates to all four hosts. Per-host naming intentionally matches each provider's brand capitalization; do not normalize.</w:t>
+      </w:r>
+    </w:p>
+    <w:bookmarkEnd w:id="21"/>
+    <w:bookmarkStart w:id="22" w:name="forbidden-in-this-project"/>
+    <w:p>
+      <w:pPr>
+        <w:pStyle w:val="Heading3"/>
+      </w:pPr>
+      <w:r>
+        <w:t xml:space="preserve">Forbidden in this project</w:t>
+      </w:r>
+    </w:p>
+    <w:p>
+      <w:pPr>
+        <w:pStyle w:val="Compact"/>
+        <w:numPr>
+          <w:ilvl w:val="0"/>
+          <w:numId w:val="1008"/>
+        </w:numPr>
+      </w:pPr>
+      <w:r>
+        <w:rPr>
+          <w:b/>
+          <w:bCs/>
+        </w:rPr>
+        <w:t xml:space="preserve">Re-adding a</w:t>
+      </w:r>
+      <w:r>
+        <w:rPr>
+          <w:b/>
+          <w:bCs/>
+        </w:rPr>
+        <w:t xml:space="preserve"> </w:t>
+      </w:r>
+      <w:r>
+        <w:rPr>
+          <w:rStyle w:val="VerbatimChar"/>
+          <w:b/>
+          <w:bCs/>
+        </w:rPr>
+        <w:t xml:space="preserve">constitution/</w:t>
+      </w:r>
+      <w:r>
+        <w:rPr>
+          <w:b/>
+          <w:bCs/>
+        </w:rPr>
+        <w:t xml:space="preserve"> </w:t>
+      </w:r>
+      <w:r>
+        <w:rPr>
+          <w:b/>
+          <w:bCs/>
+        </w:rPr>
+        <w:t xml:space="preserve">submodule inside Herald.</w:t>
+      </w:r>
+      <w:r>
+        <w:t xml:space="preserve"> </w:t>
+      </w:r>
+      <w:r>
+        <w:t xml:space="preserve">Herald is consumed as a submodule of a parent project that already provides</w:t>
+      </w:r>
+      <w:r>
+        <w:t xml:space="preserve"> </w:t>
+      </w:r>
+      <w:r>
+        <w:rPr>
+          <w:rStyle w:val="VerbatimChar"/>
+        </w:rPr>
+        <w:t xml:space="preserve">constitution/</w:t>
+      </w:r>
+      <w:r>
+        <w:t xml:space="preserve">. A duplicate copy inside Herald is a deployment-model violation. The inheritance gate's invariant</w:t>
+      </w:r>
+      <w:r>
+        <w:t xml:space="preserve"> </w:t>
+      </w:r>
+      <w:r>
+        <w:rPr>
+          <w:rStyle w:val="VerbatimChar"/>
+        </w:rPr>
+        <w:t xml:space="preserve">I6</w:t>
+      </w:r>
+      <w:r>
+        <w:t xml:space="preserve"> </w:t>
+      </w:r>
+      <w:r>
+        <w:t xml:space="preserve">enforces this — re-adding it will turn the gate red.</w:t>
+      </w:r>
+    </w:p>
+    <w:p>
+      <w:pPr>
+        <w:pStyle w:val="Compact"/>
+        <w:numPr>
+          <w:ilvl w:val="0"/>
+          <w:numId w:val="1008"/>
+        </w:numPr>
+      </w:pPr>
+      <w:r>
+        <w:t xml:space="preserve">Promoting Herald-specific values into the parent constitution (universal status must be EARNED; see Constitution §11.4 + §11.4.10).</w:t>
+      </w:r>
+    </w:p>
+    <w:p>
+      <w:pPr>
+        <w:pStyle w:val="Compact"/>
+        <w:numPr>
+          <w:ilvl w:val="0"/>
+          <w:numId w:val="1008"/>
+        </w:numPr>
+      </w:pPr>
+      <w:r>
+        <w:t xml:space="preserve">Modifying any file under the discovered</w:t>
+      </w:r>
+      <w:r>
+        <w:t xml:space="preserve"> </w:t>
+      </w:r>
+      <w:r>
+        <w:rPr>
+          <w:rStyle w:val="VerbatimChar"/>
+        </w:rPr>
+        <w:t xml:space="preserve">constitution/</w:t>
+      </w:r>
+      <w:r>
+        <w:t xml:space="preserve"> </w:t>
+      </w:r>
+      <w:r>
+        <w:t xml:space="preserve">from Herald commits — the parent's constitution is read-only from Herald's perspective. Constitution changes go through the HelixConstitution repo directly.</w:t>
+      </w:r>
+    </w:p>
+    <w:p>
+      <w:pPr>
+        <w:pStyle w:val="Compact"/>
+        <w:numPr>
+          <w:ilvl w:val="0"/>
+          <w:numId w:val="1008"/>
+        </w:numPr>
+      </w:pPr>
+      <w:r>
         <w:t xml:space="preserve">Adding new submodules without re-running</w:t>
       </w:r>
       <w:r>
@@ -4797,9 +5641,9 @@
         <w:t xml:space="preserve">afterward.</w:t>
       </w:r>
     </w:p>
-    <w:bookmarkEnd w:id="20"/>
-    <w:bookmarkEnd w:id="21"/>
     <w:bookmarkEnd w:id="22"/>
+    <w:bookmarkEnd w:id="23"/>
+    <w:bookmarkEnd w:id="24"/>
     <w:sectPr>
       <w:footnotePr>
         <w:numRestart w:val="eachSect"/>
@@ -5035,6 +5879,9 @@
     <w:abstractNumId w:val="991"/>
   </w:num>
   <w:num w:numId="1007">
+    <w:abstractNumId w:val="991"/>
+  </w:num>
+  <w:num w:numId="1008">
     <w:abstractNumId w:val="991"/>
   </w:num>
 </w:numbering>

</xml_diff>

<commit_message>
docs(intent-recognition): propagate the §11.4.105 natural-language-intent mandate into Herald governance + guides
Propagates the intent-recognition mandate (constitution §11.4.105, just landed) per docs/design/INTENT_RECOGNITION.md: CLAUDE.md r17→r18 + AGENTS.md r13→r14 + QWEN.md §110 restatements; HERALD_CONSTITUTION.md r11→r12 new §110 (three-tier resolution + command-set + clarify-and-tag tables + never-guess/never-ignore); MESSENGER_CHANNELS.md §6B (plain-NL, no command syntax); PHERALD.md listen note (Tier-2 LIVE, Tier-1/3 contract being implemented — honest live-vs-contract caveat); INTEGRATION.md + README doc-links. Docs-only; siblings regenerated; the §11.4.105 ToC slug fixed (114105 per the dot-stripping convention).

Co-Authored-By: Claude Opus 4.8 <noreply@anthropic.com>
</commit_message>
<xml_diff>
--- a/AGENTS.docx
+++ b/AGENTS.docx
@@ -10,7 +10,7 @@
         <w:t xml:space="preserve">Herald</w:t>
       </w:r>
     </w:p>
-    <w:bookmarkStart w:id="24" w:name="herald--agentsmd"/>
+    <w:bookmarkStart w:id="26" w:name="herald--agentsmd"/>
     <w:p>
       <w:pPr>
         <w:pStyle w:val="Heading1"/>
@@ -75,7 +75,7 @@
               <w:pStyle w:val="Compact"/>
             </w:pPr>
             <w:r>
-              <w:t xml:space="preserve">13</w:t>
+              <w:t xml:space="preserve">14</w:t>
             </w:r>
           </w:p>
         </w:tc>
@@ -171,7 +171,67 @@
               <w:pStyle w:val="Compact"/>
             </w:pPr>
             <w:r>
-              <w:t xml:space="preserve">r13: propagated the participant/attribution/tagging mandate (operator 2026-05-31) into the agent-rule cluster as a short-form restatement — new "Participant identity, attribution &amp; notification-tagging" section + ToC entry — citing the authoritative contract</w:t>
+              <w:t xml:space="preserve">r14: propagated the intent-recognition mandate (operator 2026-05-31) into the agent-rule cluster as a short-form restatement — new "Intent recognition &amp; clarification" section + ToC entry — citing the authoritative contract</w:t>
+            </w:r>
+            <w:r>
+              <w:t xml:space="preserve"> </w:t>
+            </w:r>
+            <w:r>
+              <w:rPr>
+                <w:rStyle w:val="VerbatimChar"/>
+              </w:rPr>
+              <w:t xml:space="preserve">docs/design/INTENT_RECOGNITION.md</w:t>
+            </w:r>
+            <w:r>
+              <w:t xml:space="preserve"> </w:t>
+            </w:r>
+            <w:r>
+              <w:t xml:space="preserve">and noting inheritance from HelixConstitution §11.4.105 (the root-§ being added on the constitution stream), inherited per §11.4.35. Covers: subscribers speak plain natural language (NO command syntax / no</w:t>
+            </w:r>
+            <w:r>
+              <w:t xml:space="preserve"> </w:t>
+            </w:r>
+            <w:r>
+              <w:rPr>
+                <w:rStyle w:val="VerbatimChar"/>
+              </w:rPr>
+              <w:t xml:space="preserve">COMMAND:</w:t>
+            </w:r>
+            <w:r>
+              <w:t xml:space="preserve"> </w:t>
+            </w:r>
+            <w:r>
+              <w:t xml:space="preserve">prefix); three-tier resolution (Tier 1 deterministic CommandRecognizer fast-path → Tier 2 LLM intent inference via the</w:t>
+            </w:r>
+            <w:r>
+              <w:t xml:space="preserve"> </w:t>
+            </w:r>
+            <w:r>
+              <w:rPr>
+                <w:rStyle w:val="VerbatimChar"/>
+              </w:rPr>
+              <w:t xml:space="preserve">&lt;&lt;&lt;HERALD-DISPATCH-v1&gt;&gt;&gt;</w:t>
+            </w:r>
+            <w:r>
+              <w:t xml:space="preserve"> </w:t>
+            </w:r>
+            <w:r>
+              <w:t xml:space="preserve">envelope → Tier 3</w:t>
+            </w:r>
+            <w:r>
+              <w:t xml:space="preserve"> </w:t>
+            </w:r>
+            <w:r>
+              <w:rPr>
+                <w:rStyle w:val="VerbatimChar"/>
+              </w:rPr>
+              <w:t xml:space="preserve">action="clarify"</w:t>
+            </w:r>
+            <w:r>
+              <w:t xml:space="preserve"> </w:t>
+            </w:r>
+            <w:r>
+              <w:t xml:space="preserve">reply-tag-and-ask fallback via the §11.4.104 IdentityResolver); never guess an action, never ignore a message. Restated + cited, not redefined. Prior r13: propagated the participant/attribution/tagging mandate (operator 2026-05-31) into the agent-rule cluster as a short-form restatement — new "Participant identity, attribution &amp; notification-tagging" section + ToC entry — citing the authoritative contract</w:t>
             </w:r>
             <w:r>
               <w:t xml:space="preserve"> </w:t>
@@ -702,6 +762,41 @@
             <w:rStyle w:val="VerbatimChar"/>
           </w:rPr>
           <w:t xml:space="preserve">docs/design/PARTICIPANT_ATTRIBUTION.md</w:t>
+        </w:r>
+        <w:r>
+          <w:rPr>
+            <w:rStyle w:val="Hyperlink"/>
+          </w:rPr>
+          <w:t xml:space="preserve">)</w:t>
+        </w:r>
+      </w:hyperlink>
+    </w:p>
+    <w:p>
+      <w:pPr>
+        <w:pStyle w:val="Compact"/>
+        <w:numPr>
+          <w:ilvl w:val="1"/>
+          <w:numId w:val="1002"/>
+        </w:numPr>
+      </w:pPr>
+      <w:hyperlink w:anchor="X97a0253dc914108e533ee6c212b9c2edeabc207">
+        <w:r>
+          <w:rPr>
+            <w:rStyle w:val="Hyperlink"/>
+          </w:rPr>
+          <w:t xml:space="preserve">Intent recognition &amp; clarification (Herald §110 / contract</w:t>
+        </w:r>
+        <w:r>
+          <w:rPr>
+            <w:rStyle w:val="Hyperlink"/>
+          </w:rPr>
+          <w:t xml:space="preserve"> </w:t>
+        </w:r>
+        <w:r>
+          <w:rPr>
+            <w:rStyle w:val="VerbatimChar"/>
+          </w:rPr>
+          <w:t xml:space="preserve">docs/design/INTENT_RECOGNITION.md</w:t>
         </w:r>
         <w:r>
           <w:rPr>
@@ -1296,7 +1391,7 @@
       </w:r>
     </w:p>
     <w:bookmarkEnd w:id="11"/>
-    <w:bookmarkStart w:id="23" w:name="herald-specific-agent-rules"/>
+    <w:bookmarkStart w:id="25" w:name="herald-specific-agent-rules"/>
     <w:p>
       <w:pPr>
         <w:pStyle w:val="Heading2"/>
@@ -5200,69 +5295,28 @@
       </w:r>
     </w:p>
     <w:bookmarkEnd w:id="18"/>
-    <w:bookmarkStart w:id="19" w:name="X494e63fc2991a9d42fefb419b530ac9bef94c53"/>
+    <w:bookmarkStart w:id="20" w:name="X97a0253dc914108e533ee6c212b9c2edeabc207"/>
     <w:p>
       <w:pPr>
         <w:pStyle w:val="Heading3"/>
       </w:pPr>
       <w:r>
-        <w:t xml:space="preserve">Inheritance gate (run before any commit that touches root docs or</w:t>
-      </w:r>
-      <w:r>
-        <w:t xml:space="preserve"> </w:t>
-      </w:r>
-      <w:r>
-        <w:rPr>
-          <w:rStyle w:val="VerbatimChar"/>
-        </w:rPr>
-        <w:t xml:space="preserve">constitution/</w:t>
-      </w:r>
-      <w:r>
-        <w:t xml:space="preserve">)</w:t>
-      </w:r>
-    </w:p>
-    <w:p>
-      <w:pPr>
-        <w:pStyle w:val="SourceCode"/>
-      </w:pPr>
-      <w:r>
-        <w:rPr>
-          <w:rStyle w:val="FunctionTok"/>
-        </w:rPr>
-        <w:t xml:space="preserve">bash</w:t>
-      </w:r>
-      <w:r>
-        <w:rPr>
-          <w:rStyle w:val="NormalTok"/>
-        </w:rPr>
-        <w:t xml:space="preserve"> tests/test_constitution_inheritance.sh        </w:t>
-      </w:r>
-      <w:r>
-        <w:rPr>
-          <w:rStyle w:val="CommentTok"/>
-        </w:rPr>
-        <w:t xml:space="preserve"># the gate</w:t>
-      </w:r>
-      <w:r>
-        <w:br/>
-      </w:r>
-      <w:r>
-        <w:rPr>
-          <w:rStyle w:val="FunctionTok"/>
-        </w:rPr>
-        <w:t xml:space="preserve">bash</w:t>
-      </w:r>
-      <w:r>
-        <w:rPr>
-          <w:rStyle w:val="NormalTok"/>
-        </w:rPr>
-        <w:t xml:space="preserve"> tests/test_constitution_inheritance_meta.sh   </w:t>
-      </w:r>
-      <w:r>
-        <w:rPr>
-          <w:rStyle w:val="CommentTok"/>
-        </w:rPr>
-        <w:t xml:space="preserve"># paired mutation proof (§1.1)</w:t>
+        <w:t xml:space="preserve">Intent recognition &amp; clarification (Herald §110 / contract</w:t>
+      </w:r>
+      <w:r>
+        <w:t xml:space="preserve"> </w:t>
+      </w:r>
+      <w:r>
+        <w:rPr>
+          <w:rStyle w:val="VerbatimChar"/>
+        </w:rPr>
+        <w:t xml:space="preserve">docs/design/INTENT_RECOGNITION.md</w:t>
+      </w:r>
+      <w:r>
+        <w:t xml:space="preserve"> </w:t>
+      </w:r>
+      <w:r>
+        <w:t xml:space="preserve">— inherited from HelixConstitution §11.4.105 per §11.4.35)</w:t>
       </w:r>
     </w:p>
     <w:p>
@@ -5270,94 +5324,90 @@
         <w:pStyle w:val="FirstParagraph"/>
       </w:pPr>
       <w:r>
-        <w:t xml:space="preserve">Both MUST return 0. If either fails, fix at root cause per Constitution §11.4.4 — never silently accept the FAIL.</w:t>
-      </w:r>
-    </w:p>
-    <w:bookmarkEnd w:id="19"/>
-    <w:bookmarkStart w:id="20" w:name="X32120c2cbf4d615e5864fa1300f097d3beccf79"/>
-    <w:p>
-      <w:pPr>
-        <w:pStyle w:val="Heading3"/>
-      </w:pPr>
-      <w:r>
-        <w:t xml:space="preserve">Spec-change rule (load-bearing —</w:t>
-      </w:r>
-      <w:r>
-        <w:t xml:space="preserve"> </w:t>
-      </w:r>
-      <w:r>
-        <w:rPr>
-          <w:rStyle w:val="VerbatimChar"/>
-        </w:rPr>
-        <w:t xml:space="preserve">docs/specs/mvp/specification.V3.md</w:t>
-      </w:r>
-      <w:r>
-        <w:t xml:space="preserve"> </w:t>
-      </w:r>
-      <w:r>
-        <w:t xml:space="preserve">§"Specification documents")</w:t>
-      </w:r>
-    </w:p>
-    <w:p>
-      <w:pPr>
-        <w:pStyle w:val="FirstParagraph"/>
-      </w:pPr>
-      <w:r>
-        <w:t xml:space="preserve">Whenever</w:t>
-      </w:r>
-      <w:r>
-        <w:t xml:space="preserve"> </w:t>
-      </w:r>
-      <w:r>
-        <w:rPr>
-          <w:rStyle w:val="VerbatimChar"/>
-        </w:rPr>
-        <w:t xml:space="preserve">docs/specs/mvp/specification.V3.md</w:t>
-      </w:r>
-      <w:r>
-        <w:t xml:space="preserve"> </w:t>
-      </w:r>
-      <w:r>
-        <w:t xml:space="preserve">or any file under</w:t>
-      </w:r>
-      <w:r>
-        <w:t xml:space="preserve"> </w:t>
-      </w:r>
-      <w:r>
-        <w:rPr>
-          <w:rStyle w:val="VerbatimChar"/>
-        </w:rPr>
-        <w:t xml:space="preserve">docs/specs/</w:t>
-      </w:r>
-      <w:r>
-        <w:t xml:space="preserve"> </w:t>
-      </w:r>
-      <w:r>
-        <w:t xml:space="preserve">(any depth) is modified,</w:t>
-      </w:r>
-      <w:r>
-        <w:t xml:space="preserve"> </w:t>
-      </w:r>
-      <w:r>
-        <w:rPr>
-          <w:b/>
-          <w:bCs/>
-        </w:rPr>
-        <w:t xml:space="preserve">comprehensive planning and implementation of all changes is MANDATORY</w:t>
-      </w:r>
-      <w:r>
-        <w:t xml:space="preserve"> </w:t>
-      </w:r>
-      <w:r>
-        <w:t xml:space="preserve">— agents may not edit the spec in isolation. This rule does NOT apply to creating or renaming files; for those, ask the operator what to do with the new path. Treat every spec edit as a project-wide ripple, not a doc tweak.</w:t>
-      </w:r>
-    </w:p>
-    <w:p>
-      <w:pPr>
-        <w:pStyle w:val="BodyText"/>
-      </w:pPr>
-      <w:r>
-        <w:t xml:space="preserve">This rule is mirrored in</w:t>
+        <w:rPr>
+          <w:b/>
+          <w:bCs/>
+        </w:rPr>
+        <w:t xml:space="preserve">Agent-binding rule (operator mandate, 2026-05-31).</w:t>
+      </w:r>
+      <w:r>
+        <w:t xml:space="preserve"> </w:t>
+      </w:r>
+      <w:r>
+        <w:t xml:space="preserve">Subscribers must NOT need to know command syntax — there is no</w:t>
+      </w:r>
+      <w:r>
+        <w:t xml:space="preserve"> </w:t>
+      </w:r>
+      <w:r>
+        <w:rPr>
+          <w:rStyle w:val="VerbatimChar"/>
+        </w:rPr>
+        <w:t xml:space="preserve">COMMAND:</w:t>
+      </w:r>
+      <w:r>
+        <w:t xml:space="preserve"> </w:t>
+      </w:r>
+      <w:r>
+        <w:t xml:space="preserve">prefix and no fixed grammar. A subscriber sends a clear natural-language message and</w:t>
+      </w:r>
+      <w:r>
+        <w:t xml:space="preserve"> </w:t>
+      </w:r>
+      <w:r>
+        <w:rPr>
+          <w:b/>
+          <w:bCs/>
+        </w:rPr>
+        <w:t xml:space="preserve">the System determines the intent</w:t>
+      </w:r>
+      <w:r>
+        <w:t xml:space="preserve">. The</w:t>
+      </w:r>
+      <w:r>
+        <w:t xml:space="preserve"> </w:t>
+      </w:r>
+      <w:r>
+        <w:rPr>
+          <w:b/>
+          <w:bCs/>
+        </w:rPr>
+        <w:t xml:space="preserve">single authoritative contract</w:t>
+      </w:r>
+      <w:r>
+        <w:t xml:space="preserve"> </w:t>
+      </w:r>
+      <w:r>
+        <w:t xml:space="preserve">every agent codes against is</w:t>
+      </w:r>
+      <w:r>
+        <w:t xml:space="preserve"> </w:t>
+      </w:r>
+      <w:hyperlink r:id="rId19">
+        <w:r>
+          <w:rPr>
+            <w:rStyle w:val="VerbatimChar"/>
+          </w:rPr>
+          <w:t xml:space="preserve">docs/design/INTENT_RECOGNITION.md</w:t>
+        </w:r>
+      </w:hyperlink>
+      <w:r>
+        <w:t xml:space="preserve">. These rules are restated (root definitions) in HelixConstitution</w:t>
+      </w:r>
+      <w:r>
+        <w:t xml:space="preserve"> </w:t>
+      </w:r>
+      <w:r>
+        <w:rPr>
+          <w:rStyle w:val="VerbatimChar"/>
+        </w:rPr>
+        <w:t xml:space="preserve">Constitution.md</w:t>
+      </w:r>
+      <w:r>
+        <w:t xml:space="preserve"> </w:t>
+      </w:r>
+      <w:r>
+        <w:t xml:space="preserve">/</w:t>
       </w:r>
       <w:r>
         <w:t xml:space="preserve"> </w:t>
@@ -5372,129 +5422,37 @@
         <w:t xml:space="preserve"> </w:t>
       </w:r>
       <w:r>
-        <w:t xml:space="preserve">and in</w:t>
-      </w:r>
-      <w:r>
-        <w:t xml:space="preserve"> </w:t>
-      </w:r>
-      <w:r>
-        <w:rPr>
-          <w:rStyle w:val="VerbatimChar"/>
-        </w:rPr>
-        <w:t xml:space="preserve">docs/guides/HERALD_CONSTITUTION.md</w:t>
-      </w:r>
-      <w:r>
-        <w:t xml:space="preserve"> </w:t>
-      </w:r>
-      <w:r>
-        <w:t xml:space="preserve">§106. The inheritance gate's invariant</w:t>
-      </w:r>
-      <w:r>
-        <w:t xml:space="preserve"> </w:t>
-      </w:r>
-      <w:r>
-        <w:rPr>
-          <w:b/>
-          <w:bCs/>
-        </w:rPr>
-        <w:t xml:space="preserve">I7a–c</w:t>
-      </w:r>
-      <w:r>
-        <w:t xml:space="preserve"> </w:t>
-      </w:r>
-      <w:r>
-        <w:t xml:space="preserve">asserts the rule anchor (</w:t>
-      </w:r>
-      <w:r>
-        <w:rPr>
-          <w:rStyle w:val="VerbatimChar"/>
-        </w:rPr>
-        <w:t xml:space="preserve">comprehensive planning and implementation</w:t>
-      </w:r>
-      <w:r>
-        <w:t xml:space="preserve">) is present in all three files; a missing copy is a §1.1 propagation bluff and the gate FAILs.</w:t>
-      </w:r>
-    </w:p>
-    <w:bookmarkEnd w:id="20"/>
-    <w:bookmarkStart w:id="21" w:name="X6198677d4a246aad02e8f663e73cd694bf6928c"/>
-    <w:p>
-      <w:pPr>
-        <w:pStyle w:val="Heading3"/>
-      </w:pPr>
-      <w:r>
-        <w:t xml:space="preserve">Multi-host mirror convention (Herald's own upstreams)</w:t>
-      </w:r>
-    </w:p>
-    <w:p>
-      <w:pPr>
-        <w:pStyle w:val="FirstParagraph"/>
-      </w:pPr>
-      <w:r>
-        <w:rPr>
-          <w:rStyle w:val="VerbatimChar"/>
-        </w:rPr>
-        <w:t xml:space="preserve">upstreams/</w:t>
-      </w:r>
-      <w:r>
-        <w:t xml:space="preserve"> </w:t>
-      </w:r>
-      <w:r>
-        <w:t xml:space="preserve">contains one script per mirror host (GitHub, GitLab, GitFlic, GitVerse). Each script exports</w:t>
-      </w:r>
-      <w:r>
-        <w:t xml:space="preserve"> </w:t>
-      </w:r>
-      <w:r>
-        <w:rPr>
-          <w:rStyle w:val="VerbatimChar"/>
-        </w:rPr>
-        <w:t xml:space="preserve">UPSTREAMABLE_REPOSITORY</w:t>
-      </w:r>
-      <w:r>
-        <w:t xml:space="preserve"> </w:t>
-      </w:r>
-      <w:r>
-        <w:t xml:space="preserve">and is sourced, not executed. The Herald repo's</w:t>
-      </w:r>
-      <w:r>
-        <w:t xml:space="preserve"> </w:t>
-      </w:r>
-      <w:r>
-        <w:rPr>
-          <w:rStyle w:val="VerbatimChar"/>
-        </w:rPr>
-        <w:t xml:space="preserve">origin</w:t>
-      </w:r>
-      <w:r>
-        <w:t xml:space="preserve"> </w:t>
-      </w:r>
-      <w:r>
-        <w:t xml:space="preserve">remote is already fan-out (1 fetch URL + 4 push URLs) — a single</w:t>
-      </w:r>
-      <w:r>
-        <w:t xml:space="preserve"> </w:t>
-      </w:r>
-      <w:r>
-        <w:rPr>
-          <w:rStyle w:val="VerbatimChar"/>
-        </w:rPr>
-        <w:t xml:space="preserve">git push origin &lt;branch&gt;</w:t>
-      </w:r>
-      <w:r>
-        <w:t xml:space="preserve"> </w:t>
-      </w:r>
-      <w:r>
-        <w:t xml:space="preserve">propagates to all four hosts. Per-host naming intentionally matches each provider's brand capitalization; do not normalize.</w:t>
-      </w:r>
-    </w:p>
-    <w:bookmarkEnd w:id="21"/>
-    <w:bookmarkStart w:id="22" w:name="forbidden-in-this-project"/>
-    <w:p>
-      <w:pPr>
-        <w:pStyle w:val="Heading3"/>
-      </w:pPr>
-      <w:r>
-        <w:t xml:space="preserve">Forbidden in this project</w:t>
+        <w:t xml:space="preserve">/</w:t>
+      </w:r>
+      <w:r>
+        <w:t xml:space="preserve"> </w:t>
+      </w:r>
+      <w:r>
+        <w:rPr>
+          <w:rStyle w:val="VerbatimChar"/>
+        </w:rPr>
+        <w:t xml:space="preserve">AGENTS.md</w:t>
+      </w:r>
+      <w:r>
+        <w:t xml:space="preserve"> </w:t>
+      </w:r>
+      <w:r>
+        <w:t xml:space="preserve">/</w:t>
+      </w:r>
+      <w:r>
+        <w:t xml:space="preserve"> </w:t>
+      </w:r>
+      <w:r>
+        <w:rPr>
+          <w:rStyle w:val="VerbatimChar"/>
+        </w:rPr>
+        <w:t xml:space="preserve">QWEN.md</w:t>
+      </w:r>
+      <w:r>
+        <w:t xml:space="preserve"> </w:t>
+      </w:r>
+      <w:r>
+        <w:t xml:space="preserve">as §11.4.105 (the root-§ being added on the constitution stream) and inherited here per §11.4.35 — the agent restates + cites, never redefines or weakens.</w:t>
       </w:r>
     </w:p>
     <w:p>
@@ -5510,69 +5468,145 @@
           <w:b/>
           <w:bCs/>
         </w:rPr>
-        <w:t xml:space="preserve">Re-adding a</w:t>
-      </w:r>
-      <w:r>
-        <w:rPr>
-          <w:b/>
-          <w:bCs/>
-        </w:rPr>
-        <w:t xml:space="preserve"> </w:t>
-      </w:r>
-      <w:r>
-        <w:rPr>
-          <w:rStyle w:val="VerbatimChar"/>
-          <w:b/>
-          <w:bCs/>
-        </w:rPr>
-        <w:t xml:space="preserve">constitution/</w:t>
-      </w:r>
-      <w:r>
-        <w:rPr>
-          <w:b/>
-          <w:bCs/>
-        </w:rPr>
-        <w:t xml:space="preserve"> </w:t>
-      </w:r>
-      <w:r>
-        <w:rPr>
-          <w:b/>
-          <w:bCs/>
-        </w:rPr>
-        <w:t xml:space="preserve">submodule inside Herald.</w:t>
-      </w:r>
-      <w:r>
-        <w:t xml:space="preserve"> </w:t>
-      </w:r>
-      <w:r>
-        <w:t xml:space="preserve">Herald is consumed as a submodule of a parent project that already provides</w:t>
-      </w:r>
-      <w:r>
-        <w:t xml:space="preserve"> </w:t>
-      </w:r>
-      <w:r>
-        <w:rPr>
-          <w:rStyle w:val="VerbatimChar"/>
-        </w:rPr>
-        <w:t xml:space="preserve">constitution/</w:t>
-      </w:r>
-      <w:r>
-        <w:t xml:space="preserve">. A duplicate copy inside Herald is a deployment-model violation. The inheritance gate's invariant</w:t>
-      </w:r>
-      <w:r>
-        <w:t xml:space="preserve"> </w:t>
-      </w:r>
-      <w:r>
-        <w:rPr>
-          <w:rStyle w:val="VerbatimChar"/>
-        </w:rPr>
-        <w:t xml:space="preserve">I6</w:t>
-      </w:r>
-      <w:r>
-        <w:t xml:space="preserve"> </w:t>
-      </w:r>
-      <w:r>
-        <w:t xml:space="preserve">enforces this — re-adding it will turn the gate red.</w:t>
+        <w:t xml:space="preserve">Three-tier resolution (first tier that succeeds wins).</w:t>
+      </w:r>
+      <w:r>
+        <w:t xml:space="preserve"> </w:t>
+      </w:r>
+      <w:r>
+        <w:rPr>
+          <w:b/>
+          <w:bCs/>
+        </w:rPr>
+        <w:t xml:space="preserve">Tier 1 — command recognition:</w:t>
+      </w:r>
+      <w:r>
+        <w:t xml:space="preserve"> </w:t>
+      </w:r>
+      <w:r>
+        <w:t xml:space="preserve">a deterministic</w:t>
+      </w:r>
+      <w:r>
+        <w:t xml:space="preserve"> </w:t>
+      </w:r>
+      <w:r>
+        <w:rPr>
+          <w:rStyle w:val="VerbatimChar"/>
+        </w:rPr>
+        <w:t xml:space="preserve">CommandRecognizer</w:t>
+      </w:r>
+      <w:r>
+        <w:t xml:space="preserve"> </w:t>
+      </w:r>
+      <w:r>
+        <w:t xml:space="preserve">(</w:t>
+      </w:r>
+      <w:r>
+        <w:rPr>
+          <w:rStyle w:val="VerbatimChar"/>
+        </w:rPr>
+        <w:t xml:space="preserve">pherald/internal/inbound</w:t>
+      </w:r>
+      <w:r>
+        <w:t xml:space="preserve">) maps a clear natural-language imperative to a structured action WITHOUT an LLM round-trip (fast-path, no prefix). It is CONSERVATIVE — only a confident match fast-paths; when in doubt it returns "no match" and defers to Tier 2.</w:t>
+      </w:r>
+      <w:r>
+        <w:t xml:space="preserve"> </w:t>
+      </w:r>
+      <w:r>
+        <w:rPr>
+          <w:b/>
+          <w:bCs/>
+        </w:rPr>
+        <w:t xml:space="preserve">Tier 2 — intent inference:</w:t>
+      </w:r>
+      <w:r>
+        <w:t xml:space="preserve"> </w:t>
+      </w:r>
+      <w:r>
+        <w:t xml:space="preserve">when no command matches, the Claude Code dispatch (the LLM) infers intent and returns a</w:t>
+      </w:r>
+      <w:r>
+        <w:t xml:space="preserve"> </w:t>
+      </w:r>
+      <w:r>
+        <w:rPr>
+          <w:rStyle w:val="VerbatimChar"/>
+        </w:rPr>
+        <w:t xml:space="preserve">&lt;&lt;&lt;HERALD-REPLY&gt;&gt;&gt;</w:t>
+      </w:r>
+      <w:r>
+        <w:t xml:space="preserve"> </w:t>
+      </w:r>
+      <w:r>
+        <w:t xml:space="preserve">action; the</w:t>
+      </w:r>
+      <w:r>
+        <w:t xml:space="preserve"> </w:t>
+      </w:r>
+      <w:r>
+        <w:rPr>
+          <w:rStyle w:val="VerbatimChar"/>
+        </w:rPr>
+        <w:t xml:space="preserve">&lt;&lt;&lt;HERALD-DISPATCH-v1&gt;&gt;&gt;</w:t>
+      </w:r>
+      <w:r>
+        <w:t xml:space="preserve"> </w:t>
+      </w:r>
+      <w:r>
+        <w:t xml:space="preserve">envelope INSTRUCTS the LLM to recognize Herald's command set, map natural language to the right action, and NEVER guess.</w:t>
+      </w:r>
+      <w:r>
+        <w:t xml:space="preserve"> </w:t>
+      </w:r>
+      <w:r>
+        <w:rPr>
+          <w:b/>
+          <w:bCs/>
+        </w:rPr>
+        <w:t xml:space="preserve">Tier 3 — clarify (fallback):</w:t>
+      </w:r>
+      <w:r>
+        <w:t xml:space="preserve"> </w:t>
+      </w:r>
+      <w:r>
+        <w:t xml:space="preserve">when neither a command nor a confident intent can be determined,</w:t>
+      </w:r>
+      <w:r>
+        <w:t xml:space="preserve"> </w:t>
+      </w:r>
+      <w:r>
+        <w:rPr>
+          <w:rStyle w:val="VerbatimChar"/>
+        </w:rPr>
+        <w:t xml:space="preserve">action="clarify"</w:t>
+      </w:r>
+      <w:r>
+        <w:t xml:space="preserve"> </w:t>
+      </w:r>
+      <w:r>
+        <w:t xml:space="preserve">— the System REPLIES to the original message, TAGS the sender (</w:t>
+      </w:r>
+      <w:r>
+        <w:rPr>
+          <w:rStyle w:val="VerbatimChar"/>
+        </w:rPr>
+        <w:t xml:space="preserve">@username</w:t>
+      </w:r>
+      <w:r>
+        <w:t xml:space="preserve">, via the §11.4.104</w:t>
+      </w:r>
+      <w:r>
+        <w:t xml:space="preserve"> </w:t>
+      </w:r>
+      <w:r>
+        <w:rPr>
+          <w:rStyle w:val="VerbatimChar"/>
+        </w:rPr>
+        <w:t xml:space="preserve">IdentityResolver</w:t>
+      </w:r>
+      <w:r>
+        <w:t xml:space="preserve">), and asks a precise clarifying question naming the candidate intents.</w:t>
       </w:r>
     </w:p>
     <w:p>
@@ -5584,7 +5618,354 @@
         </w:numPr>
       </w:pPr>
       <w:r>
-        <w:t xml:space="preserve">Promoting Herald-specific values into the parent constitution (universal status must be EARNED; see Constitution §11.4 + §11.4.10).</w:t>
+        <w:rPr>
+          <w:b/>
+          <w:bCs/>
+        </w:rPr>
+        <w:t xml:space="preserve">Never guess, never ignore.</w:t>
+      </w:r>
+      <w:r>
+        <w:t xml:space="preserve"> </w:t>
+      </w:r>
+      <w:r>
+        <w:t xml:space="preserve">A wrong action is worse than a clarifying question (§11.4.6 no-guessing); the subscriber is never silently dropped and never has to learn syntax. The agent ships unit + integration + E2E + full-automation tests with real captured evidence under</w:t>
+      </w:r>
+      <w:r>
+        <w:t xml:space="preserve"> </w:t>
+      </w:r>
+      <w:r>
+        <w:rPr>
+          <w:rStyle w:val="VerbatimChar"/>
+        </w:rPr>
+        <w:t xml:space="preserve">docs/qa/&lt;run-id&gt;/</w:t>
+      </w:r>
+      <w:r>
+        <w:t xml:space="preserve"> </w:t>
+      </w:r>
+      <w:r>
+        <w:t xml:space="preserve">— a Tier-1 truth-table including the conservative negatives that MUST fall through to "no match", a Tier-3 E2E asserting the reply body is EXACTLY</w:t>
+      </w:r>
+      <w:r>
+        <w:t xml:space="preserve"> </w:t>
+      </w:r>
+      <w:r>
+        <w:rPr>
+          <w:rStyle w:val="VerbatimChar"/>
+        </w:rPr>
+        <w:t xml:space="preserve">@&lt;sender&gt; &lt;specific question&gt;</w:t>
+      </w:r>
+      <w:r>
+        <w:t xml:space="preserve">, and a paired §1.1 mutation (break the confidence guard or drop the clarify tag) that must FAIL (§107 / Helix §11.4 anti-bluff). Canonical authority: HelixConstitution Constitution.md §11.4.105 (inherited per §11.4.35); Herald contract</w:t>
+      </w:r>
+      <w:r>
+        <w:t xml:space="preserve"> </w:t>
+      </w:r>
+      <w:r>
+        <w:rPr>
+          <w:rStyle w:val="VerbatimChar"/>
+        </w:rPr>
+        <w:t xml:space="preserve">docs/design/INTENT_RECOGNITION.md</w:t>
+      </w:r>
+      <w:r>
+        <w:t xml:space="preserve">.</w:t>
+      </w:r>
+    </w:p>
+    <w:bookmarkEnd w:id="20"/>
+    <w:bookmarkStart w:id="21" w:name="X494e63fc2991a9d42fefb419b530ac9bef94c53"/>
+    <w:p>
+      <w:pPr>
+        <w:pStyle w:val="Heading3"/>
+      </w:pPr>
+      <w:r>
+        <w:t xml:space="preserve">Inheritance gate (run before any commit that touches root docs or</w:t>
+      </w:r>
+      <w:r>
+        <w:t xml:space="preserve"> </w:t>
+      </w:r>
+      <w:r>
+        <w:rPr>
+          <w:rStyle w:val="VerbatimChar"/>
+        </w:rPr>
+        <w:t xml:space="preserve">constitution/</w:t>
+      </w:r>
+      <w:r>
+        <w:t xml:space="preserve">)</w:t>
+      </w:r>
+    </w:p>
+    <w:p>
+      <w:pPr>
+        <w:pStyle w:val="SourceCode"/>
+      </w:pPr>
+      <w:r>
+        <w:rPr>
+          <w:rStyle w:val="FunctionTok"/>
+        </w:rPr>
+        <w:t xml:space="preserve">bash</w:t>
+      </w:r>
+      <w:r>
+        <w:rPr>
+          <w:rStyle w:val="NormalTok"/>
+        </w:rPr>
+        <w:t xml:space="preserve"> tests/test_constitution_inheritance.sh        </w:t>
+      </w:r>
+      <w:r>
+        <w:rPr>
+          <w:rStyle w:val="CommentTok"/>
+        </w:rPr>
+        <w:t xml:space="preserve"># the gate</w:t>
+      </w:r>
+      <w:r>
+        <w:br/>
+      </w:r>
+      <w:r>
+        <w:rPr>
+          <w:rStyle w:val="FunctionTok"/>
+        </w:rPr>
+        <w:t xml:space="preserve">bash</w:t>
+      </w:r>
+      <w:r>
+        <w:rPr>
+          <w:rStyle w:val="NormalTok"/>
+        </w:rPr>
+        <w:t xml:space="preserve"> tests/test_constitution_inheritance_meta.sh   </w:t>
+      </w:r>
+      <w:r>
+        <w:rPr>
+          <w:rStyle w:val="CommentTok"/>
+        </w:rPr>
+        <w:t xml:space="preserve"># paired mutation proof (§1.1)</w:t>
+      </w:r>
+    </w:p>
+    <w:p>
+      <w:pPr>
+        <w:pStyle w:val="FirstParagraph"/>
+      </w:pPr>
+      <w:r>
+        <w:t xml:space="preserve">Both MUST return 0. If either fails, fix at root cause per Constitution §11.4.4 — never silently accept the FAIL.</w:t>
+      </w:r>
+    </w:p>
+    <w:bookmarkEnd w:id="21"/>
+    <w:bookmarkStart w:id="22" w:name="X32120c2cbf4d615e5864fa1300f097d3beccf79"/>
+    <w:p>
+      <w:pPr>
+        <w:pStyle w:val="Heading3"/>
+      </w:pPr>
+      <w:r>
+        <w:t xml:space="preserve">Spec-change rule (load-bearing —</w:t>
+      </w:r>
+      <w:r>
+        <w:t xml:space="preserve"> </w:t>
+      </w:r>
+      <w:r>
+        <w:rPr>
+          <w:rStyle w:val="VerbatimChar"/>
+        </w:rPr>
+        <w:t xml:space="preserve">docs/specs/mvp/specification.V3.md</w:t>
+      </w:r>
+      <w:r>
+        <w:t xml:space="preserve"> </w:t>
+      </w:r>
+      <w:r>
+        <w:t xml:space="preserve">§"Specification documents")</w:t>
+      </w:r>
+    </w:p>
+    <w:p>
+      <w:pPr>
+        <w:pStyle w:val="FirstParagraph"/>
+      </w:pPr>
+      <w:r>
+        <w:t xml:space="preserve">Whenever</w:t>
+      </w:r>
+      <w:r>
+        <w:t xml:space="preserve"> </w:t>
+      </w:r>
+      <w:r>
+        <w:rPr>
+          <w:rStyle w:val="VerbatimChar"/>
+        </w:rPr>
+        <w:t xml:space="preserve">docs/specs/mvp/specification.V3.md</w:t>
+      </w:r>
+      <w:r>
+        <w:t xml:space="preserve"> </w:t>
+      </w:r>
+      <w:r>
+        <w:t xml:space="preserve">or any file under</w:t>
+      </w:r>
+      <w:r>
+        <w:t xml:space="preserve"> </w:t>
+      </w:r>
+      <w:r>
+        <w:rPr>
+          <w:rStyle w:val="VerbatimChar"/>
+        </w:rPr>
+        <w:t xml:space="preserve">docs/specs/</w:t>
+      </w:r>
+      <w:r>
+        <w:t xml:space="preserve"> </w:t>
+      </w:r>
+      <w:r>
+        <w:t xml:space="preserve">(any depth) is modified,</w:t>
+      </w:r>
+      <w:r>
+        <w:t xml:space="preserve"> </w:t>
+      </w:r>
+      <w:r>
+        <w:rPr>
+          <w:b/>
+          <w:bCs/>
+        </w:rPr>
+        <w:t xml:space="preserve">comprehensive planning and implementation of all changes is MANDATORY</w:t>
+      </w:r>
+      <w:r>
+        <w:t xml:space="preserve"> </w:t>
+      </w:r>
+      <w:r>
+        <w:t xml:space="preserve">— agents may not edit the spec in isolation. This rule does NOT apply to creating or renaming files; for those, ask the operator what to do with the new path. Treat every spec edit as a project-wide ripple, not a doc tweak.</w:t>
+      </w:r>
+    </w:p>
+    <w:p>
+      <w:pPr>
+        <w:pStyle w:val="BodyText"/>
+      </w:pPr>
+      <w:r>
+        <w:t xml:space="preserve">This rule is mirrored in</w:t>
+      </w:r>
+      <w:r>
+        <w:t xml:space="preserve"> </w:t>
+      </w:r>
+      <w:r>
+        <w:rPr>
+          <w:rStyle w:val="VerbatimChar"/>
+        </w:rPr>
+        <w:t xml:space="preserve">CLAUDE.md</w:t>
+      </w:r>
+      <w:r>
+        <w:t xml:space="preserve"> </w:t>
+      </w:r>
+      <w:r>
+        <w:t xml:space="preserve">and in</w:t>
+      </w:r>
+      <w:r>
+        <w:t xml:space="preserve"> </w:t>
+      </w:r>
+      <w:r>
+        <w:rPr>
+          <w:rStyle w:val="VerbatimChar"/>
+        </w:rPr>
+        <w:t xml:space="preserve">docs/guides/HERALD_CONSTITUTION.md</w:t>
+      </w:r>
+      <w:r>
+        <w:t xml:space="preserve"> </w:t>
+      </w:r>
+      <w:r>
+        <w:t xml:space="preserve">§106. The inheritance gate's invariant</w:t>
+      </w:r>
+      <w:r>
+        <w:t xml:space="preserve"> </w:t>
+      </w:r>
+      <w:r>
+        <w:rPr>
+          <w:b/>
+          <w:bCs/>
+        </w:rPr>
+        <w:t xml:space="preserve">I7a–c</w:t>
+      </w:r>
+      <w:r>
+        <w:t xml:space="preserve"> </w:t>
+      </w:r>
+      <w:r>
+        <w:t xml:space="preserve">asserts the rule anchor (</w:t>
+      </w:r>
+      <w:r>
+        <w:rPr>
+          <w:rStyle w:val="VerbatimChar"/>
+        </w:rPr>
+        <w:t xml:space="preserve">comprehensive planning and implementation</w:t>
+      </w:r>
+      <w:r>
+        <w:t xml:space="preserve">) is present in all three files; a missing copy is a §1.1 propagation bluff and the gate FAILs.</w:t>
+      </w:r>
+    </w:p>
+    <w:bookmarkEnd w:id="22"/>
+    <w:bookmarkStart w:id="23" w:name="X6198677d4a246aad02e8f663e73cd694bf6928c"/>
+    <w:p>
+      <w:pPr>
+        <w:pStyle w:val="Heading3"/>
+      </w:pPr>
+      <w:r>
+        <w:t xml:space="preserve">Multi-host mirror convention (Herald's own upstreams)</w:t>
+      </w:r>
+    </w:p>
+    <w:p>
+      <w:pPr>
+        <w:pStyle w:val="FirstParagraph"/>
+      </w:pPr>
+      <w:r>
+        <w:rPr>
+          <w:rStyle w:val="VerbatimChar"/>
+        </w:rPr>
+        <w:t xml:space="preserve">upstreams/</w:t>
+      </w:r>
+      <w:r>
+        <w:t xml:space="preserve"> </w:t>
+      </w:r>
+      <w:r>
+        <w:t xml:space="preserve">contains one script per mirror host (GitHub, GitLab, GitFlic, GitVerse). Each script exports</w:t>
+      </w:r>
+      <w:r>
+        <w:t xml:space="preserve"> </w:t>
+      </w:r>
+      <w:r>
+        <w:rPr>
+          <w:rStyle w:val="VerbatimChar"/>
+        </w:rPr>
+        <w:t xml:space="preserve">UPSTREAMABLE_REPOSITORY</w:t>
+      </w:r>
+      <w:r>
+        <w:t xml:space="preserve"> </w:t>
+      </w:r>
+      <w:r>
+        <w:t xml:space="preserve">and is sourced, not executed. The Herald repo's</w:t>
+      </w:r>
+      <w:r>
+        <w:t xml:space="preserve"> </w:t>
+      </w:r>
+      <w:r>
+        <w:rPr>
+          <w:rStyle w:val="VerbatimChar"/>
+        </w:rPr>
+        <w:t xml:space="preserve">origin</w:t>
+      </w:r>
+      <w:r>
+        <w:t xml:space="preserve"> </w:t>
+      </w:r>
+      <w:r>
+        <w:t xml:space="preserve">remote is already fan-out (1 fetch URL + 4 push URLs) — a single</w:t>
+      </w:r>
+      <w:r>
+        <w:t xml:space="preserve"> </w:t>
+      </w:r>
+      <w:r>
+        <w:rPr>
+          <w:rStyle w:val="VerbatimChar"/>
+        </w:rPr>
+        <w:t xml:space="preserve">git push origin &lt;branch&gt;</w:t>
+      </w:r>
+      <w:r>
+        <w:t xml:space="preserve"> </w:t>
+      </w:r>
+      <w:r>
+        <w:t xml:space="preserve">propagates to all four hosts. Per-host naming intentionally matches each provider's brand capitalization; do not normalize.</w:t>
+      </w:r>
+    </w:p>
+    <w:bookmarkEnd w:id="23"/>
+    <w:bookmarkStart w:id="24" w:name="forbidden-in-this-project"/>
+    <w:p>
+      <w:pPr>
+        <w:pStyle w:val="Heading3"/>
+      </w:pPr>
+      <w:r>
+        <w:t xml:space="preserve">Forbidden in this project</w:t>
       </w:r>
     </w:p>
     <w:p>
@@ -5592,26 +5973,77 @@
         <w:pStyle w:val="Compact"/>
         <w:numPr>
           <w:ilvl w:val="0"/>
-          <w:numId w:val="1008"/>
+          <w:numId w:val="1009"/>
         </w:numPr>
       </w:pPr>
       <w:r>
-        <w:t xml:space="preserve">Modifying any file under the discovered</w:t>
-      </w:r>
-      <w:r>
-        <w:t xml:space="preserve"> </w:t>
-      </w:r>
-      <w:r>
-        <w:rPr>
-          <w:rStyle w:val="VerbatimChar"/>
+        <w:rPr>
+          <w:b/>
+          <w:bCs/>
+        </w:rPr>
+        <w:t xml:space="preserve">Re-adding a</w:t>
+      </w:r>
+      <w:r>
+        <w:rPr>
+          <w:b/>
+          <w:bCs/>
+        </w:rPr>
+        <w:t xml:space="preserve"> </w:t>
+      </w:r>
+      <w:r>
+        <w:rPr>
+          <w:rStyle w:val="VerbatimChar"/>
+          <w:b/>
+          <w:bCs/>
         </w:rPr>
         <w:t xml:space="preserve">constitution/</w:t>
       </w:r>
       <w:r>
-        <w:t xml:space="preserve"> </w:t>
-      </w:r>
-      <w:r>
-        <w:t xml:space="preserve">from Herald commits — the parent's constitution is read-only from Herald's perspective. Constitution changes go through the HelixConstitution repo directly.</w:t>
+        <w:rPr>
+          <w:b/>
+          <w:bCs/>
+        </w:rPr>
+        <w:t xml:space="preserve"> </w:t>
+      </w:r>
+      <w:r>
+        <w:rPr>
+          <w:b/>
+          <w:bCs/>
+        </w:rPr>
+        <w:t xml:space="preserve">submodule inside Herald.</w:t>
+      </w:r>
+      <w:r>
+        <w:t xml:space="preserve"> </w:t>
+      </w:r>
+      <w:r>
+        <w:t xml:space="preserve">Herald is consumed as a submodule of a parent project that already provides</w:t>
+      </w:r>
+      <w:r>
+        <w:t xml:space="preserve"> </w:t>
+      </w:r>
+      <w:r>
+        <w:rPr>
+          <w:rStyle w:val="VerbatimChar"/>
+        </w:rPr>
+        <w:t xml:space="preserve">constitution/</w:t>
+      </w:r>
+      <w:r>
+        <w:t xml:space="preserve">. A duplicate copy inside Herald is a deployment-model violation. The inheritance gate's invariant</w:t>
+      </w:r>
+      <w:r>
+        <w:t xml:space="preserve"> </w:t>
+      </w:r>
+      <w:r>
+        <w:rPr>
+          <w:rStyle w:val="VerbatimChar"/>
+        </w:rPr>
+        <w:t xml:space="preserve">I6</w:t>
+      </w:r>
+      <w:r>
+        <w:t xml:space="preserve"> </w:t>
+      </w:r>
+      <w:r>
+        <w:t xml:space="preserve">enforces this — re-adding it will turn the gate red.</w:t>
       </w:r>
     </w:p>
     <w:p>
@@ -5619,10 +6051,49 @@
         <w:pStyle w:val="Compact"/>
         <w:numPr>
           <w:ilvl w:val="0"/>
-          <w:numId w:val="1008"/>
+          <w:numId w:val="1009"/>
         </w:numPr>
       </w:pPr>
       <w:r>
+        <w:t xml:space="preserve">Promoting Herald-specific values into the parent constitution (universal status must be EARNED; see Constitution §11.4 + §11.4.10).</w:t>
+      </w:r>
+    </w:p>
+    <w:p>
+      <w:pPr>
+        <w:pStyle w:val="Compact"/>
+        <w:numPr>
+          <w:ilvl w:val="0"/>
+          <w:numId w:val="1009"/>
+        </w:numPr>
+      </w:pPr>
+      <w:r>
+        <w:t xml:space="preserve">Modifying any file under the discovered</w:t>
+      </w:r>
+      <w:r>
+        <w:t xml:space="preserve"> </w:t>
+      </w:r>
+      <w:r>
+        <w:rPr>
+          <w:rStyle w:val="VerbatimChar"/>
+        </w:rPr>
+        <w:t xml:space="preserve">constitution/</w:t>
+      </w:r>
+      <w:r>
+        <w:t xml:space="preserve"> </w:t>
+      </w:r>
+      <w:r>
+        <w:t xml:space="preserve">from Herald commits — the parent's constitution is read-only from Herald's perspective. Constitution changes go through the HelixConstitution repo directly.</w:t>
+      </w:r>
+    </w:p>
+    <w:p>
+      <w:pPr>
+        <w:pStyle w:val="Compact"/>
+        <w:numPr>
+          <w:ilvl w:val="0"/>
+          <w:numId w:val="1009"/>
+        </w:numPr>
+      </w:pPr>
+      <w:r>
         <w:t xml:space="preserve">Adding new submodules without re-running</w:t>
       </w:r>
       <w:r>
@@ -5641,9 +6112,9 @@
         <w:t xml:space="preserve">afterward.</w:t>
       </w:r>
     </w:p>
-    <w:bookmarkEnd w:id="22"/>
-    <w:bookmarkEnd w:id="23"/>
     <w:bookmarkEnd w:id="24"/>
+    <w:bookmarkEnd w:id="25"/>
+    <w:bookmarkEnd w:id="26"/>
     <w:sectPr>
       <w:footnotePr>
         <w:numRestart w:val="eachSect"/>
@@ -5882,6 +6353,9 @@
     <w:abstractNumId w:val="991"/>
   </w:num>
   <w:num w:numId="1008">
+    <w:abstractNumId w:val="991"/>
+  </w:num>
+  <w:num w:numId="1009">
     <w:abstractNumId w:val="991"/>
   </w:num>
 </w:numbering>

</xml_diff>

<commit_message>
docs(status): refresh stale project-status prose in CLAUDE.md + AGENTS.md to current reality (integrate S4 stream)
Integrated a parallel worktree stream (bb3e9e2) that refreshed the badly-stale 'pre-implementation / first-implementation-cycle r1 / Go-scaffold, 5 modules' project-status prose. The stream branched from a stale base (790341c, pre-§11.4.106) so a 3-way apply was used: took main's r19/r16 headers (preserving the §11.4.104/105/106 propagation + spec-V4 path-sync) + the stream's project-status prose (18 modules, waves 2-7, v0.6.0, HRD-010/011/012/016 LIVE, live adapters/dispatch/REST). Fixed the spec-pointer description (V4 has substantive content, not 'TBD'). CLAUDE r19→20, AGENTS r16→17. Inheritance gate 15/15 PASS; siblings regenerated.

Co-Authored-By: Claude Opus 4.8 <noreply@anthropic.com>
</commit_message>
<xml_diff>
--- a/AGENTS.docx
+++ b/AGENTS.docx
@@ -75,7 +75,7 @@
               <w:pStyle w:val="Compact"/>
             </w:pPr>
             <w:r>
-              <w:t xml:space="preserve">16</w:t>
+              <w:t xml:space="preserve">17</w:t>
             </w:r>
           </w:p>
         </w:tc>
@@ -171,7 +171,54 @@
               <w:pStyle w:val="Compact"/>
             </w:pPr>
             <w:r>
-              <w:t xml:space="preserve">r16: propagated HelixConstitution §11.4.106 (Docs Chain documentation-sync mandate, 2026-05-29) into the agent-rule inherited-covenant cluster as a short-form</w:t>
+              <w:t xml:space="preserve">r17: refreshed the stale "pre-implementation (2026-05-15) / Go-scaffold landed, 5 modules" project-status prose to current reality —</w:t>
+            </w:r>
+            <w:r>
+              <w:t xml:space="preserve"> </w:t>
+            </w:r>
+            <w:r>
+              <w:rPr>
+                <w:b/>
+                <w:bCs/>
+              </w:rPr>
+              <w:t xml:space="preserve">18</w:t>
+            </w:r>
+            <w:r>
+              <w:t xml:space="preserve"> </w:t>
+            </w:r>
+            <w:r>
+              <w:t xml:space="preserve">workspace modules (10 shared/foundation + 8 flavor binaries), waves 2–7 shipped, tag</w:t>
+            </w:r>
+            <w:r>
+              <w:t xml:space="preserve"> </w:t>
+            </w:r>
+            <w:r>
+              <w:rPr>
+                <w:b/>
+                <w:bCs/>
+              </w:rPr>
+              <w:t xml:space="preserve">v0.6.0</w:t>
+            </w:r>
+            <w:r>
+              <w:t xml:space="preserve"> </w:t>
+            </w:r>
+            <w:r>
+              <w:t xml:space="preserve">(2026-05-28), live</w:t>
+            </w:r>
+            <w:r>
+              <w:t xml:space="preserve"> </w:t>
+            </w:r>
+            <w:r>
+              <w:rPr>
+                <w:rStyle w:val="VerbatimChar"/>
+              </w:rPr>
+              <w:t xml:space="preserve">pherald listen</w:t>
+            </w:r>
+            <w:r>
+              <w:t xml:space="preserve"> </w:t>
+            </w:r>
+            <w:r>
+              <w:t xml:space="preserve">inbound runtime + Claude Code dispatch + Telegram &amp; Slack adapters + REST API + participant-attribution (§11.4.104) + intent-recognition (§11.4.105) + Docs Chain (§11.4.106); HRD-010/011/012/016 now LIVE; ~a-dozen open HRDs remain. Status prose ONLY — covenant/build/anti-bluff/inheritance content unchanged (merged from a parallel stream's worktree; took main's r16 §11.4.106 header + the stream's project-status prose). Prior r16: propagated HelixConstitution §11.4.106 (Docs Chain documentation-sync mandate, 2026-05-29) into the agent-rule inherited-covenant cluster as a short-form</w:t>
             </w:r>
             <w:r>
               <w:t xml:space="preserve"> </w:t>
@@ -753,7 +800,22 @@
               <w:pStyle w:val="Compact"/>
             </w:pPr>
             <w:r>
-              <w:t xml:space="preserve">bump again when first-implementation cycle completes HRD-010..HRD-012/HRD-016 live integrations.</w:t>
+              <w:t xml:space="preserve">bump again when the remaining open evidence-gated HRDs in</w:t>
+            </w:r>
+            <w:r>
+              <w:t xml:space="preserve"> </w:t>
+            </w:r>
+            <w:r>
+              <w:rPr>
+                <w:rStyle w:val="VerbatimChar"/>
+              </w:rPr>
+              <w:t xml:space="preserve">docs/Issues.md</w:t>
+            </w:r>
+            <w:r>
+              <w:t xml:space="preserve"> </w:t>
+            </w:r>
+            <w:r>
+              <w:t xml:space="preserve">close and the next release tag (post-v0.6.0) lands.</w:t>
             </w:r>
           </w:p>
         </w:tc>
@@ -1531,20 +1593,39 @@
         <w:pStyle w:val="FirstParagraph"/>
       </w:pPr>
       <w:r>
-        <w:t xml:space="preserve">Herald is</w:t>
-      </w:r>
-      <w:r>
-        <w:t xml:space="preserve"> </w:t>
-      </w:r>
-      <w:r>
-        <w:rPr>
-          <w:b/>
-          <w:bCs/>
-        </w:rPr>
-        <w:t xml:space="preserve">pre-implementation</w:t>
-      </w:r>
-      <w:r>
-        <w:t xml:space="preserve">. As of 2026-05-15 the repo contains:</w:t>
+        <w:t xml:space="preserve">Herald is in</w:t>
+      </w:r>
+      <w:r>
+        <w:t xml:space="preserve"> </w:t>
+      </w:r>
+      <w:r>
+        <w:rPr>
+          <w:b/>
+          <w:bCs/>
+        </w:rPr>
+        <w:t xml:space="preserve">active multi-wave implementation</w:t>
+      </w:r>
+      <w:r>
+        <w:t xml:space="preserve"> </w:t>
+      </w:r>
+      <w:r>
+        <w:t xml:space="preserve">as of 2026-05-31 — waves 2 through 7 have shipped and the latest tag is</w:t>
+      </w:r>
+      <w:r>
+        <w:t xml:space="preserve"> </w:t>
+      </w:r>
+      <w:r>
+        <w:rPr>
+          <w:b/>
+          <w:bCs/>
+        </w:rPr>
+        <w:t xml:space="preserve">v0.6.0</w:t>
+      </w:r>
+      <w:r>
+        <w:t xml:space="preserve"> </w:t>
+      </w:r>
+      <w:r>
+        <w:t xml:space="preserve">(2026-05-28). The repo contains:</w:t>
       </w:r>
     </w:p>
     <w:p>
@@ -1586,7 +1667,19 @@
         <w:t xml:space="preserve"> </w:t>
       </w:r>
       <w:r>
-        <w:t xml:space="preserve">— MVP spec (section headings only; substantive content TBD).</w:t>
+        <w:t xml:space="preserve">— MVP spec (participant-attribution §11.4.104 + intent-recognition §11.4.105 incorporated; prior V-series archived under</w:t>
+      </w:r>
+      <w:r>
+        <w:t xml:space="preserve"> </w:t>
+      </w:r>
+      <w:r>
+        <w:rPr>
+          <w:rStyle w:val="VerbatimChar"/>
+        </w:rPr>
+        <w:t xml:space="preserve">docs/specs/mvp/archive/</w:t>
+      </w:r>
+      <w:r>
+        <w:t xml:space="preserve">).</w:t>
       </w:r>
     </w:p>
     <w:p>
@@ -1790,13 +1883,29 @@
           <w:b/>
           <w:bCs/>
         </w:rPr>
-        <w:t xml:space="preserve">As of 2026-05-20</w:t>
-      </w:r>
-      <w:r>
-        <w:t xml:space="preserve"> </w:t>
-      </w:r>
-      <w:r>
-        <w:t xml:space="preserve">the Go scaffold landed (first-implementation cycle r1). 5 Go modules (</w:t>
+        <w:t xml:space="preserve">As of 2026-05-31</w:t>
+      </w:r>
+      <w:r>
+        <w:t xml:space="preserve"> </w:t>
+      </w:r>
+      <w:r>
+        <w:t xml:space="preserve">the codebase spans</w:t>
+      </w:r>
+      <w:r>
+        <w:t xml:space="preserve"> </w:t>
+      </w:r>
+      <w:r>
+        <w:rPr>
+          <w:b/>
+          <w:bCs/>
+        </w:rPr>
+        <w:t xml:space="preserve">18</w:t>
+      </w:r>
+      <w:r>
+        <w:t xml:space="preserve"> </w:t>
+      </w:r>
+      <w:r>
+        <w:t xml:space="preserve">Go workspace modules: 10 shared/foundation (</w:t>
       </w:r>
       <w:r>
         <w:rPr>
@@ -1814,6 +1923,54 @@
         <w:rPr>
           <w:rStyle w:val="VerbatimChar"/>
         </w:rPr>
+        <w:t xml:space="preserve">commons_auth</w:t>
+      </w:r>
+      <w:r>
+        <w:t xml:space="preserve">,</w:t>
+      </w:r>
+      <w:r>
+        <w:t xml:space="preserve"> </w:t>
+      </w:r>
+      <w:r>
+        <w:rPr>
+          <w:rStyle w:val="VerbatimChar"/>
+        </w:rPr>
+        <w:t xml:space="preserve">commons_constitution</w:t>
+      </w:r>
+      <w:r>
+        <w:t xml:space="preserve">,</w:t>
+      </w:r>
+      <w:r>
+        <w:t xml:space="preserve"> </w:t>
+      </w:r>
+      <w:r>
+        <w:rPr>
+          <w:rStyle w:val="VerbatimChar"/>
+        </w:rPr>
+        <w:t xml:space="preserve">commons_infra</w:t>
+      </w:r>
+      <w:r>
+        <w:t xml:space="preserve">,</w:t>
+      </w:r>
+      <w:r>
+        <w:t xml:space="preserve"> </w:t>
+      </w:r>
+      <w:r>
+        <w:rPr>
+          <w:rStyle w:val="VerbatimChar"/>
+        </w:rPr>
+        <w:t xml:space="preserve">commons_messaging</w:t>
+      </w:r>
+      <w:r>
+        <w:t xml:space="preserve">,</w:t>
+      </w:r>
+      <w:r>
+        <w:t xml:space="preserve"> </w:t>
+      </w:r>
+      <w:r>
+        <w:rPr>
+          <w:rStyle w:val="VerbatimChar"/>
+        </w:rPr>
         <w:t xml:space="preserve">commons_prefix</w:t>
       </w:r>
       <w:r>
@@ -1826,7 +1983,7 @@
         <w:rPr>
           <w:rStyle w:val="VerbatimChar"/>
         </w:rPr>
-        <w:t xml:space="preserve">commons_messaging</w:t>
+        <w:t xml:space="preserve">commons_storage</w:t>
       </w:r>
       <w:r>
         <w:t xml:space="preserve">,</w:t>
@@ -1838,106 +1995,271 @@
         <w:rPr>
           <w:rStyle w:val="VerbatimChar"/>
         </w:rPr>
+        <w:t xml:space="preserve">commons_tls</w:t>
+      </w:r>
+      <w:r>
+        <w:t xml:space="preserve">,</w:t>
+      </w:r>
+      <w:r>
+        <w:t xml:space="preserve"> </w:t>
+      </w:r>
+      <w:r>
+        <w:rPr>
+          <w:rStyle w:val="VerbatimChar"/>
+        </w:rPr>
+        <w:t xml:space="preserve">commons_watch</w:t>
+      </w:r>
+      <w:r>
+        <w:t xml:space="preserve">,</w:t>
+      </w:r>
+      <w:r>
+        <w:t xml:space="preserve"> </w:t>
+      </w:r>
+      <w:r>
+        <w:rPr>
+          <w:rStyle w:val="VerbatimChar"/>
+        </w:rPr>
+        <w:t xml:space="preserve">commons_workable</w:t>
+      </w:r>
+      <w:r>
+        <w:t xml:space="preserve">) + 8 flavor binaries (</w:t>
+      </w:r>
+      <w:r>
+        <w:rPr>
+          <w:rStyle w:val="VerbatimChar"/>
+        </w:rPr>
+        <w:t xml:space="preserve">pherald</w:t>
+      </w:r>
+      <w:r>
+        <w:t xml:space="preserve">,</w:t>
+      </w:r>
+      <w:r>
+        <w:t xml:space="preserve"> </w:t>
+      </w:r>
+      <w:r>
+        <w:rPr>
+          <w:rStyle w:val="VerbatimChar"/>
+        </w:rPr>
+        <w:t xml:space="preserve">sherald</w:t>
+      </w:r>
+      <w:r>
+        <w:t xml:space="preserve">,</w:t>
+      </w:r>
+      <w:r>
+        <w:t xml:space="preserve"> </w:t>
+      </w:r>
+      <w:r>
+        <w:rPr>
+          <w:rStyle w:val="VerbatimChar"/>
+        </w:rPr>
+        <w:t xml:space="preserve">cherald</w:t>
+      </w:r>
+      <w:r>
+        <w:t xml:space="preserve">,</w:t>
+      </w:r>
+      <w:r>
+        <w:t xml:space="preserve"> </w:t>
+      </w:r>
+      <w:r>
+        <w:rPr>
+          <w:rStyle w:val="VerbatimChar"/>
+        </w:rPr>
+        <w:t xml:space="preserve">bherald</w:t>
+      </w:r>
+      <w:r>
+        <w:t xml:space="preserve">,</w:t>
+      </w:r>
+      <w:r>
+        <w:t xml:space="preserve"> </w:t>
+      </w:r>
+      <w:r>
+        <w:rPr>
+          <w:rStyle w:val="VerbatimChar"/>
+        </w:rPr>
+        <w:t xml:space="preserve">rherald</w:t>
+      </w:r>
+      <w:r>
+        <w:t xml:space="preserve">,</w:t>
+      </w:r>
+      <w:r>
+        <w:t xml:space="preserve"> </w:t>
+      </w:r>
+      <w:r>
+        <w:rPr>
+          <w:rStyle w:val="VerbatimChar"/>
+        </w:rPr>
+        <w:t xml:space="preserve">iherald</w:t>
+      </w:r>
+      <w:r>
+        <w:t xml:space="preserve">,</w:t>
+      </w:r>
+      <w:r>
+        <w:t xml:space="preserve"> </w:t>
+      </w:r>
+      <w:r>
+        <w:rPr>
+          <w:rStyle w:val="VerbatimChar"/>
+        </w:rPr>
+        <w:t xml:space="preserve">scherald</w:t>
+      </w:r>
+      <w:r>
+        <w:t xml:space="preserve">,</w:t>
+      </w:r>
+      <w:r>
+        <w:t xml:space="preserve"> </w:t>
+      </w:r>
+      <w:r>
+        <w:rPr>
+          <w:rStyle w:val="VerbatimChar"/>
+        </w:rPr>
+        <w:t xml:space="preserve">qaherald</w:t>
+      </w:r>
+      <w:r>
+        <w:t xml:space="preserve">). The full §11.0 type contract is realized in</w:t>
+      </w:r>
+      <w:r>
+        <w:t xml:space="preserve"> </w:t>
+      </w:r>
+      <w:r>
+        <w:rPr>
+          <w:rStyle w:val="VerbatimChar"/>
+        </w:rPr>
+        <w:t xml:space="preserve">commons/types.go</w:t>
+      </w:r>
+      <w:r>
+        <w:t xml:space="preserve">. Live and tested: the</w:t>
+      </w:r>
+      <w:r>
+        <w:t xml:space="preserve"> </w:t>
+      </w:r>
+      <w:r>
+        <w:rPr>
+          <w:rStyle w:val="VerbatimChar"/>
+        </w:rPr>
+        <w:t xml:space="preserve">null://</w:t>
+      </w:r>
+      <w:r>
+        <w:t xml:space="preserve"> </w:t>
+      </w:r>
+      <w:r>
+        <w:t xml:space="preserve">sandbox adapter, the Telegram adapter (</w:t>
+      </w:r>
+      <w:r>
+        <w:rPr>
+          <w:rStyle w:val="VerbatimChar"/>
+        </w:rPr>
+        <w:t xml:space="preserve">getUpdates</w:t>
+      </w:r>
+      <w:r>
+        <w:t xml:space="preserve"> </w:t>
+      </w:r>
+      <w:r>
+        <w:t xml:space="preserve">long-poll + send + reply +</w:t>
+      </w:r>
+      <w:r>
+        <w:t xml:space="preserve"> </w:t>
+      </w:r>
+      <w:r>
+        <w:rPr>
+          <w:rStyle w:val="VerbatimChar"/>
+        </w:rPr>
+        <w:t xml:space="preserve">@</w:t>
+      </w:r>
+      <w:r>
+        <w:t xml:space="preserve">-mention render driving</w:t>
+      </w:r>
+      <w:r>
+        <w:t xml:space="preserve"> </w:t>
+      </w:r>
+      <w:r>
+        <w:rPr>
+          <w:rStyle w:val="VerbatimChar"/>
+        </w:rPr>
+        <w:t xml:space="preserve">pherald listen</w:t>
+      </w:r>
+      <w:r>
+        <w:t xml:space="preserve">), the Slack adapter (Wave 7), the Claude Code dispatcher (live</w:t>
+      </w:r>
+      <w:r>
+        <w:t xml:space="preserve"> </w:t>
+      </w:r>
+      <w:r>
+        <w:rPr>
+          <w:rStyle w:val="VerbatimChar"/>
+        </w:rPr>
+        <w:t xml:space="preserve">claude</w:t>
+      </w:r>
+      <w:r>
+        <w:t xml:space="preserve"> </w:t>
+      </w:r>
+      <w:r>
+        <w:t xml:space="preserve">invocation, Opus pinned, per-message timeout),</w:t>
+      </w:r>
+      <w:r>
+        <w:t xml:space="preserve"> </w:t>
+      </w:r>
+      <w:r>
+        <w:rPr>
+          <w:rStyle w:val="VerbatimChar"/>
+        </w:rPr>
         <w:t xml:space="preserve">commons_storage</w:t>
       </w:r>
       <w:r>
-        <w:t xml:space="preserve">,</w:t>
-      </w:r>
-      <w:r>
-        <w:t xml:space="preserve"> </w:t>
-      </w:r>
-      <w:r>
-        <w:rPr>
-          <w:rStyle w:val="VerbatimChar"/>
-        </w:rPr>
-        <w:t xml:space="preserve">pherald</w:t>
-      </w:r>
-      <w:r>
-        <w:t xml:space="preserve">) compile + unit tests pass.</w:t>
-      </w:r>
-      <w:r>
-        <w:t xml:space="preserve"> </w:t>
-      </w:r>
-      <w:r>
-        <w:rPr>
-          <w:rStyle w:val="VerbatimChar"/>
-        </w:rPr>
-        <w:t xml:space="preserve">pherald version --json</w:t>
-      </w:r>
-      <w:r>
-        <w:t xml:space="preserve"> </w:t>
-      </w:r>
-      <w:r>
-        <w:t xml:space="preserve">returns build info. The full §11.0 type contract is realized in</w:t>
-      </w:r>
-      <w:r>
-        <w:t xml:space="preserve"> </w:t>
-      </w:r>
-      <w:r>
-        <w:rPr>
-          <w:rStyle w:val="VerbatimChar"/>
-        </w:rPr>
-        <w:t xml:space="preserve">commons/types.go</w:t>
-      </w:r>
-      <w:r>
-        <w:t xml:space="preserve">. The</w:t>
-      </w:r>
-      <w:r>
-        <w:t xml:space="preserve"> </w:t>
-      </w:r>
-      <w:r>
-        <w:rPr>
-          <w:rStyle w:val="VerbatimChar"/>
-        </w:rPr>
-        <w:t xml:space="preserve">null://</w:t>
-      </w:r>
-      <w:r>
-        <w:t xml:space="preserve"> </w:t>
-      </w:r>
-      <w:r>
-        <w:t xml:space="preserve">sandbox adapter is fully working with 8 unit tests. SQL migrations 000001..000005 embedded via</w:t>
-      </w:r>
-      <w:r>
-        <w:t xml:space="preserve"> </w:t>
-      </w:r>
-      <w:r>
-        <w:rPr>
-          <w:rStyle w:val="VerbatimChar"/>
-        </w:rPr>
-        <w:t xml:space="preserve">//go:embed</w:t>
-      </w:r>
-      <w:r>
-        <w:t xml:space="preserve">. Docker/Podman Compose for §26.5 Quickstart shipped under</w:t>
-      </w:r>
-      <w:r>
-        <w:t xml:space="preserve"> </w:t>
-      </w:r>
-      <w:r>
-        <w:rPr>
-          <w:rStyle w:val="VerbatimChar"/>
-        </w:rPr>
-        <w:t xml:space="preserve">quickstart/</w:t>
-      </w:r>
-      <w:r>
-        <w:t xml:space="preserve"> </w:t>
-      </w:r>
-      <w:r>
-        <w:t xml:space="preserve">(migrated from</w:t>
-      </w:r>
-      <w:r>
-        <w:t xml:space="preserve"> </w:t>
-      </w:r>
-      <w:r>
-        <w:rPr>
-          <w:rStyle w:val="VerbatimChar"/>
-        </w:rPr>
-        <w:t xml:space="preserve">containers/quickstart/</w:t>
-      </w:r>
-      <w:r>
-        <w:t xml:space="preserve"> </w:t>
-      </w:r>
-      <w:r>
-        <w:t xml:space="preserve">when the</w:t>
+        <w:t xml:space="preserve"> </w:t>
+      </w:r>
+      <w:r>
+        <w:t xml:space="preserve">(pgx + River + Redis), the Gin</w:t>
+      </w:r>
+      <w:r>
+        <w:t xml:space="preserve"> </w:t>
+      </w:r>
+      <w:r>
+        <w:rPr>
+          <w:rStyle w:val="VerbatimChar"/>
+        </w:rPr>
+        <w:t xml:space="preserve">/v1/*</w:t>
+      </w:r>
+      <w:r>
+        <w:t xml:space="preserve"> </w:t>
+      </w:r>
+      <w:r>
+        <w:t xml:space="preserve">REST API, participant-attribution (§11.4.104), natural-language intent-recognition (§11.4.105), the Docs Chain documentation-sync mandate (§11.4.106), and the</w:t>
+      </w:r>
+      <w:r>
+        <w:t xml:space="preserve"> </w:t>
+      </w:r>
+      <w:r>
+        <w:rPr>
+          <w:rStyle w:val="VerbatimChar"/>
+        </w:rPr>
+        <w:t xml:space="preserve">commons_workable</w:t>
+      </w:r>
+      <w:r>
+        <w:t xml:space="preserve">/</w:t>
+      </w:r>
+      <w:r>
+        <w:rPr>
+          <w:rStyle w:val="VerbatimChar"/>
+        </w:rPr>
+        <w:t xml:space="preserve">commons_watch</w:t>
+      </w:r>
+      <w:r>
+        <w:t xml:space="preserve"> </w:t>
+      </w:r>
+      <w:r>
+        <w:t xml:space="preserve">ATMOSphere substrate (</w:t>
+      </w:r>
+      <w:r>
+        <w:rPr>
+          <w:rStyle w:val="VerbatimChar"/>
+        </w:rPr>
+        <w:t xml:space="preserve">pherald watch</w:t>
+      </w:r>
+      <w:r>
+        <w:t xml:space="preserve"> </w:t>
+      </w:r>
+      <w:r>
+        <w:t xml:space="preserve">daemon). On-demand container orchestration comes from the</w:t>
       </w:r>
       <w:r>
         <w:t xml:space="preserve"> </w:t>
@@ -1952,21 +2274,6 @@
         <w:t xml:space="preserve"> </w:t>
       </w:r>
       <w:r>
-        <w:t xml:space="preserve">submodule landed). On-demand container orchestration is provided by the</w:t>
-      </w:r>
-      <w:r>
-        <w:t xml:space="preserve"> </w:t>
-      </w:r>
-      <w:r>
-        <w:rPr>
-          <w:rStyle w:val="VerbatimChar"/>
-        </w:rPr>
-        <w:t xml:space="preserve">containers/</w:t>
-      </w:r>
-      <w:r>
-        <w:t xml:space="preserve"> </w:t>
-      </w:r>
-      <w:r>
         <w:t xml:space="preserve">submodule (</w:t>
       </w:r>
       <w:r>
@@ -1995,7 +2302,7 @@
         <w:rPr>
           <w:rStyle w:val="VerbatimChar"/>
         </w:rPr>
-        <w:t xml:space="preserve">go test ./commons/... ./commons_prefix/... ./commons_messaging/... ./commons_storage/...</w:t>
+        <w:t xml:space="preserve">go build ./commons/... ./commons_prefix/... ./commons_messaging/... ./commons_storage/... ./commons_constitution/... ./commons_infra/... ./pherald/...</w:t>
       </w:r>
       <w:r>
         <w:br/>
@@ -2004,7 +2311,7 @@
         <w:rPr>
           <w:rStyle w:val="VerbatimChar"/>
         </w:rPr>
-        <w:t xml:space="preserve">go build -o /tmp/pherald-dev ./pherald/cmd/pherald</w:t>
+        <w:t xml:space="preserve">go test -race -count=1 ./commons/... ./commons_prefix/... ./commons_messaging/... ./commons_storage/... ./commons_constitution/... ./commons_infra/... ./pherald/...</w:t>
       </w:r>
     </w:p>
     <w:p>
@@ -2012,7 +2319,7 @@
         <w:pStyle w:val="FirstParagraph"/>
       </w:pPr>
       <w:r>
-        <w:t xml:space="preserve">What's NOT yet live (per</w:t>
+        <w:t xml:space="preserve">Still open (roughly a dozen evidence-gated HRDs in</w:t>
       </w:r>
       <w:r>
         <w:t xml:space="preserve"> </w:t>
@@ -2024,7 +2331,204 @@
         <w:t xml:space="preserve">docs/Issues.md</w:t>
       </w:r>
       <w:r>
-        <w:t xml:space="preserve">):</w:t>
+        <w:t xml:space="preserve"> </w:t>
+      </w:r>
+      <w:r>
+        <w:t xml:space="preserve">— live-integration credentials + later-iteration channels); the bulk of the catalogue migrated to</w:t>
+      </w:r>
+      <w:r>
+        <w:t xml:space="preserve"> </w:t>
+      </w:r>
+      <w:r>
+        <w:rPr>
+          <w:rStyle w:val="VerbatimChar"/>
+        </w:rPr>
+        <w:t xml:space="preserve">docs/Fixed.md</w:t>
+      </w:r>
+      <w:r>
+        <w:t xml:space="preserve"> </w:t>
+      </w:r>
+      <w:r>
+        <w:t xml:space="preserve">in the v1.0.0 closure sweep. Consult</w:t>
+      </w:r>
+      <w:r>
+        <w:t xml:space="preserve"> </w:t>
+      </w:r>
+      <w:r>
+        <w:rPr>
+          <w:rStyle w:val="VerbatimChar"/>
+        </w:rPr>
+        <w:t xml:space="preserve">docs/Issues.md</w:t>
+      </w:r>
+      <w:r>
+        <w:t xml:space="preserve"> </w:t>
+      </w:r>
+      <w:r>
+        <w:t xml:space="preserve">for the current open set before claiming a feature is unimplemented — HRD-010/011/012/016 (storage, Telegram, Claude Code dispatch, REST API) are all now LIVE.</w:t>
+      </w:r>
+    </w:p>
+    <w:p>
+      <w:pPr>
+        <w:pStyle w:val="BodyText"/>
+      </w:pPr>
+      <w:r>
+        <w:t xml:space="preserve">When asked to "add a feature": find the spec section, open / claim the relevant HRD-NNN in</w:t>
+      </w:r>
+      <w:r>
+        <w:t xml:space="preserve"> </w:t>
+      </w:r>
+      <w:r>
+        <w:rPr>
+          <w:rStyle w:val="VerbatimChar"/>
+        </w:rPr>
+        <w:t xml:space="preserve">docs/Issues.md</w:t>
+      </w:r>
+      <w:r>
+        <w:t xml:space="preserve">, write Go + tests, ensure</w:t>
+      </w:r>
+      <w:r>
+        <w:t xml:space="preserve"> </w:t>
+      </w:r>
+      <w:r>
+        <w:rPr>
+          <w:rStyle w:val="VerbatimChar"/>
+        </w:rPr>
+        <w:t xml:space="preserve">go test</w:t>
+      </w:r>
+      <w:r>
+        <w:t xml:space="preserve"> </w:t>
+      </w:r>
+      <w:r>
+        <w:t xml:space="preserve">passes, close the HRD-NNN by migrating its row to</w:t>
+      </w:r>
+      <w:r>
+        <w:t xml:space="preserve"> </w:t>
+      </w:r>
+      <w:r>
+        <w:rPr>
+          <w:rStyle w:val="VerbatimChar"/>
+        </w:rPr>
+        <w:t xml:space="preserve">docs/Fixed.md</w:t>
+      </w:r>
+      <w:r>
+        <w:t xml:space="preserve"> </w:t>
+      </w:r>
+      <w:r>
+        <w:t xml:space="preserve">(per Universal §11.4.19 atomic-migration mandate).</w:t>
+      </w:r>
+    </w:p>
+    <w:p>
+      <w:pPr>
+        <w:pStyle w:val="BodyText"/>
+      </w:pPr>
+      <w:r>
+        <w:t xml:space="preserve">Never invent build / test commands beyond</w:t>
+      </w:r>
+      <w:r>
+        <w:t xml:space="preserve"> </w:t>
+      </w:r>
+      <w:r>
+        <w:rPr>
+          <w:rStyle w:val="VerbatimChar"/>
+        </w:rPr>
+        <w:t xml:space="preserve">go test ./&lt;module&gt;/...</w:t>
+      </w:r>
+      <w:r>
+        <w:t xml:space="preserve">. Live-integration tests require operator-supplied bot tokens / Claude sessions / Postgres —</w:t>
+      </w:r>
+      <w:r>
+        <w:t xml:space="preserve"> </w:t>
+      </w:r>
+      <w:r>
+        <w:rPr>
+          <w:rStyle w:val="VerbatimChar"/>
+        </w:rPr>
+        <w:t xml:space="preserve">docs/CONTINUATION.md</w:t>
+      </w:r>
+      <w:r>
+        <w:t xml:space="preserve"> </w:t>
+      </w:r>
+      <w:r>
+        <w:t xml:space="preserve">carries the handoff prompt.</w:t>
+      </w:r>
+    </w:p>
+    <w:bookmarkEnd w:id="12"/>
+    <w:bookmarkStart w:id="13" w:name="X113e14c17c8dcbc428318fbd14b02ebb01d29ca"/>
+    <w:p>
+      <w:pPr>
+        <w:pStyle w:val="Heading3"/>
+      </w:pPr>
+      <w:r>
+        <w:t xml:space="preserve">End-user-usability covenant (Herald §107 / Helix §11.4 — MANDATORY ANTI-BLUFF)</w:t>
+      </w:r>
+    </w:p>
+    <w:p>
+      <w:pPr>
+        <w:pStyle w:val="FirstParagraph"/>
+      </w:pPr>
+      <w:r>
+        <w:rPr>
+          <w:b/>
+          <w:bCs/>
+        </w:rPr>
+        <w:t xml:space="preserve">Forensic anchor — verbatim operator mandate:</w:t>
+      </w:r>
+    </w:p>
+    <w:p>
+      <w:pPr>
+        <w:pStyle w:val="BlockText"/>
+      </w:pPr>
+      <w:r>
+        <w:t xml:space="preserve">"all existing tests and Challenges do work in anti-bluff manner - they MUST confirm that all tested codebase really works as expected! We had been in position that all tests do execute with success and all Challenges as well, but in reality the most of the features does not work and can't be used! This MUST NOT be the case and execution of tests and Challenges MUST guarantee the quality, the completition and full usability by end users of the product! This MUST BE part of Constitution of our project, its CLAUDE.MD and AGENTS.MD if it is not there already, and to be applied to all Submodules's Constitution, CLAUDE.MD and AGENTS.MD as well (if not there already)!"</w:t>
+      </w:r>
+    </w:p>
+    <w:p>
+      <w:pPr>
+        <w:pStyle w:val="FirstParagraph"/>
+      </w:pPr>
+      <w:r>
+        <w:rPr>
+          <w:b/>
+          <w:bCs/>
+        </w:rPr>
+        <w:t xml:space="preserve">Agent-binding rule.</w:t>
+      </w:r>
+      <w:r>
+        <w:t xml:space="preserve"> </w:t>
+      </w:r>
+      <w:r>
+        <w:t xml:space="preserve">No agent — Claude Code, Codex, Cursor, Gemini, Aider, any CLI subagent — may declare a Herald feature "done", "landed", "shipped", or "tests pass" without</w:t>
+      </w:r>
+      <w:r>
+        <w:t xml:space="preserve"> </w:t>
+      </w:r>
+      <w:r>
+        <w:rPr>
+          <w:b/>
+          <w:bCs/>
+        </w:rPr>
+        <w:t xml:space="preserve">positive runtime evidence captured during execution</w:t>
+      </w:r>
+      <w:r>
+        <w:t xml:space="preserve"> </w:t>
+      </w:r>
+      <w:r>
+        <w:t xml:space="preserve">that an end user of the relevant</w:t>
+      </w:r>
+      <w:r>
+        <w:t xml:space="preserve"> </w:t>
+      </w:r>
+      <w:r>
+        <w:rPr>
+          <w:rStyle w:val="VerbatimChar"/>
+        </w:rPr>
+        <w:t xml:space="preserve">&lt;flavor&gt;herald</w:t>
+      </w:r>
+      <w:r>
+        <w:t xml:space="preserve"> </w:t>
+      </w:r>
+      <w:r>
+        <w:t xml:space="preserve">binary can actually use the feature.</w:t>
       </w:r>
     </w:p>
     <w:p>
@@ -2036,7 +2540,20 @@
         </w:numPr>
       </w:pPr>
       <w:r>
-        <w:t xml:space="preserve">HRD-008 operator-side Quickstart compose validation.</w:t>
+        <w:t xml:space="preserve">Unit-test green is necessary but</w:t>
+      </w:r>
+      <w:r>
+        <w:t xml:space="preserve"> </w:t>
+      </w:r>
+      <w:r>
+        <w:rPr>
+          <w:b/>
+          <w:bCs/>
+        </w:rPr>
+        <w:t xml:space="preserve">not sufficient</w:t>
+      </w:r>
+      <w:r>
+        <w:t xml:space="preserve">.</w:t>
       </w:r>
     </w:p>
     <w:p>
@@ -2048,7 +2565,20 @@
         </w:numPr>
       </w:pPr>
       <w:r>
-        <w:t xml:space="preserve">HRD-010 commons_storage live (pgx + River + Redis).</w:t>
+        <w:t xml:space="preserve">Integration-test green is necessary but</w:t>
+      </w:r>
+      <w:r>
+        <w:t xml:space="preserve"> </w:t>
+      </w:r>
+      <w:r>
+        <w:rPr>
+          <w:b/>
+          <w:bCs/>
+        </w:rPr>
+        <w:t xml:space="preserve">not sufficient</w:t>
+      </w:r>
+      <w:r>
+        <w:t xml:space="preserve">.</w:t>
       </w:r>
     </w:p>
     <w:p>
@@ -2060,7 +2590,20 @@
         </w:numPr>
       </w:pPr>
       <w:r>
-        <w:t xml:space="preserve">HRD-011 Telegram adapter live (telebot + getUpdates).</w:t>
+        <w:t xml:space="preserve">Compile success is necessary but</w:t>
+      </w:r>
+      <w:r>
+        <w:t xml:space="preserve"> </w:t>
+      </w:r>
+      <w:r>
+        <w:rPr>
+          <w:b/>
+          <w:bCs/>
+        </w:rPr>
+        <w:t xml:space="preserve">not sufficient</w:t>
+      </w:r>
+      <w:r>
+        <w:t xml:space="preserve">.</w:t>
       </w:r>
     </w:p>
     <w:p>
@@ -2069,278 +2612,6 @@
         <w:numPr>
           <w:ilvl w:val="0"/>
           <w:numId w:val="1005"/>
-        </w:numPr>
-      </w:pPr>
-      <w:r>
-        <w:t xml:space="preserve">HRD-012 Claude Code dispatcher live (</w:t>
-      </w:r>
-      <w:r>
-        <w:rPr>
-          <w:rStyle w:val="VerbatimChar"/>
-        </w:rPr>
-        <w:t xml:space="preserve">claude --resume</w:t>
-      </w:r>
-      <w:r>
-        <w:t xml:space="preserve">).</w:t>
-      </w:r>
-    </w:p>
-    <w:p>
-      <w:pPr>
-        <w:pStyle w:val="Compact"/>
-        <w:numPr>
-          <w:ilvl w:val="0"/>
-          <w:numId w:val="1005"/>
-        </w:numPr>
-      </w:pPr>
-      <w:r>
-        <w:t xml:space="preserve">HRD-016 REST API per §41 (Gin Gonic).</w:t>
-      </w:r>
-    </w:p>
-    <w:p>
-      <w:pPr>
-        <w:pStyle w:val="FirstParagraph"/>
-      </w:pPr>
-      <w:r>
-        <w:t xml:space="preserve">When asked to "add a feature": find the spec section, open / claim the relevant HRD-NNN in</w:t>
-      </w:r>
-      <w:r>
-        <w:t xml:space="preserve"> </w:t>
-      </w:r>
-      <w:r>
-        <w:rPr>
-          <w:rStyle w:val="VerbatimChar"/>
-        </w:rPr>
-        <w:t xml:space="preserve">docs/Issues.md</w:t>
-      </w:r>
-      <w:r>
-        <w:t xml:space="preserve">, write Go + tests, ensure</w:t>
-      </w:r>
-      <w:r>
-        <w:t xml:space="preserve"> </w:t>
-      </w:r>
-      <w:r>
-        <w:rPr>
-          <w:rStyle w:val="VerbatimChar"/>
-        </w:rPr>
-        <w:t xml:space="preserve">go test</w:t>
-      </w:r>
-      <w:r>
-        <w:t xml:space="preserve"> </w:t>
-      </w:r>
-      <w:r>
-        <w:t xml:space="preserve">passes, close the HRD-NNN by migrating its row to</w:t>
-      </w:r>
-      <w:r>
-        <w:t xml:space="preserve"> </w:t>
-      </w:r>
-      <w:r>
-        <w:rPr>
-          <w:rStyle w:val="VerbatimChar"/>
-        </w:rPr>
-        <w:t xml:space="preserve">docs/Fixed.md</w:t>
-      </w:r>
-      <w:r>
-        <w:t xml:space="preserve"> </w:t>
-      </w:r>
-      <w:r>
-        <w:t xml:space="preserve">(per Universal §11.4.19 atomic-migration mandate).</w:t>
-      </w:r>
-    </w:p>
-    <w:p>
-      <w:pPr>
-        <w:pStyle w:val="BodyText"/>
-      </w:pPr>
-      <w:r>
-        <w:t xml:space="preserve">Never invent build / test commands beyond</w:t>
-      </w:r>
-      <w:r>
-        <w:t xml:space="preserve"> </w:t>
-      </w:r>
-      <w:r>
-        <w:rPr>
-          <w:rStyle w:val="VerbatimChar"/>
-        </w:rPr>
-        <w:t xml:space="preserve">go test ./&lt;module&gt;/...</w:t>
-      </w:r>
-      <w:r>
-        <w:t xml:space="preserve">. Live-integration tests require operator-supplied bot tokens / Claude sessions / Postgres —</w:t>
-      </w:r>
-      <w:r>
-        <w:t xml:space="preserve"> </w:t>
-      </w:r>
-      <w:r>
-        <w:rPr>
-          <w:rStyle w:val="VerbatimChar"/>
-        </w:rPr>
-        <w:t xml:space="preserve">docs/CONTINUATION.md</w:t>
-      </w:r>
-      <w:r>
-        <w:t xml:space="preserve"> </w:t>
-      </w:r>
-      <w:r>
-        <w:t xml:space="preserve">carries the handoff prompt.</w:t>
-      </w:r>
-    </w:p>
-    <w:bookmarkEnd w:id="12"/>
-    <w:bookmarkStart w:id="13" w:name="X113e14c17c8dcbc428318fbd14b02ebb01d29ca"/>
-    <w:p>
-      <w:pPr>
-        <w:pStyle w:val="Heading3"/>
-      </w:pPr>
-      <w:r>
-        <w:t xml:space="preserve">End-user-usability covenant (Herald §107 / Helix §11.4 — MANDATORY ANTI-BLUFF)</w:t>
-      </w:r>
-    </w:p>
-    <w:p>
-      <w:pPr>
-        <w:pStyle w:val="FirstParagraph"/>
-      </w:pPr>
-      <w:r>
-        <w:rPr>
-          <w:b/>
-          <w:bCs/>
-        </w:rPr>
-        <w:t xml:space="preserve">Forensic anchor — verbatim operator mandate:</w:t>
-      </w:r>
-    </w:p>
-    <w:p>
-      <w:pPr>
-        <w:pStyle w:val="BlockText"/>
-      </w:pPr>
-      <w:r>
-        <w:t xml:space="preserve">"all existing tests and Challenges do work in anti-bluff manner - they MUST confirm that all tested codebase really works as expected! We had been in position that all tests do execute with success and all Challenges as well, but in reality the most of the features does not work and can't be used! This MUST NOT be the case and execution of tests and Challenges MUST guarantee the quality, the completition and full usability by end users of the product! This MUST BE part of Constitution of our project, its CLAUDE.MD and AGENTS.MD if it is not there already, and to be applied to all Submodules's Constitution, CLAUDE.MD and AGENTS.MD as well (if not there already)!"</w:t>
-      </w:r>
-    </w:p>
-    <w:p>
-      <w:pPr>
-        <w:pStyle w:val="FirstParagraph"/>
-      </w:pPr>
-      <w:r>
-        <w:rPr>
-          <w:b/>
-          <w:bCs/>
-        </w:rPr>
-        <w:t xml:space="preserve">Agent-binding rule.</w:t>
-      </w:r>
-      <w:r>
-        <w:t xml:space="preserve"> </w:t>
-      </w:r>
-      <w:r>
-        <w:t xml:space="preserve">No agent — Claude Code, Codex, Cursor, Gemini, Aider, any CLI subagent — may declare a Herald feature "done", "landed", "shipped", or "tests pass" without</w:t>
-      </w:r>
-      <w:r>
-        <w:t xml:space="preserve"> </w:t>
-      </w:r>
-      <w:r>
-        <w:rPr>
-          <w:b/>
-          <w:bCs/>
-        </w:rPr>
-        <w:t xml:space="preserve">positive runtime evidence captured during execution</w:t>
-      </w:r>
-      <w:r>
-        <w:t xml:space="preserve"> </w:t>
-      </w:r>
-      <w:r>
-        <w:t xml:space="preserve">that an end user of the relevant</w:t>
-      </w:r>
-      <w:r>
-        <w:t xml:space="preserve"> </w:t>
-      </w:r>
-      <w:r>
-        <w:rPr>
-          <w:rStyle w:val="VerbatimChar"/>
-        </w:rPr>
-        <w:t xml:space="preserve">&lt;flavor&gt;herald</w:t>
-      </w:r>
-      <w:r>
-        <w:t xml:space="preserve"> </w:t>
-      </w:r>
-      <w:r>
-        <w:t xml:space="preserve">binary can actually use the feature.</w:t>
-      </w:r>
-    </w:p>
-    <w:p>
-      <w:pPr>
-        <w:pStyle w:val="Compact"/>
-        <w:numPr>
-          <w:ilvl w:val="0"/>
-          <w:numId w:val="1006"/>
-        </w:numPr>
-      </w:pPr>
-      <w:r>
-        <w:t xml:space="preserve">Unit-test green is necessary but</w:t>
-      </w:r>
-      <w:r>
-        <w:t xml:space="preserve"> </w:t>
-      </w:r>
-      <w:r>
-        <w:rPr>
-          <w:b/>
-          <w:bCs/>
-        </w:rPr>
-        <w:t xml:space="preserve">not sufficient</w:t>
-      </w:r>
-      <w:r>
-        <w:t xml:space="preserve">.</w:t>
-      </w:r>
-    </w:p>
-    <w:p>
-      <w:pPr>
-        <w:pStyle w:val="Compact"/>
-        <w:numPr>
-          <w:ilvl w:val="0"/>
-          <w:numId w:val="1006"/>
-        </w:numPr>
-      </w:pPr>
-      <w:r>
-        <w:t xml:space="preserve">Integration-test green is necessary but</w:t>
-      </w:r>
-      <w:r>
-        <w:t xml:space="preserve"> </w:t>
-      </w:r>
-      <w:r>
-        <w:rPr>
-          <w:b/>
-          <w:bCs/>
-        </w:rPr>
-        <w:t xml:space="preserve">not sufficient</w:t>
-      </w:r>
-      <w:r>
-        <w:t xml:space="preserve">.</w:t>
-      </w:r>
-    </w:p>
-    <w:p>
-      <w:pPr>
-        <w:pStyle w:val="Compact"/>
-        <w:numPr>
-          <w:ilvl w:val="0"/>
-          <w:numId w:val="1006"/>
-        </w:numPr>
-      </w:pPr>
-      <w:r>
-        <w:t xml:space="preserve">Compile success is necessary but</w:t>
-      </w:r>
-      <w:r>
-        <w:t xml:space="preserve"> </w:t>
-      </w:r>
-      <w:r>
-        <w:rPr>
-          <w:b/>
-          <w:bCs/>
-        </w:rPr>
-        <w:t xml:space="preserve">not sufficient</w:t>
-      </w:r>
-      <w:r>
-        <w:t xml:space="preserve">.</w:t>
-      </w:r>
-    </w:p>
-    <w:p>
-      <w:pPr>
-        <w:pStyle w:val="Compact"/>
-        <w:numPr>
-          <w:ilvl w:val="0"/>
-          <w:numId w:val="1006"/>
         </w:numPr>
       </w:pPr>
       <w:r>
@@ -5126,7 +5397,7 @@
         <w:pStyle w:val="Compact"/>
         <w:numPr>
           <w:ilvl w:val="0"/>
-          <w:numId w:val="1007"/>
+          <w:numId w:val="1006"/>
         </w:numPr>
       </w:pPr>
       <w:r>
@@ -5389,7 +5660,7 @@
         <w:pStyle w:val="Compact"/>
         <w:numPr>
           <w:ilvl w:val="0"/>
-          <w:numId w:val="1007"/>
+          <w:numId w:val="1006"/>
         </w:numPr>
       </w:pPr>
       <w:r>
@@ -5453,7 +5724,7 @@
         <w:pStyle w:val="Compact"/>
         <w:numPr>
           <w:ilvl w:val="0"/>
-          <w:numId w:val="1007"/>
+          <w:numId w:val="1006"/>
         </w:numPr>
       </w:pPr>
       <w:r>
@@ -5541,7 +5812,7 @@
         <w:pStyle w:val="Compact"/>
         <w:numPr>
           <w:ilvl w:val="0"/>
-          <w:numId w:val="1007"/>
+          <w:numId w:val="1006"/>
         </w:numPr>
       </w:pPr>
       <w:r>
@@ -5823,7 +6094,7 @@
         <w:pStyle w:val="Compact"/>
         <w:numPr>
           <w:ilvl w:val="0"/>
-          <w:numId w:val="1008"/>
+          <w:numId w:val="1007"/>
         </w:numPr>
       </w:pPr>
       <w:r>
@@ -5970,6 +6241,365 @@
       </w:r>
       <w:r>
         <w:t xml:space="preserve">), and asks a precise clarifying question naming the candidate intents.</w:t>
+      </w:r>
+    </w:p>
+    <w:p>
+      <w:pPr>
+        <w:pStyle w:val="Compact"/>
+        <w:numPr>
+          <w:ilvl w:val="0"/>
+          <w:numId w:val="1007"/>
+        </w:numPr>
+      </w:pPr>
+      <w:r>
+        <w:rPr>
+          <w:b/>
+          <w:bCs/>
+        </w:rPr>
+        <w:t xml:space="preserve">Never guess, never ignore.</w:t>
+      </w:r>
+      <w:r>
+        <w:t xml:space="preserve"> </w:t>
+      </w:r>
+      <w:r>
+        <w:t xml:space="preserve">A wrong action is worse than a clarifying question (§11.4.6 no-guessing); the subscriber is never silently dropped and never has to learn syntax. The agent ships unit + integration + E2E + full-automation tests with real captured evidence under</w:t>
+      </w:r>
+      <w:r>
+        <w:t xml:space="preserve"> </w:t>
+      </w:r>
+      <w:r>
+        <w:rPr>
+          <w:rStyle w:val="VerbatimChar"/>
+        </w:rPr>
+        <w:t xml:space="preserve">docs/qa/&lt;run-id&gt;/</w:t>
+      </w:r>
+      <w:r>
+        <w:t xml:space="preserve"> </w:t>
+      </w:r>
+      <w:r>
+        <w:t xml:space="preserve">— a Tier-1 truth-table including the conservative negatives that MUST fall through to "no match", a Tier-3 E2E asserting the reply body is EXACTLY</w:t>
+      </w:r>
+      <w:r>
+        <w:t xml:space="preserve"> </w:t>
+      </w:r>
+      <w:r>
+        <w:rPr>
+          <w:rStyle w:val="VerbatimChar"/>
+        </w:rPr>
+        <w:t xml:space="preserve">@&lt;sender&gt; &lt;specific question&gt;</w:t>
+      </w:r>
+      <w:r>
+        <w:t xml:space="preserve">, and a paired §1.1 mutation (break the confidence guard or drop the clarify tag) that must FAIL (§107 / Helix §11.4 anti-bluff). Canonical authority: HelixConstitution Constitution.md §11.4.105 (inherited per §11.4.35); Herald contract</w:t>
+      </w:r>
+      <w:r>
+        <w:t xml:space="preserve"> </w:t>
+      </w:r>
+      <w:r>
+        <w:rPr>
+          <w:rStyle w:val="VerbatimChar"/>
+        </w:rPr>
+        <w:t xml:space="preserve">docs/design/INTENT_RECOGNITION.md</w:t>
+      </w:r>
+      <w:r>
+        <w:t xml:space="preserve">.</w:t>
+      </w:r>
+    </w:p>
+    <w:bookmarkEnd w:id="21"/>
+    <w:bookmarkStart w:id="22" w:name="X494e63fc2991a9d42fefb419b530ac9bef94c53"/>
+    <w:p>
+      <w:pPr>
+        <w:pStyle w:val="Heading3"/>
+      </w:pPr>
+      <w:r>
+        <w:t xml:space="preserve">Inheritance gate (run before any commit that touches root docs or</w:t>
+      </w:r>
+      <w:r>
+        <w:t xml:space="preserve"> </w:t>
+      </w:r>
+      <w:r>
+        <w:rPr>
+          <w:rStyle w:val="VerbatimChar"/>
+        </w:rPr>
+        <w:t xml:space="preserve">constitution/</w:t>
+      </w:r>
+      <w:r>
+        <w:t xml:space="preserve">)</w:t>
+      </w:r>
+    </w:p>
+    <w:p>
+      <w:pPr>
+        <w:pStyle w:val="SourceCode"/>
+      </w:pPr>
+      <w:r>
+        <w:rPr>
+          <w:rStyle w:val="FunctionTok"/>
+        </w:rPr>
+        <w:t xml:space="preserve">bash</w:t>
+      </w:r>
+      <w:r>
+        <w:rPr>
+          <w:rStyle w:val="NormalTok"/>
+        </w:rPr>
+        <w:t xml:space="preserve"> tests/test_constitution_inheritance.sh        </w:t>
+      </w:r>
+      <w:r>
+        <w:rPr>
+          <w:rStyle w:val="CommentTok"/>
+        </w:rPr>
+        <w:t xml:space="preserve"># the gate</w:t>
+      </w:r>
+      <w:r>
+        <w:br/>
+      </w:r>
+      <w:r>
+        <w:rPr>
+          <w:rStyle w:val="FunctionTok"/>
+        </w:rPr>
+        <w:t xml:space="preserve">bash</w:t>
+      </w:r>
+      <w:r>
+        <w:rPr>
+          <w:rStyle w:val="NormalTok"/>
+        </w:rPr>
+        <w:t xml:space="preserve"> tests/test_constitution_inheritance_meta.sh   </w:t>
+      </w:r>
+      <w:r>
+        <w:rPr>
+          <w:rStyle w:val="CommentTok"/>
+        </w:rPr>
+        <w:t xml:space="preserve"># paired mutation proof (§1.1)</w:t>
+      </w:r>
+    </w:p>
+    <w:p>
+      <w:pPr>
+        <w:pStyle w:val="FirstParagraph"/>
+      </w:pPr>
+      <w:r>
+        <w:t xml:space="preserve">Both MUST return 0. If either fails, fix at root cause per Constitution §11.4.4 — never silently accept the FAIL.</w:t>
+      </w:r>
+    </w:p>
+    <w:bookmarkEnd w:id="22"/>
+    <w:bookmarkStart w:id="23" w:name="X13a66f9366a630b1607d5aa78347bb744647a8d"/>
+    <w:p>
+      <w:pPr>
+        <w:pStyle w:val="Heading3"/>
+      </w:pPr>
+      <w:r>
+        <w:t xml:space="preserve">Spec-change rule (load-bearing —</w:t>
+      </w:r>
+      <w:r>
+        <w:t xml:space="preserve"> </w:t>
+      </w:r>
+      <w:r>
+        <w:rPr>
+          <w:rStyle w:val="VerbatimChar"/>
+        </w:rPr>
+        <w:t xml:space="preserve">docs/specs/mvp/specification.V4.md</w:t>
+      </w:r>
+      <w:r>
+        <w:t xml:space="preserve"> </w:t>
+      </w:r>
+      <w:r>
+        <w:t xml:space="preserve">§"Specification documents")</w:t>
+      </w:r>
+    </w:p>
+    <w:p>
+      <w:pPr>
+        <w:pStyle w:val="FirstParagraph"/>
+      </w:pPr>
+      <w:r>
+        <w:t xml:space="preserve">Whenever</w:t>
+      </w:r>
+      <w:r>
+        <w:t xml:space="preserve"> </w:t>
+      </w:r>
+      <w:r>
+        <w:rPr>
+          <w:rStyle w:val="VerbatimChar"/>
+        </w:rPr>
+        <w:t xml:space="preserve">docs/specs/mvp/specification.V4.md</w:t>
+      </w:r>
+      <w:r>
+        <w:t xml:space="preserve"> </w:t>
+      </w:r>
+      <w:r>
+        <w:t xml:space="preserve">or any file under</w:t>
+      </w:r>
+      <w:r>
+        <w:t xml:space="preserve"> </w:t>
+      </w:r>
+      <w:r>
+        <w:rPr>
+          <w:rStyle w:val="VerbatimChar"/>
+        </w:rPr>
+        <w:t xml:space="preserve">docs/specs/</w:t>
+      </w:r>
+      <w:r>
+        <w:t xml:space="preserve"> </w:t>
+      </w:r>
+      <w:r>
+        <w:t xml:space="preserve">(any depth) is modified,</w:t>
+      </w:r>
+      <w:r>
+        <w:t xml:space="preserve"> </w:t>
+      </w:r>
+      <w:r>
+        <w:rPr>
+          <w:b/>
+          <w:bCs/>
+        </w:rPr>
+        <w:t xml:space="preserve">comprehensive planning and implementation of all changes is MANDATORY</w:t>
+      </w:r>
+      <w:r>
+        <w:t xml:space="preserve"> </w:t>
+      </w:r>
+      <w:r>
+        <w:t xml:space="preserve">— agents may not edit the spec in isolation. This rule does NOT apply to creating or renaming files; for those, ask the operator what to do with the new path. Treat every spec edit as a project-wide ripple, not a doc tweak.</w:t>
+      </w:r>
+    </w:p>
+    <w:p>
+      <w:pPr>
+        <w:pStyle w:val="BodyText"/>
+      </w:pPr>
+      <w:r>
+        <w:t xml:space="preserve">This rule is mirrored in</w:t>
+      </w:r>
+      <w:r>
+        <w:t xml:space="preserve"> </w:t>
+      </w:r>
+      <w:r>
+        <w:rPr>
+          <w:rStyle w:val="VerbatimChar"/>
+        </w:rPr>
+        <w:t xml:space="preserve">CLAUDE.md</w:t>
+      </w:r>
+      <w:r>
+        <w:t xml:space="preserve"> </w:t>
+      </w:r>
+      <w:r>
+        <w:t xml:space="preserve">and in</w:t>
+      </w:r>
+      <w:r>
+        <w:t xml:space="preserve"> </w:t>
+      </w:r>
+      <w:r>
+        <w:rPr>
+          <w:rStyle w:val="VerbatimChar"/>
+        </w:rPr>
+        <w:t xml:space="preserve">docs/guides/HERALD_CONSTITUTION.md</w:t>
+      </w:r>
+      <w:r>
+        <w:t xml:space="preserve"> </w:t>
+      </w:r>
+      <w:r>
+        <w:t xml:space="preserve">§106. The inheritance gate's invariant</w:t>
+      </w:r>
+      <w:r>
+        <w:t xml:space="preserve"> </w:t>
+      </w:r>
+      <w:r>
+        <w:rPr>
+          <w:b/>
+          <w:bCs/>
+        </w:rPr>
+        <w:t xml:space="preserve">I7a–c</w:t>
+      </w:r>
+      <w:r>
+        <w:t xml:space="preserve"> </w:t>
+      </w:r>
+      <w:r>
+        <w:t xml:space="preserve">asserts the rule anchor (</w:t>
+      </w:r>
+      <w:r>
+        <w:rPr>
+          <w:rStyle w:val="VerbatimChar"/>
+        </w:rPr>
+        <w:t xml:space="preserve">comprehensive planning and implementation</w:t>
+      </w:r>
+      <w:r>
+        <w:t xml:space="preserve">) is present in all three files; a missing copy is a §1.1 propagation bluff and the gate FAILs.</w:t>
+      </w:r>
+    </w:p>
+    <w:bookmarkEnd w:id="23"/>
+    <w:bookmarkStart w:id="24" w:name="X6198677d4a246aad02e8f663e73cd694bf6928c"/>
+    <w:p>
+      <w:pPr>
+        <w:pStyle w:val="Heading3"/>
+      </w:pPr>
+      <w:r>
+        <w:t xml:space="preserve">Multi-host mirror convention (Herald's own upstreams)</w:t>
+      </w:r>
+    </w:p>
+    <w:p>
+      <w:pPr>
+        <w:pStyle w:val="FirstParagraph"/>
+      </w:pPr>
+      <w:r>
+        <w:rPr>
+          <w:rStyle w:val="VerbatimChar"/>
+        </w:rPr>
+        <w:t xml:space="preserve">upstreams/</w:t>
+      </w:r>
+      <w:r>
+        <w:t xml:space="preserve"> </w:t>
+      </w:r>
+      <w:r>
+        <w:t xml:space="preserve">contains one script per mirror host (GitHub, GitLab, GitFlic, GitVerse). Each script exports</w:t>
+      </w:r>
+      <w:r>
+        <w:t xml:space="preserve"> </w:t>
+      </w:r>
+      <w:r>
+        <w:rPr>
+          <w:rStyle w:val="VerbatimChar"/>
+        </w:rPr>
+        <w:t xml:space="preserve">UPSTREAMABLE_REPOSITORY</w:t>
+      </w:r>
+      <w:r>
+        <w:t xml:space="preserve"> </w:t>
+      </w:r>
+      <w:r>
+        <w:t xml:space="preserve">and is sourced, not executed. The Herald repo's</w:t>
+      </w:r>
+      <w:r>
+        <w:t xml:space="preserve"> </w:t>
+      </w:r>
+      <w:r>
+        <w:rPr>
+          <w:rStyle w:val="VerbatimChar"/>
+        </w:rPr>
+        <w:t xml:space="preserve">origin</w:t>
+      </w:r>
+      <w:r>
+        <w:t xml:space="preserve"> </w:t>
+      </w:r>
+      <w:r>
+        <w:t xml:space="preserve">remote is already fan-out (1 fetch URL + 4 push URLs) — a single</w:t>
+      </w:r>
+      <w:r>
+        <w:t xml:space="preserve"> </w:t>
+      </w:r>
+      <w:r>
+        <w:rPr>
+          <w:rStyle w:val="VerbatimChar"/>
+        </w:rPr>
+        <w:t xml:space="preserve">git push origin &lt;branch&gt;</w:t>
+      </w:r>
+      <w:r>
+        <w:t xml:space="preserve"> </w:t>
+      </w:r>
+      <w:r>
+        <w:t xml:space="preserve">propagates to all four hosts. Per-host naming intentionally matches each provider's brand capitalization; do not normalize.</w:t>
+      </w:r>
+    </w:p>
+    <w:bookmarkEnd w:id="24"/>
+    <w:bookmarkStart w:id="25" w:name="forbidden-in-this-project"/>
+    <w:p>
+      <w:pPr>
+        <w:pStyle w:val="Heading3"/>
+      </w:pPr>
+      <w:r>
+        <w:t xml:space="preserve">Forbidden in this project</w:t>
       </w:r>
     </w:p>
     <w:p>
@@ -5985,350 +6615,69 @@
           <w:b/>
           <w:bCs/>
         </w:rPr>
-        <w:t xml:space="preserve">Never guess, never ignore.</w:t>
-      </w:r>
-      <w:r>
-        <w:t xml:space="preserve"> </w:t>
-      </w:r>
-      <w:r>
-        <w:t xml:space="preserve">A wrong action is worse than a clarifying question (§11.4.6 no-guessing); the subscriber is never silently dropped and never has to learn syntax. The agent ships unit + integration + E2E + full-automation tests with real captured evidence under</w:t>
-      </w:r>
-      <w:r>
-        <w:t xml:space="preserve"> </w:t>
-      </w:r>
-      <w:r>
-        <w:rPr>
-          <w:rStyle w:val="VerbatimChar"/>
-        </w:rPr>
-        <w:t xml:space="preserve">docs/qa/&lt;run-id&gt;/</w:t>
-      </w:r>
-      <w:r>
-        <w:t xml:space="preserve"> </w:t>
-      </w:r>
-      <w:r>
-        <w:t xml:space="preserve">— a Tier-1 truth-table including the conservative negatives that MUST fall through to "no match", a Tier-3 E2E asserting the reply body is EXACTLY</w:t>
-      </w:r>
-      <w:r>
-        <w:t xml:space="preserve"> </w:t>
-      </w:r>
-      <w:r>
-        <w:rPr>
-          <w:rStyle w:val="VerbatimChar"/>
-        </w:rPr>
-        <w:t xml:space="preserve">@&lt;sender&gt; &lt;specific question&gt;</w:t>
-      </w:r>
-      <w:r>
-        <w:t xml:space="preserve">, and a paired §1.1 mutation (break the confidence guard or drop the clarify tag) that must FAIL (§107 / Helix §11.4 anti-bluff). Canonical authority: HelixConstitution Constitution.md §11.4.105 (inherited per §11.4.35); Herald contract</w:t>
-      </w:r>
-      <w:r>
-        <w:t xml:space="preserve"> </w:t>
-      </w:r>
-      <w:r>
-        <w:rPr>
-          <w:rStyle w:val="VerbatimChar"/>
-        </w:rPr>
-        <w:t xml:space="preserve">docs/design/INTENT_RECOGNITION.md</w:t>
-      </w:r>
-      <w:r>
-        <w:t xml:space="preserve">.</w:t>
-      </w:r>
-    </w:p>
-    <w:bookmarkEnd w:id="21"/>
-    <w:bookmarkStart w:id="22" w:name="X494e63fc2991a9d42fefb419b530ac9bef94c53"/>
-    <w:p>
-      <w:pPr>
-        <w:pStyle w:val="Heading3"/>
-      </w:pPr>
-      <w:r>
-        <w:t xml:space="preserve">Inheritance gate (run before any commit that touches root docs or</w:t>
-      </w:r>
-      <w:r>
-        <w:t xml:space="preserve"> </w:t>
-      </w:r>
-      <w:r>
-        <w:rPr>
-          <w:rStyle w:val="VerbatimChar"/>
+        <w:t xml:space="preserve">Re-adding a</w:t>
+      </w:r>
+      <w:r>
+        <w:rPr>
+          <w:b/>
+          <w:bCs/>
+        </w:rPr>
+        <w:t xml:space="preserve"> </w:t>
+      </w:r>
+      <w:r>
+        <w:rPr>
+          <w:rStyle w:val="VerbatimChar"/>
+          <w:b/>
+          <w:bCs/>
         </w:rPr>
         <w:t xml:space="preserve">constitution/</w:t>
       </w:r>
       <w:r>
-        <w:t xml:space="preserve">)</w:t>
-      </w:r>
-    </w:p>
-    <w:p>
-      <w:pPr>
-        <w:pStyle w:val="SourceCode"/>
-      </w:pPr>
-      <w:r>
-        <w:rPr>
-          <w:rStyle w:val="FunctionTok"/>
-        </w:rPr>
-        <w:t xml:space="preserve">bash</w:t>
-      </w:r>
-      <w:r>
-        <w:rPr>
-          <w:rStyle w:val="NormalTok"/>
-        </w:rPr>
-        <w:t xml:space="preserve"> tests/test_constitution_inheritance.sh        </w:t>
-      </w:r>
-      <w:r>
-        <w:rPr>
-          <w:rStyle w:val="CommentTok"/>
-        </w:rPr>
-        <w:t xml:space="preserve"># the gate</w:t>
-      </w:r>
-      <w:r>
-        <w:br/>
-      </w:r>
-      <w:r>
-        <w:rPr>
-          <w:rStyle w:val="FunctionTok"/>
-        </w:rPr>
-        <w:t xml:space="preserve">bash</w:t>
-      </w:r>
-      <w:r>
-        <w:rPr>
-          <w:rStyle w:val="NormalTok"/>
-        </w:rPr>
-        <w:t xml:space="preserve"> tests/test_constitution_inheritance_meta.sh   </w:t>
-      </w:r>
-      <w:r>
-        <w:rPr>
-          <w:rStyle w:val="CommentTok"/>
-        </w:rPr>
-        <w:t xml:space="preserve"># paired mutation proof (§1.1)</w:t>
-      </w:r>
-    </w:p>
-    <w:p>
-      <w:pPr>
-        <w:pStyle w:val="FirstParagraph"/>
-      </w:pPr>
-      <w:r>
-        <w:t xml:space="preserve">Both MUST return 0. If either fails, fix at root cause per Constitution §11.4.4 — never silently accept the FAIL.</w:t>
-      </w:r>
-    </w:p>
-    <w:bookmarkEnd w:id="22"/>
-    <w:bookmarkStart w:id="23" w:name="X13a66f9366a630b1607d5aa78347bb744647a8d"/>
-    <w:p>
-      <w:pPr>
-        <w:pStyle w:val="Heading3"/>
-      </w:pPr>
-      <w:r>
-        <w:t xml:space="preserve">Spec-change rule (load-bearing —</w:t>
-      </w:r>
-      <w:r>
-        <w:t xml:space="preserve"> </w:t>
-      </w:r>
-      <w:r>
-        <w:rPr>
-          <w:rStyle w:val="VerbatimChar"/>
-        </w:rPr>
-        <w:t xml:space="preserve">docs/specs/mvp/specification.V4.md</w:t>
-      </w:r>
-      <w:r>
-        <w:t xml:space="preserve"> </w:t>
-      </w:r>
-      <w:r>
-        <w:t xml:space="preserve">§"Specification documents")</w:t>
-      </w:r>
-    </w:p>
-    <w:p>
-      <w:pPr>
-        <w:pStyle w:val="FirstParagraph"/>
-      </w:pPr>
-      <w:r>
-        <w:t xml:space="preserve">Whenever</w:t>
-      </w:r>
-      <w:r>
-        <w:t xml:space="preserve"> </w:t>
-      </w:r>
-      <w:r>
-        <w:rPr>
-          <w:rStyle w:val="VerbatimChar"/>
-        </w:rPr>
-        <w:t xml:space="preserve">docs/specs/mvp/specification.V4.md</w:t>
-      </w:r>
-      <w:r>
-        <w:t xml:space="preserve"> </w:t>
-      </w:r>
-      <w:r>
-        <w:t xml:space="preserve">or any file under</w:t>
-      </w:r>
-      <w:r>
-        <w:t xml:space="preserve"> </w:t>
-      </w:r>
-      <w:r>
-        <w:rPr>
-          <w:rStyle w:val="VerbatimChar"/>
-        </w:rPr>
-        <w:t xml:space="preserve">docs/specs/</w:t>
-      </w:r>
-      <w:r>
-        <w:t xml:space="preserve"> </w:t>
-      </w:r>
-      <w:r>
-        <w:t xml:space="preserve">(any depth) is modified,</w:t>
-      </w:r>
-      <w:r>
-        <w:t xml:space="preserve"> </w:t>
-      </w:r>
-      <w:r>
-        <w:rPr>
-          <w:b/>
-          <w:bCs/>
-        </w:rPr>
-        <w:t xml:space="preserve">comprehensive planning and implementation of all changes is MANDATORY</w:t>
-      </w:r>
-      <w:r>
-        <w:t xml:space="preserve"> </w:t>
-      </w:r>
-      <w:r>
-        <w:t xml:space="preserve">— agents may not edit the spec in isolation. This rule does NOT apply to creating or renaming files; for those, ask the operator what to do with the new path. Treat every spec edit as a project-wide ripple, not a doc tweak.</w:t>
-      </w:r>
-    </w:p>
-    <w:p>
-      <w:pPr>
-        <w:pStyle w:val="BodyText"/>
-      </w:pPr>
-      <w:r>
-        <w:t xml:space="preserve">This rule is mirrored in</w:t>
-      </w:r>
-      <w:r>
-        <w:t xml:space="preserve"> </w:t>
-      </w:r>
-      <w:r>
-        <w:rPr>
-          <w:rStyle w:val="VerbatimChar"/>
-        </w:rPr>
-        <w:t xml:space="preserve">CLAUDE.md</w:t>
-      </w:r>
-      <w:r>
-        <w:t xml:space="preserve"> </w:t>
-      </w:r>
-      <w:r>
-        <w:t xml:space="preserve">and in</w:t>
-      </w:r>
-      <w:r>
-        <w:t xml:space="preserve"> </w:t>
-      </w:r>
-      <w:r>
-        <w:rPr>
-          <w:rStyle w:val="VerbatimChar"/>
-        </w:rPr>
-        <w:t xml:space="preserve">docs/guides/HERALD_CONSTITUTION.md</w:t>
-      </w:r>
-      <w:r>
-        <w:t xml:space="preserve"> </w:t>
-      </w:r>
-      <w:r>
-        <w:t xml:space="preserve">§106. The inheritance gate's invariant</w:t>
-      </w:r>
-      <w:r>
-        <w:t xml:space="preserve"> </w:t>
-      </w:r>
-      <w:r>
-        <w:rPr>
-          <w:b/>
-          <w:bCs/>
-        </w:rPr>
-        <w:t xml:space="preserve">I7a–c</w:t>
-      </w:r>
-      <w:r>
-        <w:t xml:space="preserve"> </w:t>
-      </w:r>
-      <w:r>
-        <w:t xml:space="preserve">asserts the rule anchor (</w:t>
-      </w:r>
-      <w:r>
-        <w:rPr>
-          <w:rStyle w:val="VerbatimChar"/>
-        </w:rPr>
-        <w:t xml:space="preserve">comprehensive planning and implementation</w:t>
-      </w:r>
-      <w:r>
-        <w:t xml:space="preserve">) is present in all three files; a missing copy is a §1.1 propagation bluff and the gate FAILs.</w:t>
-      </w:r>
-    </w:p>
-    <w:bookmarkEnd w:id="23"/>
-    <w:bookmarkStart w:id="24" w:name="X6198677d4a246aad02e8f663e73cd694bf6928c"/>
-    <w:p>
-      <w:pPr>
-        <w:pStyle w:val="Heading3"/>
-      </w:pPr>
-      <w:r>
-        <w:t xml:space="preserve">Multi-host mirror convention (Herald's own upstreams)</w:t>
-      </w:r>
-    </w:p>
-    <w:p>
-      <w:pPr>
-        <w:pStyle w:val="FirstParagraph"/>
-      </w:pPr>
-      <w:r>
-        <w:rPr>
-          <w:rStyle w:val="VerbatimChar"/>
-        </w:rPr>
-        <w:t xml:space="preserve">upstreams/</w:t>
-      </w:r>
-      <w:r>
-        <w:t xml:space="preserve"> </w:t>
-      </w:r>
-      <w:r>
-        <w:t xml:space="preserve">contains one script per mirror host (GitHub, GitLab, GitFlic, GitVerse). Each script exports</w:t>
-      </w:r>
-      <w:r>
-        <w:t xml:space="preserve"> </w:t>
-      </w:r>
-      <w:r>
-        <w:rPr>
-          <w:rStyle w:val="VerbatimChar"/>
-        </w:rPr>
-        <w:t xml:space="preserve">UPSTREAMABLE_REPOSITORY</w:t>
-      </w:r>
-      <w:r>
-        <w:t xml:space="preserve"> </w:t>
-      </w:r>
-      <w:r>
-        <w:t xml:space="preserve">and is sourced, not executed. The Herald repo's</w:t>
-      </w:r>
-      <w:r>
-        <w:t xml:space="preserve"> </w:t>
-      </w:r>
-      <w:r>
-        <w:rPr>
-          <w:rStyle w:val="VerbatimChar"/>
-        </w:rPr>
-        <w:t xml:space="preserve">origin</w:t>
-      </w:r>
-      <w:r>
-        <w:t xml:space="preserve"> </w:t>
-      </w:r>
-      <w:r>
-        <w:t xml:space="preserve">remote is already fan-out (1 fetch URL + 4 push URLs) — a single</w:t>
-      </w:r>
-      <w:r>
-        <w:t xml:space="preserve"> </w:t>
-      </w:r>
-      <w:r>
-        <w:rPr>
-          <w:rStyle w:val="VerbatimChar"/>
-        </w:rPr>
-        <w:t xml:space="preserve">git push origin &lt;branch&gt;</w:t>
-      </w:r>
-      <w:r>
-        <w:t xml:space="preserve"> </w:t>
-      </w:r>
-      <w:r>
-        <w:t xml:space="preserve">propagates to all four hosts. Per-host naming intentionally matches each provider's brand capitalization; do not normalize.</w:t>
-      </w:r>
-    </w:p>
-    <w:bookmarkEnd w:id="24"/>
-    <w:bookmarkStart w:id="25" w:name="forbidden-in-this-project"/>
-    <w:p>
-      <w:pPr>
-        <w:pStyle w:val="Heading3"/>
-      </w:pPr>
-      <w:r>
-        <w:t xml:space="preserve">Forbidden in this project</w:t>
+        <w:rPr>
+          <w:b/>
+          <w:bCs/>
+        </w:rPr>
+        <w:t xml:space="preserve"> </w:t>
+      </w:r>
+      <w:r>
+        <w:rPr>
+          <w:b/>
+          <w:bCs/>
+        </w:rPr>
+        <w:t xml:space="preserve">submodule inside Herald.</w:t>
+      </w:r>
+      <w:r>
+        <w:t xml:space="preserve"> </w:t>
+      </w:r>
+      <w:r>
+        <w:t xml:space="preserve">Herald is consumed as a submodule of a parent project that already provides</w:t>
+      </w:r>
+      <w:r>
+        <w:t xml:space="preserve"> </w:t>
+      </w:r>
+      <w:r>
+        <w:rPr>
+          <w:rStyle w:val="VerbatimChar"/>
+        </w:rPr>
+        <w:t xml:space="preserve">constitution/</w:t>
+      </w:r>
+      <w:r>
+        <w:t xml:space="preserve">. A duplicate copy inside Herald is a deployment-model violation. The inheritance gate's invariant</w:t>
+      </w:r>
+      <w:r>
+        <w:t xml:space="preserve"> </w:t>
+      </w:r>
+      <w:r>
+        <w:rPr>
+          <w:rStyle w:val="VerbatimChar"/>
+        </w:rPr>
+        <w:t xml:space="preserve">I6</w:t>
+      </w:r>
+      <w:r>
+        <w:t xml:space="preserve"> </w:t>
+      </w:r>
+      <w:r>
+        <w:t xml:space="preserve">enforces this — re-adding it will turn the gate red.</w:t>
       </w:r>
     </w:p>
     <w:p>
@@ -6336,77 +6685,11 @@
         <w:pStyle w:val="Compact"/>
         <w:numPr>
           <w:ilvl w:val="0"/>
-          <w:numId w:val="1009"/>
+          <w:numId w:val="1008"/>
         </w:numPr>
       </w:pPr>
       <w:r>
-        <w:rPr>
-          <w:b/>
-          <w:bCs/>
-        </w:rPr>
-        <w:t xml:space="preserve">Re-adding a</w:t>
-      </w:r>
-      <w:r>
-        <w:rPr>
-          <w:b/>
-          <w:bCs/>
-        </w:rPr>
-        <w:t xml:space="preserve"> </w:t>
-      </w:r>
-      <w:r>
-        <w:rPr>
-          <w:rStyle w:val="VerbatimChar"/>
-          <w:b/>
-          <w:bCs/>
-        </w:rPr>
-        <w:t xml:space="preserve">constitution/</w:t>
-      </w:r>
-      <w:r>
-        <w:rPr>
-          <w:b/>
-          <w:bCs/>
-        </w:rPr>
-        <w:t xml:space="preserve"> </w:t>
-      </w:r>
-      <w:r>
-        <w:rPr>
-          <w:b/>
-          <w:bCs/>
-        </w:rPr>
-        <w:t xml:space="preserve">submodule inside Herald.</w:t>
-      </w:r>
-      <w:r>
-        <w:t xml:space="preserve"> </w:t>
-      </w:r>
-      <w:r>
-        <w:t xml:space="preserve">Herald is consumed as a submodule of a parent project that already provides</w:t>
-      </w:r>
-      <w:r>
-        <w:t xml:space="preserve"> </w:t>
-      </w:r>
-      <w:r>
-        <w:rPr>
-          <w:rStyle w:val="VerbatimChar"/>
-        </w:rPr>
-        <w:t xml:space="preserve">constitution/</w:t>
-      </w:r>
-      <w:r>
-        <w:t xml:space="preserve">. A duplicate copy inside Herald is a deployment-model violation. The inheritance gate's invariant</w:t>
-      </w:r>
-      <w:r>
-        <w:t xml:space="preserve"> </w:t>
-      </w:r>
-      <w:r>
-        <w:rPr>
-          <w:rStyle w:val="VerbatimChar"/>
-        </w:rPr>
-        <w:t xml:space="preserve">I6</w:t>
-      </w:r>
-      <w:r>
-        <w:t xml:space="preserve"> </w:t>
-      </w:r>
-      <w:r>
-        <w:t xml:space="preserve">enforces this — re-adding it will turn the gate red.</w:t>
+        <w:t xml:space="preserve">Promoting Herald-specific values into the parent constitution (universal status must be EARNED; see Constitution §11.4 + §11.4.10).</w:t>
       </w:r>
     </w:p>
     <w:p>
@@ -6414,11 +6697,26 @@
         <w:pStyle w:val="Compact"/>
         <w:numPr>
           <w:ilvl w:val="0"/>
-          <w:numId w:val="1009"/>
+          <w:numId w:val="1008"/>
         </w:numPr>
       </w:pPr>
       <w:r>
-        <w:t xml:space="preserve">Promoting Herald-specific values into the parent constitution (universal status must be EARNED; see Constitution §11.4 + §11.4.10).</w:t>
+        <w:t xml:space="preserve">Modifying any file under the discovered</w:t>
+      </w:r>
+      <w:r>
+        <w:t xml:space="preserve"> </w:t>
+      </w:r>
+      <w:r>
+        <w:rPr>
+          <w:rStyle w:val="VerbatimChar"/>
+        </w:rPr>
+        <w:t xml:space="preserve">constitution/</w:t>
+      </w:r>
+      <w:r>
+        <w:t xml:space="preserve"> </w:t>
+      </w:r>
+      <w:r>
+        <w:t xml:space="preserve">from Herald commits — the parent's constitution is read-only from Herald's perspective. Constitution changes go through the HelixConstitution repo directly.</w:t>
       </w:r>
     </w:p>
     <w:p>
@@ -6426,34 +6724,7 @@
         <w:pStyle w:val="Compact"/>
         <w:numPr>
           <w:ilvl w:val="0"/>
-          <w:numId w:val="1009"/>
-        </w:numPr>
-      </w:pPr>
-      <w:r>
-        <w:t xml:space="preserve">Modifying any file under the discovered</w:t>
-      </w:r>
-      <w:r>
-        <w:t xml:space="preserve"> </w:t>
-      </w:r>
-      <w:r>
-        <w:rPr>
-          <w:rStyle w:val="VerbatimChar"/>
-        </w:rPr>
-        <w:t xml:space="preserve">constitution/</w:t>
-      </w:r>
-      <w:r>
-        <w:t xml:space="preserve"> </w:t>
-      </w:r>
-      <w:r>
-        <w:t xml:space="preserve">from Herald commits — the parent's constitution is read-only from Herald's perspective. Constitution changes go through the HelixConstitution repo directly.</w:t>
-      </w:r>
-    </w:p>
-    <w:p>
-      <w:pPr>
-        <w:pStyle w:val="Compact"/>
-        <w:numPr>
-          <w:ilvl w:val="0"/>
-          <w:numId w:val="1009"/>
+          <w:numId w:val="1008"/>
         </w:numPr>
       </w:pPr>
       <w:r>
@@ -6716,9 +6987,6 @@
     <w:abstractNumId w:val="991"/>
   </w:num>
   <w:num w:numId="1008">
-    <w:abstractNumId w:val="991"/>
-  </w:num>
-  <w:num w:numId="1009">
     <w:abstractNumId w:val="991"/>
   </w:num>
 </w:numbering>

</xml_diff>